<commit_message>
why bayes > frequentist for table 2
kleinen text in der Word Datei verfasst. Es ist noch nicht akademisch genug aber dient als Grundlage für Modelle und plot Ideen.
</commit_message>
<xml_diff>
--- a/Report Word Version.docx
+++ b/Report Word Version.docx
@@ -4,6 +4,327 @@
   <w:body>
     <w:p>
       <w:pPr>
+        <w:pStyle w:val="berschrift1"/>
+        <w:rPr>
+          <w:lang w:val="en-US"/>
+        </w:rPr>
+      </w:pPr>
+      <w:r>
+        <w:rPr>
+          <w:lang w:val="en-US"/>
+        </w:rPr>
+        <w:t xml:space="preserve">Why even use Bayes </w:t>
+      </w:r>
+      <w:r>
+        <w:rPr>
+          <w:lang w:val="en-US"/>
+        </w:rPr>
+        <w:t>in table 2</w:t>
+      </w:r>
+      <w:r>
+        <w:rPr>
+          <w:lang w:val="en-US"/>
+        </w:rPr>
+        <w:t>?</w:t>
+      </w:r>
+    </w:p>
+    <w:p>
+      <w:pPr>
+        <w:pStyle w:val="StandardWeb"/>
+        <w:rPr>
+          <w:rFonts w:ascii="Arial" w:eastAsiaTheme="minorHAnsi" w:hAnsi="Arial" w:cstheme="minorBidi"/>
+          <w:kern w:val="2"/>
+          <w:sz w:val="22"/>
+          <w:lang w:val="en-US" w:eastAsia="en-US"/>
+          <w14:ligatures w14:val="standardContextual"/>
+        </w:rPr>
+      </w:pPr>
+      <w:r>
+        <w:rPr>
+          <w:rFonts w:ascii="Arial" w:eastAsiaTheme="minorHAnsi" w:hAnsi="Arial" w:cstheme="minorBidi"/>
+          <w:kern w:val="2"/>
+          <w:sz w:val="22"/>
+          <w:lang w:val="en-US" w:eastAsia="en-US"/>
+          <w14:ligatures w14:val="standardContextual"/>
+        </w:rPr>
+        <w:t>At first glance, with nearly 50,000 observations, a frequentist approach may appear fully sufficient. In a narrow sense, this is true: point estimates will be similar, as the likelihood is strong and largely dominates the posterior. However, frequentist inference stops at a point estimate. Bayesian inference does not. It yields a full posterior distribution, allowing directly interpretable statements such as: with 95% probability, the effect lies within this range. This is substantially more informative and practically useful than a p-value attached to a single estimate.</w:t>
+      </w:r>
+    </w:p>
+    <w:p>
+      <w:pPr>
+        <w:pStyle w:val="StandardWeb"/>
+        <w:rPr>
+          <w:rFonts w:ascii="Arial" w:eastAsiaTheme="minorHAnsi" w:hAnsi="Arial" w:cstheme="minorBidi"/>
+          <w:kern w:val="2"/>
+          <w:sz w:val="22"/>
+          <w:lang w:val="en-US" w:eastAsia="en-US"/>
+          <w14:ligatures w14:val="standardContextual"/>
+        </w:rPr>
+      </w:pPr>
+      <w:r>
+        <w:rPr>
+          <w:rFonts w:ascii="Arial" w:eastAsiaTheme="minorHAnsi" w:hAnsi="Arial" w:cstheme="minorBidi"/>
+          <w:kern w:val="2"/>
+          <w:sz w:val="22"/>
+          <w:lang w:val="en-US" w:eastAsia="en-US"/>
+          <w14:ligatures w14:val="standardContextual"/>
+        </w:rPr>
+        <w:t>The distinction becomes critical once the structure of the data is considered. Fifty thousand observations do not imply fifty thousand independent pieces of information. The data are deeply hierarchical: players are nested within teams, actions occur within the same five-minute sections, and information is unevenly distributed across groups. While the referenced paper uses fixed effects with clustered standard errors, this is not equivalent to a hierarchical model. Fixed effects estimate group parameters independently and do not allow for partial pooling. Clustered standard errors only adjust uncertainty; they do not change point estimates and therefore do not correct unstable or extreme group-level effects.</w:t>
+      </w:r>
+    </w:p>
+    <w:p>
+      <w:pPr>
+        <w:pStyle w:val="StandardWeb"/>
+        <w:rPr>
+          <w:rFonts w:ascii="Arial" w:eastAsiaTheme="minorHAnsi" w:hAnsi="Arial" w:cstheme="minorBidi"/>
+          <w:kern w:val="2"/>
+          <w:sz w:val="22"/>
+          <w:lang w:val="en-US" w:eastAsia="en-US"/>
+          <w14:ligatures w14:val="standardContextual"/>
+        </w:rPr>
+      </w:pPr>
+      <w:r>
+        <w:rPr>
+          <w:rFonts w:ascii="Arial" w:eastAsiaTheme="minorHAnsi" w:hAnsi="Arial" w:cstheme="minorBidi"/>
+          <w:kern w:val="2"/>
+          <w:sz w:val="22"/>
+          <w:lang w:val="en-US" w:eastAsia="en-US"/>
+          <w14:ligatures w14:val="standardContextual"/>
+        </w:rPr>
+        <w:t>Bayesian multilevel models explicitly model this structure. Through partial pooling, estimates are stabilized by borrowing strength across groups, shrinking extreme values</w:t>
+      </w:r>
+      <w:r>
+        <w:rPr>
+          <w:rFonts w:ascii="Arial" w:eastAsiaTheme="minorHAnsi" w:hAnsi="Arial" w:cstheme="minorBidi"/>
+          <w:kern w:val="2"/>
+          <w:sz w:val="22"/>
+          <w:lang w:val="en-US" w:eastAsia="en-US"/>
+          <w14:ligatures w14:val="standardContextual"/>
+        </w:rPr>
+        <w:t xml:space="preserve">, </w:t>
+      </w:r>
+      <w:r>
+        <w:rPr>
+          <w:rFonts w:ascii="Arial" w:eastAsiaTheme="minorHAnsi" w:hAnsi="Arial" w:cstheme="minorBidi"/>
+          <w:kern w:val="2"/>
+          <w:sz w:val="22"/>
+          <w:lang w:val="en-US" w:eastAsia="en-US"/>
+          <w14:ligatures w14:val="standardContextual"/>
+        </w:rPr>
+        <w:t>especially in sparsely observed groups</w:t>
+      </w:r>
+      <w:r>
+        <w:rPr>
+          <w:rFonts w:ascii="Arial" w:eastAsiaTheme="minorHAnsi" w:hAnsi="Arial" w:cstheme="minorBidi"/>
+          <w:kern w:val="2"/>
+          <w:sz w:val="22"/>
+          <w:lang w:val="en-US" w:eastAsia="en-US"/>
+          <w14:ligatures w14:val="standardContextual"/>
+        </w:rPr>
+        <w:t xml:space="preserve">, </w:t>
+      </w:r>
+      <w:r>
+        <w:rPr>
+          <w:rFonts w:ascii="Arial" w:eastAsiaTheme="minorHAnsi" w:hAnsi="Arial" w:cstheme="minorBidi"/>
+          <w:kern w:val="2"/>
+          <w:sz w:val="22"/>
+          <w:lang w:val="en-US" w:eastAsia="en-US"/>
+          <w14:ligatures w14:val="standardContextual"/>
+        </w:rPr>
+        <w:t>and producing uncertainty that reflects both within- and between-group variation. Importantly, this means the estimates themselves change in a principled way, not just their standard errors.</w:t>
+      </w:r>
+    </w:p>
+    <w:p>
+      <w:pPr>
+        <w:pStyle w:val="StandardWeb"/>
+        <w:rPr>
+          <w:rFonts w:ascii="Arial" w:eastAsiaTheme="minorHAnsi" w:hAnsi="Arial" w:cstheme="minorBidi"/>
+          <w:kern w:val="2"/>
+          <w:sz w:val="22"/>
+          <w:lang w:val="en-US" w:eastAsia="en-US"/>
+          <w14:ligatures w14:val="standardContextual"/>
+        </w:rPr>
+      </w:pPr>
+      <w:r>
+        <w:rPr>
+          <w:rFonts w:ascii="Arial" w:eastAsiaTheme="minorHAnsi" w:hAnsi="Arial" w:cstheme="minorBidi"/>
+          <w:kern w:val="2"/>
+          <w:sz w:val="22"/>
+          <w:lang w:val="en-US" w:eastAsia="en-US"/>
+          <w14:ligatures w14:val="standardContextual"/>
+        </w:rPr>
+        <w:t>Beyond estimation, Bayesian methods allow direct assessment of generalizability using tools such as LOO cross-validation, enabling systematic comparison of predictive performance across models</w:t>
+      </w:r>
+      <w:r>
+        <w:rPr>
+          <w:rFonts w:ascii="Arial" w:eastAsiaTheme="minorHAnsi" w:hAnsi="Arial" w:cstheme="minorBidi"/>
+          <w:kern w:val="2"/>
+          <w:sz w:val="22"/>
+          <w:lang w:val="en-US" w:eastAsia="en-US"/>
+          <w14:ligatures w14:val="standardContextual"/>
+        </w:rPr>
+        <w:t xml:space="preserve">, </w:t>
+      </w:r>
+      <w:r>
+        <w:rPr>
+          <w:rFonts w:ascii="Arial" w:eastAsiaTheme="minorHAnsi" w:hAnsi="Arial" w:cstheme="minorBidi"/>
+          <w:kern w:val="2"/>
+          <w:sz w:val="22"/>
+          <w:lang w:val="en-US" w:eastAsia="en-US"/>
+          <w14:ligatures w14:val="standardContextual"/>
+        </w:rPr>
+        <w:t>something that is not addressed in the frequentist framework used in the paper. Finally, priors and prior predictive checks force explicit modeling assumptions and allow us to assess whether our understanding of the problem is coherent even before observing the data.</w:t>
+      </w:r>
+    </w:p>
+    <w:p>
+      <w:pPr>
+        <w:pStyle w:val="StandardWeb"/>
+        <w:rPr>
+          <w:rFonts w:ascii="Arial" w:eastAsiaTheme="minorHAnsi" w:hAnsi="Arial" w:cstheme="minorBidi"/>
+          <w:kern w:val="2"/>
+          <w:sz w:val="22"/>
+          <w:lang w:val="en-US" w:eastAsia="en-US"/>
+          <w14:ligatures w14:val="standardContextual"/>
+        </w:rPr>
+      </w:pPr>
+      <w:r>
+        <w:rPr>
+          <w:rFonts w:ascii="Arial" w:eastAsiaTheme="minorHAnsi" w:hAnsi="Arial" w:cstheme="minorBidi"/>
+          <w:kern w:val="2"/>
+          <w:sz w:val="22"/>
+          <w:lang w:val="en-US" w:eastAsia="en-US"/>
+          <w14:ligatures w14:val="standardContextual"/>
+        </w:rPr>
+        <w:t>Bayesian models are computationally more demanding. In return, they provide stabilized estimates, interpretable uncertainty, improved generalization, and greater transparency. With complex, hierarchical data, this is not an unnecessary complication</w:t>
+      </w:r>
+      <w:r>
+        <w:rPr>
+          <w:rFonts w:ascii="Arial" w:eastAsiaTheme="minorHAnsi" w:hAnsi="Arial" w:cstheme="minorBidi"/>
+          <w:kern w:val="2"/>
+          <w:sz w:val="22"/>
+          <w:lang w:val="en-US" w:eastAsia="en-US"/>
+          <w14:ligatures w14:val="standardContextual"/>
+        </w:rPr>
+        <w:t xml:space="preserve">, </w:t>
+      </w:r>
+      <w:r>
+        <w:rPr>
+          <w:rFonts w:ascii="Arial" w:eastAsiaTheme="minorHAnsi" w:hAnsi="Arial" w:cstheme="minorBidi"/>
+          <w:kern w:val="2"/>
+          <w:sz w:val="22"/>
+          <w:lang w:val="en-US" w:eastAsia="en-US"/>
+          <w14:ligatures w14:val="standardContextual"/>
+        </w:rPr>
+        <w:t>it is the approach that matches the structure of the problem.</w:t>
+      </w:r>
+    </w:p>
+    <w:p>
+      <w:pPr>
+        <w:pStyle w:val="StandardWeb"/>
+        <w:rPr>
+          <w:rFonts w:ascii="Arial" w:eastAsiaTheme="minorHAnsi" w:hAnsi="Arial" w:cstheme="minorBidi"/>
+          <w:kern w:val="2"/>
+          <w:sz w:val="22"/>
+          <w:lang w:eastAsia="en-US"/>
+          <w14:ligatures w14:val="standardContextual"/>
+        </w:rPr>
+      </w:pPr>
+      <w:r>
+        <w:rPr>
+          <w:rFonts w:ascii="Arial" w:eastAsiaTheme="minorHAnsi" w:hAnsi="Arial" w:cstheme="minorBidi"/>
+          <w:kern w:val="2"/>
+          <w:sz w:val="22"/>
+          <w:lang w:eastAsia="en-US"/>
+          <w14:ligatures w14:val="standardContextual"/>
+        </w:rPr>
+        <w:t>Dann müssen wir diese di</w:t>
+      </w:r>
+      <w:r>
+        <w:rPr>
+          <w:rFonts w:ascii="Arial" w:eastAsiaTheme="minorHAnsi" w:hAnsi="Arial" w:cstheme="minorBidi"/>
+          <w:kern w:val="2"/>
+          <w:sz w:val="22"/>
+          <w:lang w:eastAsia="en-US"/>
+          <w14:ligatures w14:val="standardContextual"/>
+        </w:rPr>
+        <w:t>nger nutzen</w:t>
+      </w:r>
+    </w:p>
+    <w:p>
+      <w:pPr>
+        <w:pStyle w:val="Listenabsatz"/>
+        <w:numPr>
+          <w:ilvl w:val="0"/>
+          <w:numId w:val="2"/>
+        </w:numPr>
+        <w:rPr>
+          <w:lang w:val="en-US"/>
+        </w:rPr>
+      </w:pPr>
+      <w:r>
+        <w:rPr>
+          <w:lang w:val="en-US"/>
+        </w:rPr>
+        <w:t>Model with partial pooling (hierarcial instead of ficed effects.)</w:t>
+      </w:r>
+    </w:p>
+    <w:p>
+      <w:pPr>
+        <w:pStyle w:val="Listenabsatz"/>
+        <w:numPr>
+          <w:ilvl w:val="0"/>
+          <w:numId w:val="2"/>
+        </w:numPr>
+        <w:rPr>
+          <w:lang w:val="en-US"/>
+        </w:rPr>
+      </w:pPr>
+      <w:r>
+        <w:rPr>
+          <w:lang w:val="en-US"/>
+        </w:rPr>
+        <w:t>Prior only predictive check, show its great</w:t>
+      </w:r>
+    </w:p>
+    <w:p>
+      <w:pPr>
+        <w:pStyle w:val="Listenabsatz"/>
+        <w:numPr>
+          <w:ilvl w:val="0"/>
+          <w:numId w:val="2"/>
+        </w:numPr>
+        <w:rPr>
+          <w:lang w:val="en-US"/>
+        </w:rPr>
+      </w:pPr>
+      <w:r>
+        <w:rPr>
+          <w:lang w:val="en-US"/>
+        </w:rPr>
+        <w:t>Posterior credible interval for “effort” speed coefficient, show its different than 0. Mcmc_areas() plot</w:t>
+      </w:r>
+    </w:p>
+    <w:p>
+      <w:pPr>
+        <w:pStyle w:val="Listenabsatz"/>
+        <w:numPr>
+          <w:ilvl w:val="0"/>
+          <w:numId w:val="2"/>
+        </w:numPr>
+        <w:rPr>
+          <w:lang w:val="en-US"/>
+        </w:rPr>
+      </w:pPr>
+      <w:r>
+        <w:rPr>
+          <w:lang w:val="en-US"/>
+        </w:rPr>
+        <w:t>Loo comparison of a tables models</w:t>
+      </w:r>
+    </w:p>
+    <w:p>
+      <w:pPr>
+        <w:pStyle w:val="berschrift1"/>
         <w:rPr>
           <w:lang w:val="en-US"/>
         </w:rPr>
@@ -183,6 +504,7 @@
           <w:noProof/>
           <w:lang w:val="en-US"/>
         </w:rPr>
+        <w:lastRenderedPageBreak/>
         <w:drawing>
           <wp:inline distT="0" distB="0" distL="0" distR="0" wp14:anchorId="327F643C" wp14:editId="2A4D2918">
             <wp:extent cx="4128014" cy="2520820"/>
@@ -798,8 +1120,123 @@
       </w:rPr>
     </w:lvl>
   </w:abstractNum>
+  <w:abstractNum w:abstractNumId="1" w15:restartNumberingAfterBreak="0">
+    <w:nsid w:val="7ED34614"/>
+    <w:multiLevelType w:val="hybridMultilevel"/>
+    <w:tmpl w:val="6AB87ECC"/>
+    <w:lvl w:ilvl="0" w:tplc="85EC51E0">
+      <w:numFmt w:val="bullet"/>
+      <w:lvlText w:val=""/>
+      <w:lvlJc w:val="left"/>
+      <w:pPr>
+        <w:ind w:left="720" w:hanging="360"/>
+      </w:pPr>
+      <w:rPr>
+        <w:rFonts w:ascii="Wingdings" w:eastAsiaTheme="minorHAnsi" w:hAnsi="Wingdings" w:cstheme="minorBidi" w:hint="default"/>
+      </w:rPr>
+    </w:lvl>
+    <w:lvl w:ilvl="1" w:tplc="04070003" w:tentative="1">
+      <w:start w:val="1"/>
+      <w:numFmt w:val="bullet"/>
+      <w:lvlText w:val="o"/>
+      <w:lvlJc w:val="left"/>
+      <w:pPr>
+        <w:ind w:left="1440" w:hanging="360"/>
+      </w:pPr>
+      <w:rPr>
+        <w:rFonts w:ascii="Courier New" w:hAnsi="Courier New" w:cs="Courier New" w:hint="default"/>
+      </w:rPr>
+    </w:lvl>
+    <w:lvl w:ilvl="2" w:tplc="04070005" w:tentative="1">
+      <w:start w:val="1"/>
+      <w:numFmt w:val="bullet"/>
+      <w:lvlText w:val=""/>
+      <w:lvlJc w:val="left"/>
+      <w:pPr>
+        <w:ind w:left="2160" w:hanging="360"/>
+      </w:pPr>
+      <w:rPr>
+        <w:rFonts w:ascii="Wingdings" w:hAnsi="Wingdings" w:hint="default"/>
+      </w:rPr>
+    </w:lvl>
+    <w:lvl w:ilvl="3" w:tplc="04070001" w:tentative="1">
+      <w:start w:val="1"/>
+      <w:numFmt w:val="bullet"/>
+      <w:lvlText w:val=""/>
+      <w:lvlJc w:val="left"/>
+      <w:pPr>
+        <w:ind w:left="2880" w:hanging="360"/>
+      </w:pPr>
+      <w:rPr>
+        <w:rFonts w:ascii="Symbol" w:hAnsi="Symbol" w:hint="default"/>
+      </w:rPr>
+    </w:lvl>
+    <w:lvl w:ilvl="4" w:tplc="04070003" w:tentative="1">
+      <w:start w:val="1"/>
+      <w:numFmt w:val="bullet"/>
+      <w:lvlText w:val="o"/>
+      <w:lvlJc w:val="left"/>
+      <w:pPr>
+        <w:ind w:left="3600" w:hanging="360"/>
+      </w:pPr>
+      <w:rPr>
+        <w:rFonts w:ascii="Courier New" w:hAnsi="Courier New" w:cs="Courier New" w:hint="default"/>
+      </w:rPr>
+    </w:lvl>
+    <w:lvl w:ilvl="5" w:tplc="04070005" w:tentative="1">
+      <w:start w:val="1"/>
+      <w:numFmt w:val="bullet"/>
+      <w:lvlText w:val=""/>
+      <w:lvlJc w:val="left"/>
+      <w:pPr>
+        <w:ind w:left="4320" w:hanging="360"/>
+      </w:pPr>
+      <w:rPr>
+        <w:rFonts w:ascii="Wingdings" w:hAnsi="Wingdings" w:hint="default"/>
+      </w:rPr>
+    </w:lvl>
+    <w:lvl w:ilvl="6" w:tplc="04070001" w:tentative="1">
+      <w:start w:val="1"/>
+      <w:numFmt w:val="bullet"/>
+      <w:lvlText w:val=""/>
+      <w:lvlJc w:val="left"/>
+      <w:pPr>
+        <w:ind w:left="5040" w:hanging="360"/>
+      </w:pPr>
+      <w:rPr>
+        <w:rFonts w:ascii="Symbol" w:hAnsi="Symbol" w:hint="default"/>
+      </w:rPr>
+    </w:lvl>
+    <w:lvl w:ilvl="7" w:tplc="04070003" w:tentative="1">
+      <w:start w:val="1"/>
+      <w:numFmt w:val="bullet"/>
+      <w:lvlText w:val="o"/>
+      <w:lvlJc w:val="left"/>
+      <w:pPr>
+        <w:ind w:left="5760" w:hanging="360"/>
+      </w:pPr>
+      <w:rPr>
+        <w:rFonts w:ascii="Courier New" w:hAnsi="Courier New" w:cs="Courier New" w:hint="default"/>
+      </w:rPr>
+    </w:lvl>
+    <w:lvl w:ilvl="8" w:tplc="04070005" w:tentative="1">
+      <w:start w:val="1"/>
+      <w:numFmt w:val="bullet"/>
+      <w:lvlText w:val=""/>
+      <w:lvlJc w:val="left"/>
+      <w:pPr>
+        <w:ind w:left="6480" w:hanging="360"/>
+      </w:pPr>
+      <w:rPr>
+        <w:rFonts w:ascii="Wingdings" w:hAnsi="Wingdings" w:hint="default"/>
+      </w:rPr>
+    </w:lvl>
+  </w:abstractNum>
   <w:num w:numId="1" w16cid:durableId="61831022">
     <w:abstractNumId w:val="0"/>
+  </w:num>
+  <w:num w:numId="2" w16cid:durableId="1441101863">
+    <w:abstractNumId w:val="1"/>
   </w:num>
 </w:numbering>
 </file>
@@ -1737,6 +2174,24 @@
       <w:u w:val="single"/>
     </w:rPr>
   </w:style>
+  <w:style w:type="paragraph" w:styleId="StandardWeb">
+    <w:name w:val="Normal (Web)"/>
+    <w:basedOn w:val="Standard"/>
+    <w:uiPriority w:val="99"/>
+    <w:semiHidden/>
+    <w:unhideWhenUsed/>
+    <w:rsid w:val="00EF385F"/>
+    <w:pPr>
+      <w:spacing w:before="100" w:beforeAutospacing="1" w:after="100" w:afterAutospacing="1" w:line="240" w:lineRule="auto"/>
+    </w:pPr>
+    <w:rPr>
+      <w:rFonts w:ascii="Times New Roman" w:eastAsia="Times New Roman" w:hAnsi="Times New Roman" w:cs="Times New Roman"/>
+      <w:kern w:val="0"/>
+      <w:sz w:val="24"/>
+      <w:lang w:eastAsia="de-DE"/>
+      <w14:ligatures w14:val="none"/>
+    </w:rPr>
+  </w:style>
 </w:styles>
 </file>
 

</xml_diff>

<commit_message>
Herleitung einer Formel für Prior setzen
Weil ChatGPT verwirrend ist, habe ich im Buch geschaut und dort eine Formel für das Berechen der Effekt Größe gefunden. Daraus habe ich eine Formel hergeleitet, mit der wir prior anhand unserer Ziel Wahrscheinlichkeit bestimmen können.
</commit_message>
<xml_diff>
--- a/Report Word Version.docx
+++ b/Report Word Version.docx
@@ -2,6 +2,1845 @@
 <file path=word/document.xml><?xml version="1.0" encoding="utf-8"?>
 <w:document xmlns:wpc="http://schemas.microsoft.com/office/word/2010/wordprocessingCanvas" xmlns:cx="http://schemas.microsoft.com/office/drawing/2014/chartex" xmlns:cx1="http://schemas.microsoft.com/office/drawing/2015/9/8/chartex" xmlns:cx2="http://schemas.microsoft.com/office/drawing/2015/10/21/chartex" xmlns:cx3="http://schemas.microsoft.com/office/drawing/2016/5/9/chartex" xmlns:cx4="http://schemas.microsoft.com/office/drawing/2016/5/10/chartex" xmlns:cx5="http://schemas.microsoft.com/office/drawing/2016/5/11/chartex" xmlns:cx6="http://schemas.microsoft.com/office/drawing/2016/5/12/chartex" xmlns:cx7="http://schemas.microsoft.com/office/drawing/2016/5/13/chartex" xmlns:cx8="http://schemas.microsoft.com/office/drawing/2016/5/14/chartex" xmlns:mc="http://schemas.openxmlformats.org/markup-compatibility/2006" xmlns:aink="http://schemas.microsoft.com/office/drawing/2016/ink" xmlns:am3d="http://schemas.microsoft.com/office/drawing/2017/model3d" xmlns:o="urn:schemas-microsoft-com:office:office" xmlns:oel="http://schemas.microsoft.com/office/2019/extlst" xmlns:r="http://schemas.openxmlformats.org/officeDocument/2006/relationships" xmlns:m="http://schemas.openxmlformats.org/officeDocument/2006/math" xmlns:v="urn:schemas-microsoft-com:vml" xmlns:wp14="http://schemas.microsoft.com/office/word/2010/wordprocessingDrawing" xmlns:wp="http://schemas.openxmlformats.org/drawingml/2006/wordprocessingDrawing" xmlns:w10="urn:schemas-microsoft-com:office:word" xmlns:w="http://schemas.openxmlformats.org/wordprocessingml/2006/main" xmlns:w14="http://schemas.microsoft.com/office/word/2010/wordml" xmlns:w15="http://schemas.microsoft.com/office/word/2012/wordml" xmlns:w16cex="http://schemas.microsoft.com/office/word/2018/wordml/cex" xmlns:w16cid="http://schemas.microsoft.com/office/word/2016/wordml/cid" xmlns:w16="http://schemas.microsoft.com/office/word/2018/wordml" xmlns:w16du="http://schemas.microsoft.com/office/word/2023/wordml/word16du" xmlns:w16sdtdh="http://schemas.microsoft.com/office/word/2020/wordml/sdtdatahash" xmlns:w16sdtfl="http://schemas.microsoft.com/office/word/2024/wordml/sdtformatlock" xmlns:w16se="http://schemas.microsoft.com/office/word/2015/wordml/symex" xmlns:wpg="http://schemas.microsoft.com/office/word/2010/wordprocessingGroup" xmlns:wpi="http://schemas.microsoft.com/office/word/2010/wordprocessingInk" xmlns:wne="http://schemas.microsoft.com/office/word/2006/wordml" xmlns:wps="http://schemas.microsoft.com/office/word/2010/wordprocessingShape" mc:Ignorable="w14 w15 w16se w16cid w16 w16cex w16sdtdh w16sdtfl w16du wp14">
   <w:body>
+    <w:p>
+      <w:pPr>
+        <w:pStyle w:val="berschrift1"/>
+      </w:pPr>
+      <w:r>
+        <w:t>Logit</w:t>
+      </w:r>
+      <w:r>
+        <w:t>-Link, Herleitung einer Formel für Prior setzen</w:t>
+      </w:r>
+    </w:p>
+    <w:p>
+      <w:pPr>
+        <w:rPr>
+          <w:lang w:val="en-US"/>
+        </w:rPr>
+      </w:pPr>
+      <w:r>
+        <w:rPr>
+          <w:lang w:val="en-US"/>
+        </w:rPr>
+        <w:t>We use weakly informative Normal priors centered at zero for regression coefficients. These priors regularize extreme estimates while allowing the data to dominate inference. The prior scale was chosen such that a two-standard-deviation change corresponds to a plausible change in outcome probability over the observed range of the predictor.</w:t>
+      </w:r>
+    </w:p>
+    <w:p>
+      <w:pPr>
+        <w:rPr>
+          <w:lang w:val="en-US"/>
+        </w:rPr>
+      </w:pPr>
+      <w:r>
+        <w:rPr>
+          <w:lang w:val="en-US"/>
+        </w:rPr>
+        <w:t>Given a baseline event probability of 1</w:t>
+      </w:r>
+      <w:r>
+        <w:rPr>
+          <w:lang w:val="en-US"/>
+        </w:rPr>
+        <w:t>%</w:t>
+      </w:r>
+      <w:r>
+        <w:rPr>
+          <w:lang w:val="en-US"/>
+        </w:rPr>
+        <w:t xml:space="preserve">, a two-standard-deviation change in the coefficient corresponds to an increase to approximately </w:t>
+      </w:r>
+      <w:r>
+        <w:rPr>
+          <w:lang w:val="en-US"/>
+        </w:rPr>
+        <w:t>X</w:t>
+      </w:r>
+      <w:r>
+        <w:rPr>
+          <w:lang w:val="en-US"/>
+        </w:rPr>
+        <w:t>%, which we consider a reasonable upper bound.</w:t>
+      </w:r>
+    </w:p>
+    <w:p>
+      <w:pPr>
+        <w:rPr>
+          <w:lang w:val="en-US"/>
+        </w:rPr>
+      </w:pPr>
+    </w:p>
+    <w:p>
+      <w:pPr>
+        <w:rPr>
+          <w:color w:val="525252" w:themeColor="accent3" w:themeShade="80"/>
+        </w:rPr>
+      </w:pPr>
+      <w:r>
+        <w:rPr>
+          <w:color w:val="525252" w:themeColor="accent3" w:themeShade="80"/>
+        </w:rPr>
+        <w:t xml:space="preserve">Aber was </w:t>
+      </w:r>
+      <w:proofErr w:type="spellStart"/>
+      <w:r>
+        <w:rPr>
+          <w:color w:val="525252" w:themeColor="accent3" w:themeShade="80"/>
+        </w:rPr>
+        <w:t>is</w:t>
+      </w:r>
+      <w:proofErr w:type="spellEnd"/>
+      <w:r>
+        <w:rPr>
+          <w:color w:val="525252" w:themeColor="accent3" w:themeShade="80"/>
+        </w:rPr>
+        <w:t xml:space="preserve"> X? </w:t>
+      </w:r>
+    </w:p>
+    <w:p>
+      <w:pPr>
+        <w:rPr>
+          <w:rFonts w:eastAsiaTheme="minorEastAsia"/>
+          <w:color w:val="525252" w:themeColor="accent3" w:themeShade="80"/>
+        </w:rPr>
+      </w:pPr>
+      <w:r>
+        <w:rPr>
+          <w:rFonts w:eastAsiaTheme="minorEastAsia"/>
+          <w:color w:val="525252" w:themeColor="accent3" w:themeShade="80"/>
+        </w:rPr>
+        <w:t>Quelle Buch:</w:t>
+      </w:r>
+    </w:p>
+    <w:p>
+      <w:pPr>
+        <w:jc w:val="center"/>
+        <w:rPr>
+          <w:rFonts w:eastAsiaTheme="minorEastAsia"/>
+          <w:color w:val="525252" w:themeColor="accent3" w:themeShade="80"/>
+        </w:rPr>
+      </w:pPr>
+      <w:r>
+        <w:rPr>
+          <w:rFonts w:eastAsiaTheme="minorEastAsia"/>
+          <w:noProof/>
+          <w:color w:val="525252" w:themeColor="accent3" w:themeShade="80"/>
+        </w:rPr>
+        <w:drawing>
+          <wp:inline distT="0" distB="0" distL="0" distR="0" wp14:anchorId="0F4B5A30" wp14:editId="2E9583EA">
+            <wp:extent cx="4152900" cy="3182679"/>
+            <wp:effectExtent l="0" t="0" r="0" b="0"/>
+            <wp:docPr id="1448034231" name="Grafik 1" descr="Ein Bild, das Text, Diagramm, Reihe, Screenshot enthält.&#10;&#10;KI-generierte Inhalte können fehlerhaft sein."/>
+            <wp:cNvGraphicFramePr>
+              <a:graphicFrameLocks xmlns:a="http://schemas.openxmlformats.org/drawingml/2006/main" noChangeAspect="1"/>
+            </wp:cNvGraphicFramePr>
+            <a:graphic xmlns:a="http://schemas.openxmlformats.org/drawingml/2006/main">
+              <a:graphicData uri="http://schemas.openxmlformats.org/drawingml/2006/picture">
+                <pic:pic xmlns:pic="http://schemas.openxmlformats.org/drawingml/2006/picture">
+                  <pic:nvPicPr>
+                    <pic:cNvPr id="1448034231" name="Grafik 1" descr="Ein Bild, das Text, Diagramm, Reihe, Screenshot enthält.&#10;&#10;KI-generierte Inhalte können fehlerhaft sein."/>
+                    <pic:cNvPicPr>
+                      <a:picLocks noChangeAspect="1" noChangeArrowheads="1"/>
+                    </pic:cNvPicPr>
+                  </pic:nvPicPr>
+                  <pic:blipFill>
+                    <a:blip r:embed="rId5">
+                      <a:extLst>
+                        <a:ext uri="{28A0092B-C50C-407E-A947-70E740481C1C}">
+                          <a14:useLocalDpi xmlns:a14="http://schemas.microsoft.com/office/drawing/2010/main" val="0"/>
+                        </a:ext>
+                      </a:extLst>
+                    </a:blip>
+                    <a:srcRect/>
+                    <a:stretch>
+                      <a:fillRect/>
+                    </a:stretch>
+                  </pic:blipFill>
+                  <pic:spPr bwMode="auto">
+                    <a:xfrm>
+                      <a:off x="0" y="0"/>
+                      <a:ext cx="4159477" cy="3187719"/>
+                    </a:xfrm>
+                    <a:prstGeom prst="rect">
+                      <a:avLst/>
+                    </a:prstGeom>
+                    <a:noFill/>
+                    <a:ln>
+                      <a:noFill/>
+                    </a:ln>
+                  </pic:spPr>
+                </pic:pic>
+              </a:graphicData>
+            </a:graphic>
+          </wp:inline>
+        </w:drawing>
+      </w:r>
+    </w:p>
+    <w:p>
+      <w:pPr>
+        <w:rPr>
+          <w:color w:val="525252" w:themeColor="accent3" w:themeShade="80"/>
+          <w:lang w:val="en-US"/>
+        </w:rPr>
+      </w:pPr>
+    </w:p>
+    <w:p>
+      <w:pPr>
+        <w:rPr>
+          <w:color w:val="525252" w:themeColor="accent3" w:themeShade="80"/>
+        </w:rPr>
+      </w:pPr>
+      <w:r>
+        <w:rPr>
+          <w:color w:val="525252" w:themeColor="accent3" w:themeShade="80"/>
+        </w:rPr>
+        <w:t>Formel</w:t>
+      </w:r>
+      <w:r>
+        <w:rPr>
+          <w:color w:val="525252" w:themeColor="accent3" w:themeShade="80"/>
+        </w:rPr>
+        <w:t xml:space="preserve"> 1</w:t>
+      </w:r>
+      <w:r>
+        <w:rPr>
+          <w:color w:val="525252" w:themeColor="accent3" w:themeShade="80"/>
+        </w:rPr>
+        <w:t>:</w:t>
+      </w:r>
+    </w:p>
+    <w:p>
+      <w:pPr>
+        <w:rPr>
+          <w:rFonts w:eastAsiaTheme="minorEastAsia"/>
+          <w:color w:val="525252" w:themeColor="accent3" w:themeShade="80"/>
+        </w:rPr>
+      </w:pPr>
+      <m:oMathPara>
+        <m:oMath>
+          <m:r>
+            <w:rPr>
+              <w:rFonts w:ascii="Cambria Math" w:hAnsi="Cambria Math"/>
+              <w:color w:val="525252" w:themeColor="accent3" w:themeShade="80"/>
+            </w:rPr>
+            <m:t xml:space="preserve">p= </m:t>
+          </m:r>
+          <m:f>
+            <m:fPr>
+              <m:ctrlPr>
+                <w:rPr>
+                  <w:rFonts w:ascii="Cambria Math" w:hAnsi="Cambria Math"/>
+                  <w:i/>
+                  <w:color w:val="525252" w:themeColor="accent3" w:themeShade="80"/>
+                </w:rPr>
+              </m:ctrlPr>
+            </m:fPr>
+            <m:num>
+              <m:sSup>
+                <m:sSupPr>
+                  <m:ctrlPr>
+                    <w:rPr>
+                      <w:rFonts w:ascii="Cambria Math" w:hAnsi="Cambria Math"/>
+                      <w:i/>
+                      <w:color w:val="525252" w:themeColor="accent3" w:themeShade="80"/>
+                    </w:rPr>
+                  </m:ctrlPr>
+                </m:sSupPr>
+                <m:e>
+                  <m:r>
+                    <w:rPr>
+                      <w:rFonts w:ascii="Cambria Math" w:hAnsi="Cambria Math"/>
+                      <w:color w:val="525252" w:themeColor="accent3" w:themeShade="80"/>
+                    </w:rPr>
+                    <m:t>e</m:t>
+                  </m:r>
+                </m:e>
+                <m:sup>
+                  <m:r>
+                    <w:rPr>
+                      <w:rFonts w:ascii="Cambria Math" w:hAnsi="Cambria Math"/>
+                      <w:color w:val="525252" w:themeColor="accent3" w:themeShade="80"/>
+                    </w:rPr>
+                    <m:t>(α+βx)</m:t>
+                  </m:r>
+                </m:sup>
+              </m:sSup>
+            </m:num>
+            <m:den>
+              <m:r>
+                <w:rPr>
+                  <w:rFonts w:ascii="Cambria Math" w:hAnsi="Cambria Math"/>
+                  <w:color w:val="525252" w:themeColor="accent3" w:themeShade="80"/>
+                </w:rPr>
+                <m:t>1+</m:t>
+              </m:r>
+              <m:sSup>
+                <m:sSupPr>
+                  <m:ctrlPr>
+                    <w:rPr>
+                      <w:rFonts w:ascii="Cambria Math" w:hAnsi="Cambria Math"/>
+                      <w:i/>
+                      <w:color w:val="525252" w:themeColor="accent3" w:themeShade="80"/>
+                    </w:rPr>
+                  </m:ctrlPr>
+                </m:sSupPr>
+                <m:e>
+                  <m:r>
+                    <w:rPr>
+                      <w:rFonts w:ascii="Cambria Math" w:hAnsi="Cambria Math"/>
+                      <w:color w:val="525252" w:themeColor="accent3" w:themeShade="80"/>
+                    </w:rPr>
+                    <m:t>e</m:t>
+                  </m:r>
+                </m:e>
+                <m:sup>
+                  <m:r>
+                    <w:rPr>
+                      <w:rFonts w:ascii="Cambria Math" w:hAnsi="Cambria Math"/>
+                      <w:color w:val="525252" w:themeColor="accent3" w:themeShade="80"/>
+                    </w:rPr>
+                    <m:t>(α+βx)</m:t>
+                  </m:r>
+                </m:sup>
+              </m:sSup>
+            </m:den>
+          </m:f>
+        </m:oMath>
+      </m:oMathPara>
+    </w:p>
+    <w:p>
+      <w:pPr>
+        <w:rPr>
+          <w:rFonts w:eastAsiaTheme="minorEastAsia"/>
+          <w:color w:val="525252" w:themeColor="accent3" w:themeShade="80"/>
+        </w:rPr>
+      </w:pPr>
+      <m:oMath>
+        <m:r>
+          <w:rPr>
+            <w:rFonts w:ascii="Cambria Math" w:hAnsi="Cambria Math"/>
+            <w:color w:val="525252" w:themeColor="accent3" w:themeShade="80"/>
+          </w:rPr>
+          <m:t>α</m:t>
+        </m:r>
+      </m:oMath>
+      <w:r>
+        <w:rPr>
+          <w:rFonts w:eastAsiaTheme="minorEastAsia"/>
+          <w:color w:val="525252" w:themeColor="accent3" w:themeShade="80"/>
+        </w:rPr>
+        <w:t xml:space="preserve"> = </w:t>
+      </w:r>
+      <w:proofErr w:type="spellStart"/>
+      <w:r>
+        <w:rPr>
+          <w:rFonts w:eastAsiaTheme="minorEastAsia"/>
+          <w:color w:val="525252" w:themeColor="accent3" w:themeShade="80"/>
+        </w:rPr>
+        <w:t>intercept</w:t>
+      </w:r>
+      <w:proofErr w:type="spellEnd"/>
+      <w:r>
+        <w:rPr>
+          <w:rFonts w:eastAsiaTheme="minorEastAsia"/>
+          <w:color w:val="525252" w:themeColor="accent3" w:themeShade="80"/>
+        </w:rPr>
+        <w:t xml:space="preserve"> (bei uns in </w:t>
+      </w:r>
+      <w:proofErr w:type="spellStart"/>
+      <w:r>
+        <w:rPr>
+          <w:rFonts w:eastAsiaTheme="minorEastAsia"/>
+          <w:color w:val="525252" w:themeColor="accent3" w:themeShade="80"/>
+        </w:rPr>
+        <w:t>table</w:t>
+      </w:r>
+      <w:proofErr w:type="spellEnd"/>
+      <w:r>
+        <w:rPr>
+          <w:rFonts w:eastAsiaTheme="minorEastAsia"/>
+          <w:color w:val="525252" w:themeColor="accent3" w:themeShade="80"/>
+        </w:rPr>
+        <w:t xml:space="preserve"> 2</w:t>
+      </w:r>
+      <w:r>
+        <w:rPr>
+          <w:rFonts w:eastAsiaTheme="minorEastAsia"/>
+          <w:color w:val="525252" w:themeColor="accent3" w:themeShade="80"/>
+        </w:rPr>
+        <w:t>, 1%</w:t>
+      </w:r>
+      <w:r>
+        <w:rPr>
+          <w:rFonts w:eastAsiaTheme="minorEastAsia"/>
+          <w:color w:val="525252" w:themeColor="accent3" w:themeShade="80"/>
+        </w:rPr>
+        <w:t xml:space="preserve">, </w:t>
+      </w:r>
+      <w:r>
+        <w:rPr>
+          <w:rFonts w:ascii="Cambria Math" w:hAnsi="Cambria Math"/>
+          <w:i/>
+          <w:color w:val="525252" w:themeColor="accent3" w:themeShade="80"/>
+        </w:rPr>
+        <w:t xml:space="preserve"> </w:t>
+      </w:r>
+      <m:oMath>
+        <m:r>
+          <w:rPr>
+            <w:rFonts w:ascii="Cambria Math" w:hAnsi="Cambria Math"/>
+            <w:color w:val="525252" w:themeColor="accent3" w:themeShade="80"/>
+          </w:rPr>
+          <m:t>N(-4.6 , 0.3)</m:t>
+        </m:r>
+      </m:oMath>
+      <w:r>
+        <w:rPr>
+          <w:rFonts w:eastAsiaTheme="minorEastAsia"/>
+          <w:color w:val="525252" w:themeColor="accent3" w:themeShade="80"/>
+        </w:rPr>
+        <w:t xml:space="preserve"> </w:t>
+      </w:r>
+      <w:r>
+        <w:rPr>
+          <w:rFonts w:eastAsiaTheme="minorEastAsia"/>
+          <w:color w:val="525252" w:themeColor="accent3" w:themeShade="80"/>
+        </w:rPr>
+        <w:t>also -4.6)</w:t>
+      </w:r>
+    </w:p>
+    <w:p>
+      <w:pPr>
+        <w:rPr>
+          <w:rFonts w:eastAsiaTheme="minorEastAsia"/>
+          <w:color w:val="525252" w:themeColor="accent3" w:themeShade="80"/>
+          <w:lang w:val="en-US"/>
+        </w:rPr>
+      </w:pPr>
+      <m:oMath>
+        <m:r>
+          <w:rPr>
+            <w:rFonts w:ascii="Cambria Math" w:hAnsi="Cambria Math"/>
+            <w:color w:val="525252" w:themeColor="accent3" w:themeShade="80"/>
+          </w:rPr>
+          <m:t>β</m:t>
+        </m:r>
+      </m:oMath>
+      <w:r>
+        <w:rPr>
+          <w:rFonts w:eastAsiaTheme="minorEastAsia"/>
+          <w:color w:val="525252" w:themeColor="accent3" w:themeShade="80"/>
+          <w:lang w:val="en-US"/>
+        </w:rPr>
+        <w:t xml:space="preserve"> = coefficient value. </w:t>
+      </w:r>
+    </w:p>
+    <w:p>
+      <w:pPr>
+        <w:rPr>
+          <w:rFonts w:eastAsiaTheme="minorEastAsia"/>
+          <w:color w:val="525252" w:themeColor="accent3" w:themeShade="80"/>
+          <w:lang w:val="en-US"/>
+        </w:rPr>
+      </w:pPr>
+    </w:p>
+    <w:p>
+      <w:pPr>
+        <w:rPr>
+          <w:color w:val="525252" w:themeColor="accent3" w:themeShade="80"/>
+          <w:lang w:val="en-US"/>
+        </w:rPr>
+      </w:pPr>
+      <w:r>
+        <w:rPr>
+          <w:rFonts w:eastAsiaTheme="minorEastAsia"/>
+          <w:color w:val="525252" w:themeColor="accent3" w:themeShade="80"/>
+          <w:lang w:val="en-US"/>
+        </w:rPr>
+        <w:t>Given</w:t>
+      </w:r>
+      <w:r>
+        <w:rPr>
+          <w:rFonts w:eastAsiaTheme="minorEastAsia"/>
+          <w:color w:val="525252" w:themeColor="accent3" w:themeShade="80"/>
+          <w:lang w:val="en-US"/>
+        </w:rPr>
+        <w:t xml:space="preserve"> </w:t>
+      </w:r>
+      <m:oMath>
+        <m:r>
+          <w:rPr>
+            <w:rFonts w:ascii="Cambria Math" w:hAnsi="Cambria Math"/>
+            <w:color w:val="525252" w:themeColor="accent3" w:themeShade="80"/>
+          </w:rPr>
+          <m:t>N</m:t>
+        </m:r>
+        <m:r>
+          <w:rPr>
+            <w:rFonts w:ascii="Cambria Math" w:hAnsi="Cambria Math"/>
+            <w:color w:val="525252" w:themeColor="accent3" w:themeShade="80"/>
+            <w:lang w:val="en-US"/>
+          </w:rPr>
+          <m:t>(0 , 0.04)</m:t>
+        </m:r>
+      </m:oMath>
+      <w:r>
+        <w:rPr>
+          <w:rFonts w:eastAsiaTheme="minorEastAsia"/>
+          <w:color w:val="525252" w:themeColor="accent3" w:themeShade="80"/>
+          <w:lang w:val="en-US"/>
+        </w:rPr>
+        <w:t xml:space="preserve"> </w:t>
+      </w:r>
+      <w:r>
+        <w:rPr>
+          <w:rFonts w:eastAsiaTheme="minorEastAsia"/>
+          <w:color w:val="525252" w:themeColor="accent3" w:themeShade="80"/>
+          <w:lang w:val="en-US"/>
+        </w:rPr>
+        <w:t xml:space="preserve"> the </w:t>
+      </w:r>
+      <m:oMath>
+        <m:r>
+          <w:rPr>
+            <w:rFonts w:ascii="Cambria Math" w:hAnsi="Cambria Math"/>
+            <w:color w:val="525252" w:themeColor="accent3" w:themeShade="80"/>
+          </w:rPr>
+          <m:t>β</m:t>
+        </m:r>
+      </m:oMath>
+      <w:r>
+        <w:rPr>
+          <w:rFonts w:eastAsiaTheme="minorEastAsia"/>
+          <w:color w:val="525252" w:themeColor="accent3" w:themeShade="80"/>
+          <w:lang w:val="en-US"/>
+        </w:rPr>
+        <w:t xml:space="preserve"> </w:t>
+      </w:r>
+      <w:r>
+        <w:rPr>
+          <w:rFonts w:eastAsiaTheme="minorEastAsia"/>
+          <w:color w:val="525252" w:themeColor="accent3" w:themeShade="80"/>
+          <w:lang w:val="en-US"/>
+        </w:rPr>
+        <w:t xml:space="preserve"> at the </w:t>
+      </w:r>
+      <w:r>
+        <w:rPr>
+          <w:rFonts w:eastAsiaTheme="minorEastAsia"/>
+          <w:color w:val="525252" w:themeColor="accent3" w:themeShade="80"/>
+          <w:lang w:val="en-US"/>
+        </w:rPr>
+        <w:t>“</w:t>
+      </w:r>
+      <w:r>
+        <w:rPr>
+          <w:color w:val="525252" w:themeColor="accent3" w:themeShade="80"/>
+          <w:lang w:val="en-US"/>
+        </w:rPr>
+        <w:t>two-standard-deviation change</w:t>
+      </w:r>
+      <w:r>
+        <w:rPr>
+          <w:color w:val="525252" w:themeColor="accent3" w:themeShade="80"/>
+          <w:lang w:val="en-US"/>
+        </w:rPr>
+        <w:t xml:space="preserve"> </w:t>
+      </w:r>
+      <m:oMath>
+        <m:r>
+          <w:rPr>
+            <w:rFonts w:ascii="Cambria Math" w:hAnsi="Cambria Math"/>
+            <w:color w:val="525252" w:themeColor="accent3" w:themeShade="80"/>
+            <w:lang w:val="en-US"/>
+          </w:rPr>
+          <m:t>2σ</m:t>
+        </m:r>
+      </m:oMath>
+      <w:r>
+        <w:rPr>
+          <w:color w:val="525252" w:themeColor="accent3" w:themeShade="80"/>
+          <w:lang w:val="en-US"/>
+        </w:rPr>
+        <w:t xml:space="preserve"> “range</w:t>
+      </w:r>
+      <w:r>
+        <w:rPr>
+          <w:color w:val="525252" w:themeColor="accent3" w:themeShade="80"/>
+          <w:lang w:val="en-US"/>
+        </w:rPr>
+        <w:t xml:space="preserve"> would </w:t>
+      </w:r>
+      <w:r>
+        <w:rPr>
+          <w:color w:val="525252" w:themeColor="accent3" w:themeShade="80"/>
+          <w:lang w:val="en-US"/>
+        </w:rPr>
+        <w:t xml:space="preserve">be </w:t>
+      </w:r>
+      <w:r>
+        <w:rPr>
+          <w:color w:val="525252" w:themeColor="accent3" w:themeShade="80"/>
+          <w:lang w:val="en-US"/>
+        </w:rPr>
+        <w:t xml:space="preserve">-0.08 or 0.08. </w:t>
+      </w:r>
+    </w:p>
+    <w:p>
+      <w:pPr>
+        <w:rPr>
+          <w:color w:val="525252" w:themeColor="accent3" w:themeShade="80"/>
+          <w:lang w:val="en-US"/>
+        </w:rPr>
+      </w:pPr>
+    </w:p>
+    <w:p>
+      <w:pPr>
+        <w:rPr>
+          <w:color w:val="525252" w:themeColor="accent3" w:themeShade="80"/>
+        </w:rPr>
+      </w:pPr>
+      <w:r>
+        <w:rPr>
+          <w:color w:val="525252" w:themeColor="accent3" w:themeShade="80"/>
+        </w:rPr>
+        <w:lastRenderedPageBreak/>
+        <w:t>In die Formel gepackt heißt es bei x=</w:t>
+      </w:r>
+      <w:r>
+        <w:rPr>
+          <w:color w:val="525252" w:themeColor="accent3" w:themeShade="80"/>
+        </w:rPr>
+        <w:t xml:space="preserve"> </w:t>
+      </w:r>
+      <w:r>
+        <w:rPr>
+          <w:color w:val="525252" w:themeColor="accent3" w:themeShade="80"/>
+        </w:rPr>
+        <w:t>1</w:t>
+      </w:r>
+      <w:r>
+        <w:rPr>
+          <w:color w:val="525252" w:themeColor="accent3" w:themeShade="80"/>
+        </w:rPr>
+        <w:t>2 km/h</w:t>
+      </w:r>
+      <w:r>
+        <w:rPr>
+          <w:color w:val="525252" w:themeColor="accent3" w:themeShade="80"/>
+        </w:rPr>
+        <w:t xml:space="preserve"> (</w:t>
+      </w:r>
+      <w:proofErr w:type="spellStart"/>
+      <w:r>
+        <w:rPr>
+          <w:color w:val="525252" w:themeColor="accent3" w:themeShade="80"/>
+        </w:rPr>
+        <w:t>upper</w:t>
+      </w:r>
+      <w:proofErr w:type="spellEnd"/>
+      <w:r>
+        <w:rPr>
+          <w:color w:val="525252" w:themeColor="accent3" w:themeShade="80"/>
+        </w:rPr>
+        <w:t xml:space="preserve"> </w:t>
+      </w:r>
+      <w:proofErr w:type="spellStart"/>
+      <w:r>
+        <w:rPr>
+          <w:color w:val="525252" w:themeColor="accent3" w:themeShade="80"/>
+        </w:rPr>
+        <w:t>bound</w:t>
+      </w:r>
+      <w:proofErr w:type="spellEnd"/>
+      <w:r>
+        <w:rPr>
+          <w:color w:val="525252" w:themeColor="accent3" w:themeShade="80"/>
+        </w:rPr>
+        <w:t>)</w:t>
+      </w:r>
+    </w:p>
+    <w:p>
+      <w:pPr>
+        <w:rPr>
+          <w:rFonts w:eastAsiaTheme="minorEastAsia"/>
+          <w:color w:val="525252" w:themeColor="accent3" w:themeShade="80"/>
+        </w:rPr>
+      </w:pPr>
+      <m:oMathPara>
+        <m:oMath>
+          <m:r>
+            <w:rPr>
+              <w:rFonts w:ascii="Cambria Math" w:hAnsi="Cambria Math"/>
+              <w:color w:val="525252" w:themeColor="accent3" w:themeShade="80"/>
+            </w:rPr>
+            <m:t xml:space="preserve">p= </m:t>
+          </m:r>
+          <m:f>
+            <m:fPr>
+              <m:ctrlPr>
+                <w:rPr>
+                  <w:rFonts w:ascii="Cambria Math" w:hAnsi="Cambria Math"/>
+                  <w:i/>
+                  <w:color w:val="525252" w:themeColor="accent3" w:themeShade="80"/>
+                </w:rPr>
+              </m:ctrlPr>
+            </m:fPr>
+            <m:num>
+              <m:sSup>
+                <m:sSupPr>
+                  <m:ctrlPr>
+                    <w:rPr>
+                      <w:rFonts w:ascii="Cambria Math" w:hAnsi="Cambria Math"/>
+                      <w:i/>
+                      <w:color w:val="525252" w:themeColor="accent3" w:themeShade="80"/>
+                    </w:rPr>
+                  </m:ctrlPr>
+                </m:sSupPr>
+                <m:e>
+                  <m:r>
+                    <w:rPr>
+                      <w:rFonts w:ascii="Cambria Math" w:hAnsi="Cambria Math"/>
+                      <w:color w:val="525252" w:themeColor="accent3" w:themeShade="80"/>
+                    </w:rPr>
+                    <m:t>e</m:t>
+                  </m:r>
+                </m:e>
+                <m:sup>
+                  <m:d>
+                    <m:dPr>
+                      <m:ctrlPr>
+                        <w:rPr>
+                          <w:rFonts w:ascii="Cambria Math" w:hAnsi="Cambria Math"/>
+                          <w:i/>
+                          <w:color w:val="525252" w:themeColor="accent3" w:themeShade="80"/>
+                        </w:rPr>
+                      </m:ctrlPr>
+                    </m:dPr>
+                    <m:e>
+                      <m:r>
+                        <w:rPr>
+                          <w:rFonts w:ascii="Cambria Math" w:hAnsi="Cambria Math"/>
+                          <w:color w:val="525252" w:themeColor="accent3" w:themeShade="80"/>
+                        </w:rPr>
+                        <m:t>-4.6+0.08*12</m:t>
+                      </m:r>
+                    </m:e>
+                  </m:d>
+                </m:sup>
+              </m:sSup>
+            </m:num>
+            <m:den>
+              <m:r>
+                <w:rPr>
+                  <w:rFonts w:ascii="Cambria Math" w:hAnsi="Cambria Math"/>
+                  <w:color w:val="525252" w:themeColor="accent3" w:themeShade="80"/>
+                </w:rPr>
+                <m:t>1+</m:t>
+              </m:r>
+              <m:sSup>
+                <m:sSupPr>
+                  <m:ctrlPr>
+                    <w:rPr>
+                      <w:rFonts w:ascii="Cambria Math" w:hAnsi="Cambria Math"/>
+                      <w:i/>
+                      <w:color w:val="525252" w:themeColor="accent3" w:themeShade="80"/>
+                    </w:rPr>
+                  </m:ctrlPr>
+                </m:sSupPr>
+                <m:e>
+                  <m:r>
+                    <w:rPr>
+                      <w:rFonts w:ascii="Cambria Math" w:hAnsi="Cambria Math"/>
+                      <w:color w:val="525252" w:themeColor="accent3" w:themeShade="80"/>
+                    </w:rPr>
+                    <m:t>e</m:t>
+                  </m:r>
+                </m:e>
+                <m:sup>
+                  <m:d>
+                    <m:dPr>
+                      <m:ctrlPr>
+                        <w:rPr>
+                          <w:rFonts w:ascii="Cambria Math" w:hAnsi="Cambria Math"/>
+                          <w:i/>
+                          <w:color w:val="525252" w:themeColor="accent3" w:themeShade="80"/>
+                        </w:rPr>
+                      </m:ctrlPr>
+                    </m:dPr>
+                    <m:e>
+                      <m:r>
+                        <w:rPr>
+                          <w:rFonts w:ascii="Cambria Math" w:hAnsi="Cambria Math"/>
+                          <w:color w:val="525252" w:themeColor="accent3" w:themeShade="80"/>
+                        </w:rPr>
+                        <m:t>-4.6+0.08*12</m:t>
+                      </m:r>
+                    </m:e>
+                  </m:d>
+                </m:sup>
+              </m:sSup>
+            </m:den>
+          </m:f>
+          <m:r>
+            <w:rPr>
+              <w:rFonts w:ascii="Cambria Math" w:hAnsi="Cambria Math"/>
+              <w:color w:val="525252" w:themeColor="accent3" w:themeShade="80"/>
+            </w:rPr>
+            <m:t>=0.0255=2.55%</m:t>
+          </m:r>
+        </m:oMath>
+      </m:oMathPara>
+    </w:p>
+    <w:p>
+      <w:pPr>
+        <w:rPr>
+          <w:rFonts w:eastAsiaTheme="minorEastAsia"/>
+          <w:color w:val="525252" w:themeColor="accent3" w:themeShade="80"/>
+        </w:rPr>
+      </w:pPr>
+    </w:p>
+    <w:p>
+      <w:pPr>
+        <w:rPr>
+          <w:rFonts w:eastAsiaTheme="minorEastAsia"/>
+          <w:color w:val="525252" w:themeColor="accent3" w:themeShade="80"/>
+        </w:rPr>
+      </w:pPr>
+      <w:r>
+        <w:rPr>
+          <w:rFonts w:eastAsiaTheme="minorEastAsia"/>
+          <w:color w:val="525252" w:themeColor="accent3" w:themeShade="80"/>
+        </w:rPr>
+        <w:t xml:space="preserve">Bei einem </w:t>
+      </w:r>
+      <m:oMath>
+        <m:r>
+          <w:rPr>
+            <w:rFonts w:ascii="Cambria Math" w:hAnsi="Cambria Math"/>
+            <w:color w:val="525252" w:themeColor="accent3" w:themeShade="80"/>
+          </w:rPr>
+          <m:t>N(0 , 0.4)</m:t>
+        </m:r>
+      </m:oMath>
+      <w:r>
+        <w:rPr>
+          <w:rFonts w:eastAsiaTheme="minorEastAsia"/>
+          <w:color w:val="525252" w:themeColor="accent3" w:themeShade="80"/>
+        </w:rPr>
+        <w:t xml:space="preserve">  </w:t>
+      </w:r>
+      <w:proofErr w:type="spellStart"/>
+      <w:r>
+        <w:rPr>
+          <w:rFonts w:eastAsiaTheme="minorEastAsia"/>
+          <w:color w:val="525252" w:themeColor="accent3" w:themeShade="80"/>
+        </w:rPr>
+        <w:t>prior</w:t>
+      </w:r>
+      <w:proofErr w:type="spellEnd"/>
+      <w:r>
+        <w:rPr>
+          <w:rFonts w:eastAsiaTheme="minorEastAsia"/>
+          <w:color w:val="525252" w:themeColor="accent3" w:themeShade="80"/>
+        </w:rPr>
+        <w:t xml:space="preserve"> </w:t>
+      </w:r>
+      <w:r>
+        <w:rPr>
+          <w:color w:val="525252" w:themeColor="accent3" w:themeShade="80"/>
+        </w:rPr>
+        <w:t>heißt es bei x=12 km/h</w:t>
+      </w:r>
+      <w:r>
+        <w:rPr>
+          <w:rFonts w:eastAsiaTheme="minorEastAsia"/>
+          <w:color w:val="525252" w:themeColor="accent3" w:themeShade="80"/>
+        </w:rPr>
+        <w:t xml:space="preserve"> </w:t>
+      </w:r>
+      <w:r>
+        <w:rPr>
+          <w:color w:val="525252" w:themeColor="accent3" w:themeShade="80"/>
+        </w:rPr>
+        <w:t>(</w:t>
+      </w:r>
+      <w:proofErr w:type="spellStart"/>
+      <w:r>
+        <w:rPr>
+          <w:color w:val="525252" w:themeColor="accent3" w:themeShade="80"/>
+        </w:rPr>
+        <w:t>upper</w:t>
+      </w:r>
+      <w:proofErr w:type="spellEnd"/>
+      <w:r>
+        <w:rPr>
+          <w:color w:val="525252" w:themeColor="accent3" w:themeShade="80"/>
+        </w:rPr>
+        <w:t xml:space="preserve"> </w:t>
+      </w:r>
+      <w:proofErr w:type="spellStart"/>
+      <w:r>
+        <w:rPr>
+          <w:color w:val="525252" w:themeColor="accent3" w:themeShade="80"/>
+        </w:rPr>
+        <w:t>bound</w:t>
+      </w:r>
+      <w:proofErr w:type="spellEnd"/>
+      <w:r>
+        <w:rPr>
+          <w:color w:val="525252" w:themeColor="accent3" w:themeShade="80"/>
+        </w:rPr>
+        <w:t>)</w:t>
+      </w:r>
+    </w:p>
+    <w:p>
+      <w:pPr>
+        <w:rPr>
+          <w:rFonts w:eastAsiaTheme="minorEastAsia"/>
+          <w:color w:val="525252" w:themeColor="accent3" w:themeShade="80"/>
+        </w:rPr>
+      </w:pPr>
+      <m:oMathPara>
+        <m:oMath>
+          <m:r>
+            <w:rPr>
+              <w:rFonts w:ascii="Cambria Math" w:hAnsi="Cambria Math"/>
+              <w:color w:val="525252" w:themeColor="accent3" w:themeShade="80"/>
+            </w:rPr>
+            <m:t xml:space="preserve">p= </m:t>
+          </m:r>
+          <m:f>
+            <m:fPr>
+              <m:ctrlPr>
+                <w:rPr>
+                  <w:rFonts w:ascii="Cambria Math" w:hAnsi="Cambria Math"/>
+                  <w:i/>
+                  <w:color w:val="525252" w:themeColor="accent3" w:themeShade="80"/>
+                </w:rPr>
+              </m:ctrlPr>
+            </m:fPr>
+            <m:num>
+              <m:sSup>
+                <m:sSupPr>
+                  <m:ctrlPr>
+                    <w:rPr>
+                      <w:rFonts w:ascii="Cambria Math" w:hAnsi="Cambria Math"/>
+                      <w:i/>
+                      <w:color w:val="525252" w:themeColor="accent3" w:themeShade="80"/>
+                    </w:rPr>
+                  </m:ctrlPr>
+                </m:sSupPr>
+                <m:e>
+                  <m:r>
+                    <w:rPr>
+                      <w:rFonts w:ascii="Cambria Math" w:hAnsi="Cambria Math"/>
+                      <w:color w:val="525252" w:themeColor="accent3" w:themeShade="80"/>
+                    </w:rPr>
+                    <m:t>e</m:t>
+                  </m:r>
+                </m:e>
+                <m:sup>
+                  <m:d>
+                    <m:dPr>
+                      <m:ctrlPr>
+                        <w:rPr>
+                          <w:rFonts w:ascii="Cambria Math" w:hAnsi="Cambria Math"/>
+                          <w:i/>
+                          <w:color w:val="525252" w:themeColor="accent3" w:themeShade="80"/>
+                        </w:rPr>
+                      </m:ctrlPr>
+                    </m:dPr>
+                    <m:e>
+                      <m:r>
+                        <w:rPr>
+                          <w:rFonts w:ascii="Cambria Math" w:hAnsi="Cambria Math"/>
+                          <w:color w:val="525252" w:themeColor="accent3" w:themeShade="80"/>
+                        </w:rPr>
+                        <m:t>-4.6+0.8*12</m:t>
+                      </m:r>
+                    </m:e>
+                  </m:d>
+                </m:sup>
+              </m:sSup>
+            </m:num>
+            <m:den>
+              <m:r>
+                <w:rPr>
+                  <w:rFonts w:ascii="Cambria Math" w:hAnsi="Cambria Math"/>
+                  <w:color w:val="525252" w:themeColor="accent3" w:themeShade="80"/>
+                </w:rPr>
+                <m:t>1+</m:t>
+              </m:r>
+              <m:sSup>
+                <m:sSupPr>
+                  <m:ctrlPr>
+                    <w:rPr>
+                      <w:rFonts w:ascii="Cambria Math" w:hAnsi="Cambria Math"/>
+                      <w:i/>
+                      <w:color w:val="525252" w:themeColor="accent3" w:themeShade="80"/>
+                    </w:rPr>
+                  </m:ctrlPr>
+                </m:sSupPr>
+                <m:e>
+                  <m:r>
+                    <w:rPr>
+                      <w:rFonts w:ascii="Cambria Math" w:hAnsi="Cambria Math"/>
+                      <w:color w:val="525252" w:themeColor="accent3" w:themeShade="80"/>
+                    </w:rPr>
+                    <m:t>e</m:t>
+                  </m:r>
+                </m:e>
+                <m:sup>
+                  <m:d>
+                    <m:dPr>
+                      <m:ctrlPr>
+                        <w:rPr>
+                          <w:rFonts w:ascii="Cambria Math" w:hAnsi="Cambria Math"/>
+                          <w:i/>
+                          <w:color w:val="525252" w:themeColor="accent3" w:themeShade="80"/>
+                        </w:rPr>
+                      </m:ctrlPr>
+                    </m:dPr>
+                    <m:e>
+                      <m:r>
+                        <w:rPr>
+                          <w:rFonts w:ascii="Cambria Math" w:hAnsi="Cambria Math"/>
+                          <w:color w:val="525252" w:themeColor="accent3" w:themeShade="80"/>
+                        </w:rPr>
+                        <m:t>-4.6+0.8*12</m:t>
+                      </m:r>
+                    </m:e>
+                  </m:d>
+                </m:sup>
+              </m:sSup>
+            </m:den>
+          </m:f>
+          <m:r>
+            <w:rPr>
+              <w:rFonts w:ascii="Cambria Math" w:hAnsi="Cambria Math"/>
+              <w:color w:val="525252" w:themeColor="accent3" w:themeShade="80"/>
+            </w:rPr>
+            <m:t>=</m:t>
+          </m:r>
+          <w:bookmarkStart w:id="0" w:name="_Hlk216731341"/>
+          <m:r>
+            <w:rPr>
+              <w:rFonts w:ascii="Cambria Math" w:hAnsi="Cambria Math"/>
+              <w:color w:val="525252" w:themeColor="accent3" w:themeShade="80"/>
+            </w:rPr>
+            <m:t>0.993</m:t>
+          </m:r>
+          <w:bookmarkEnd w:id="0"/>
+          <m:r>
+            <w:rPr>
+              <w:rFonts w:ascii="Cambria Math" w:hAnsi="Cambria Math"/>
+              <w:color w:val="525252" w:themeColor="accent3" w:themeShade="80"/>
+            </w:rPr>
+            <m:t>=99%</m:t>
+          </m:r>
+        </m:oMath>
+      </m:oMathPara>
+    </w:p>
+    <w:p>
+      <w:pPr>
+        <w:rPr>
+          <w:color w:val="525252" w:themeColor="accent3" w:themeShade="80"/>
+        </w:rPr>
+      </w:pPr>
+    </w:p>
+    <w:p>
+      <w:pPr>
+        <w:rPr>
+          <w:color w:val="525252" w:themeColor="accent3" w:themeShade="80"/>
+        </w:rPr>
+      </w:pPr>
+      <w:r>
+        <w:rPr>
+          <w:color w:val="525252" w:themeColor="accent3" w:themeShade="80"/>
+        </w:rPr>
+        <w:t>Wahrscheinlich beides unrealistisch.</w:t>
+      </w:r>
+      <w:r>
+        <w:rPr>
+          <w:color w:val="525252" w:themeColor="accent3" w:themeShade="80"/>
+        </w:rPr>
+        <w:t xml:space="preserve"> </w:t>
+      </w:r>
+    </w:p>
+    <w:p>
+      <w:pPr>
+        <w:rPr>
+          <w:color w:val="525252" w:themeColor="accent3" w:themeShade="80"/>
+        </w:rPr>
+      </w:pPr>
+      <w:r>
+        <w:rPr>
+          <w:color w:val="525252" w:themeColor="accent3" w:themeShade="80"/>
+        </w:rPr>
+        <w:t>Idee, können wir eine Inversionsformel erstellen? Quasi wir wollen das der Effekt so viel ist, wie müssen wir dann die Priors setzen?</w:t>
+      </w:r>
+    </w:p>
+    <w:p>
+      <w:pPr>
+        <w:jc w:val="center"/>
+        <w:rPr>
+          <w:rFonts w:eastAsiaTheme="minorEastAsia"/>
+          <w:color w:val="525252" w:themeColor="accent3" w:themeShade="80"/>
+        </w:rPr>
+      </w:pPr>
+      <w:r>
+        <w:rPr>
+          <w:rFonts w:eastAsiaTheme="minorEastAsia"/>
+          <w:color w:val="525252" w:themeColor="accent3" w:themeShade="80"/>
+        </w:rPr>
+        <w:t xml:space="preserve">Ziel aus </w:t>
+      </w:r>
+      <m:oMath>
+        <m:r>
+          <w:rPr>
+            <w:rFonts w:ascii="Cambria Math" w:hAnsi="Cambria Math"/>
+            <w:color w:val="525252" w:themeColor="accent3" w:themeShade="80"/>
+          </w:rPr>
+          <m:t xml:space="preserve">p= </m:t>
+        </m:r>
+        <m:f>
+          <m:fPr>
+            <m:ctrlPr>
+              <w:rPr>
+                <w:rFonts w:ascii="Cambria Math" w:hAnsi="Cambria Math"/>
+                <w:i/>
+                <w:color w:val="525252" w:themeColor="accent3" w:themeShade="80"/>
+              </w:rPr>
+            </m:ctrlPr>
+          </m:fPr>
+          <m:num>
+            <m:sSup>
+              <m:sSupPr>
+                <m:ctrlPr>
+                  <w:rPr>
+                    <w:rFonts w:ascii="Cambria Math" w:hAnsi="Cambria Math"/>
+                    <w:i/>
+                    <w:color w:val="525252" w:themeColor="accent3" w:themeShade="80"/>
+                  </w:rPr>
+                </m:ctrlPr>
+              </m:sSupPr>
+              <m:e>
+                <m:r>
+                  <w:rPr>
+                    <w:rFonts w:ascii="Cambria Math" w:hAnsi="Cambria Math"/>
+                    <w:color w:val="525252" w:themeColor="accent3" w:themeShade="80"/>
+                  </w:rPr>
+                  <m:t>e</m:t>
+                </m:r>
+              </m:e>
+              <m:sup>
+                <m:r>
+                  <w:rPr>
+                    <w:rFonts w:ascii="Cambria Math" w:hAnsi="Cambria Math"/>
+                    <w:color w:val="525252" w:themeColor="accent3" w:themeShade="80"/>
+                  </w:rPr>
+                  <m:t>(α+βx)</m:t>
+                </m:r>
+              </m:sup>
+            </m:sSup>
+          </m:num>
+          <m:den>
+            <m:r>
+              <w:rPr>
+                <w:rFonts w:ascii="Cambria Math" w:hAnsi="Cambria Math"/>
+                <w:color w:val="525252" w:themeColor="accent3" w:themeShade="80"/>
+              </w:rPr>
+              <m:t>1+</m:t>
+            </m:r>
+            <m:sSup>
+              <m:sSupPr>
+                <m:ctrlPr>
+                  <w:rPr>
+                    <w:rFonts w:ascii="Cambria Math" w:hAnsi="Cambria Math"/>
+                    <w:i/>
+                    <w:color w:val="525252" w:themeColor="accent3" w:themeShade="80"/>
+                  </w:rPr>
+                </m:ctrlPr>
+              </m:sSupPr>
+              <m:e>
+                <m:r>
+                  <w:rPr>
+                    <w:rFonts w:ascii="Cambria Math" w:hAnsi="Cambria Math"/>
+                    <w:color w:val="525252" w:themeColor="accent3" w:themeShade="80"/>
+                  </w:rPr>
+                  <m:t>e</m:t>
+                </m:r>
+              </m:e>
+              <m:sup>
+                <m:r>
+                  <w:rPr>
+                    <w:rFonts w:ascii="Cambria Math" w:hAnsi="Cambria Math"/>
+                    <w:color w:val="525252" w:themeColor="accent3" w:themeShade="80"/>
+                  </w:rPr>
+                  <m:t>(α+βx)</m:t>
+                </m:r>
+              </m:sup>
+            </m:sSup>
+          </m:den>
+        </m:f>
+      </m:oMath>
+      <w:r>
+        <w:rPr>
+          <w:rFonts w:eastAsiaTheme="minorEastAsia"/>
+          <w:color w:val="525252" w:themeColor="accent3" w:themeShade="80"/>
+        </w:rPr>
+        <w:t xml:space="preserve"> eine </w:t>
+      </w:r>
+      <m:oMath>
+        <m:r>
+          <w:rPr>
+            <w:rFonts w:ascii="Cambria Math" w:hAnsi="Cambria Math"/>
+            <w:color w:val="525252" w:themeColor="accent3" w:themeShade="80"/>
+          </w:rPr>
+          <m:t>f</m:t>
+        </m:r>
+        <m:d>
+          <m:dPr>
+            <m:ctrlPr>
+              <w:rPr>
+                <w:rFonts w:ascii="Cambria Math" w:hAnsi="Cambria Math"/>
+                <w:i/>
+                <w:color w:val="525252" w:themeColor="accent3" w:themeShade="80"/>
+              </w:rPr>
+            </m:ctrlPr>
+          </m:dPr>
+          <m:e>
+            <m:r>
+              <w:rPr>
+                <w:rFonts w:ascii="Cambria Math" w:hAnsi="Cambria Math"/>
+                <w:color w:val="525252" w:themeColor="accent3" w:themeShade="80"/>
+              </w:rPr>
+              <m:t>p, α,x</m:t>
+            </m:r>
+          </m:e>
+        </m:d>
+        <m:r>
+          <w:rPr>
+            <w:rFonts w:ascii="Cambria Math" w:hAnsi="Cambria Math"/>
+            <w:color w:val="525252" w:themeColor="accent3" w:themeShade="80"/>
+          </w:rPr>
+          <m:t xml:space="preserve">= β </m:t>
+        </m:r>
+      </m:oMath>
+    </w:p>
+    <w:p>
+      <w:pPr>
+        <w:rPr>
+          <w:rFonts w:eastAsiaTheme="minorEastAsia"/>
+          <w:color w:val="525252" w:themeColor="accent3" w:themeShade="80"/>
+        </w:rPr>
+      </w:pPr>
+      <w:r>
+        <w:rPr>
+          <w:rFonts w:eastAsiaTheme="minorEastAsia"/>
+          <w:color w:val="525252" w:themeColor="accent3" w:themeShade="80"/>
+        </w:rPr>
+        <w:t>Formel 2:</w:t>
+      </w:r>
+    </w:p>
+    <w:p>
+      <w:pPr>
+        <w:rPr>
+          <w:color w:val="525252" w:themeColor="accent3" w:themeShade="80"/>
+        </w:rPr>
+      </w:pPr>
+      <m:oMathPara>
+        <m:oMath>
+          <m:r>
+            <w:rPr>
+              <w:rFonts w:ascii="Cambria Math" w:hAnsi="Cambria Math"/>
+              <w:color w:val="525252" w:themeColor="accent3" w:themeShade="80"/>
+            </w:rPr>
+            <m:t>f</m:t>
+          </m:r>
+          <m:d>
+            <m:dPr>
+              <m:ctrlPr>
+                <w:rPr>
+                  <w:rFonts w:ascii="Cambria Math" w:hAnsi="Cambria Math"/>
+                  <w:i/>
+                  <w:color w:val="525252" w:themeColor="accent3" w:themeShade="80"/>
+                </w:rPr>
+              </m:ctrlPr>
+            </m:dPr>
+            <m:e>
+              <m:r>
+                <w:rPr>
+                  <w:rFonts w:ascii="Cambria Math" w:hAnsi="Cambria Math"/>
+                  <w:color w:val="525252" w:themeColor="accent3" w:themeShade="80"/>
+                </w:rPr>
+                <m:t>p, α,x</m:t>
+              </m:r>
+            </m:e>
+          </m:d>
+          <m:r>
+            <w:rPr>
+              <w:rFonts w:ascii="Cambria Math" w:hAnsi="Cambria Math"/>
+              <w:color w:val="525252" w:themeColor="accent3" w:themeShade="80"/>
+            </w:rPr>
+            <m:t>=</m:t>
+          </m:r>
+          <m:f>
+            <m:fPr>
+              <m:ctrlPr>
+                <w:rPr>
+                  <w:rFonts w:ascii="Cambria Math" w:hAnsi="Cambria Math"/>
+                  <w:i/>
+                  <w:color w:val="525252" w:themeColor="accent3" w:themeShade="80"/>
+                </w:rPr>
+              </m:ctrlPr>
+            </m:fPr>
+            <m:num>
+              <m:func>
+                <m:funcPr>
+                  <m:ctrlPr>
+                    <w:rPr>
+                      <w:rFonts w:ascii="Cambria Math" w:hAnsi="Cambria Math"/>
+                      <w:color w:val="525252" w:themeColor="accent3" w:themeShade="80"/>
+                    </w:rPr>
+                  </m:ctrlPr>
+                </m:funcPr>
+                <m:fName>
+                  <m:r>
+                    <m:rPr>
+                      <m:sty m:val="p"/>
+                    </m:rPr>
+                    <w:rPr>
+                      <w:rFonts w:ascii="Cambria Math" w:hAnsi="Cambria Math"/>
+                      <w:color w:val="525252" w:themeColor="accent3" w:themeShade="80"/>
+                    </w:rPr>
+                    <m:t>ln</m:t>
+                  </m:r>
+                </m:fName>
+                <m:e>
+                  <m:d>
+                    <m:dPr>
+                      <m:ctrlPr>
+                        <w:rPr>
+                          <w:rFonts w:ascii="Cambria Math" w:hAnsi="Cambria Math"/>
+                          <w:i/>
+                          <w:color w:val="525252" w:themeColor="accent3" w:themeShade="80"/>
+                        </w:rPr>
+                      </m:ctrlPr>
+                    </m:dPr>
+                    <m:e>
+                      <m:f>
+                        <m:fPr>
+                          <m:ctrlPr>
+                            <w:rPr>
+                              <w:rFonts w:ascii="Cambria Math" w:hAnsi="Cambria Math"/>
+                              <w:i/>
+                              <w:color w:val="525252" w:themeColor="accent3" w:themeShade="80"/>
+                            </w:rPr>
+                          </m:ctrlPr>
+                        </m:fPr>
+                        <m:num>
+                          <m:r>
+                            <w:rPr>
+                              <w:rFonts w:ascii="Cambria Math" w:hAnsi="Cambria Math"/>
+                              <w:color w:val="525252" w:themeColor="accent3" w:themeShade="80"/>
+                            </w:rPr>
+                            <m:t>p</m:t>
+                          </m:r>
+                        </m:num>
+                        <m:den>
+                          <m:r>
+                            <w:rPr>
+                              <w:rFonts w:ascii="Cambria Math" w:hAnsi="Cambria Math"/>
+                              <w:color w:val="525252" w:themeColor="accent3" w:themeShade="80"/>
+                            </w:rPr>
+                            <m:t>1-p</m:t>
+                          </m:r>
+                        </m:den>
+                      </m:f>
+                    </m:e>
+                  </m:d>
+                </m:e>
+              </m:func>
+              <m:r>
+                <w:rPr>
+                  <w:rFonts w:ascii="Cambria Math" w:hAnsi="Cambria Math"/>
+                  <w:color w:val="525252" w:themeColor="accent3" w:themeShade="80"/>
+                </w:rPr>
+                <m:t>-α</m:t>
+              </m:r>
+            </m:num>
+            <m:den>
+              <m:r>
+                <w:rPr>
+                  <w:rFonts w:ascii="Cambria Math" w:hAnsi="Cambria Math"/>
+                  <w:color w:val="525252" w:themeColor="accent3" w:themeShade="80"/>
+                </w:rPr>
+                <m:t>x</m:t>
+              </m:r>
+            </m:den>
+          </m:f>
+          <m:r>
+            <w:rPr>
+              <w:rFonts w:ascii="Cambria Math" w:eastAsiaTheme="minorEastAsia" w:hAnsi="Cambria Math"/>
+              <w:color w:val="525252" w:themeColor="accent3" w:themeShade="80"/>
+            </w:rPr>
+            <m:t>=</m:t>
+          </m:r>
+          <m:r>
+            <w:rPr>
+              <w:rFonts w:ascii="Cambria Math" w:hAnsi="Cambria Math"/>
+              <w:color w:val="525252" w:themeColor="accent3" w:themeShade="80"/>
+            </w:rPr>
+            <m:t xml:space="preserve"> β</m:t>
+          </m:r>
+        </m:oMath>
+      </m:oMathPara>
+    </w:p>
+    <w:p>
+      <w:pPr>
+        <w:rPr>
+          <w:color w:val="525252" w:themeColor="accent3" w:themeShade="80"/>
+        </w:rPr>
+      </w:pPr>
+      <w:r>
+        <w:rPr>
+          <w:color w:val="525252" w:themeColor="accent3" w:themeShade="80"/>
+        </w:rPr>
+        <w:t>Beweis in Foto</w:t>
+      </w:r>
+      <w:r>
+        <w:rPr>
+          <w:color w:val="525252" w:themeColor="accent3" w:themeShade="80"/>
+        </w:rPr>
+        <w:t xml:space="preserve"> im </w:t>
+      </w:r>
+      <w:proofErr w:type="spellStart"/>
+      <w:r>
+        <w:rPr>
+          <w:color w:val="525252" w:themeColor="accent3" w:themeShade="80"/>
+        </w:rPr>
+        <w:t>Git</w:t>
+      </w:r>
+      <w:proofErr w:type="spellEnd"/>
+      <w:r>
+        <w:rPr>
+          <w:color w:val="525252" w:themeColor="accent3" w:themeShade="80"/>
+        </w:rPr>
+        <w:t xml:space="preserve"> Ordner.</w:t>
+      </w:r>
+    </w:p>
+    <w:p>
+      <w:pPr>
+        <w:rPr>
+          <w:color w:val="525252" w:themeColor="accent3" w:themeShade="80"/>
+        </w:rPr>
+      </w:pPr>
+      <w:r>
+        <w:rPr>
+          <w:color w:val="525252" w:themeColor="accent3" w:themeShade="80"/>
+        </w:rPr>
+        <w:t xml:space="preserve">Beispiel Rechnung: </w:t>
+      </w:r>
+    </w:p>
+    <w:p>
+      <w:pPr>
+        <w:rPr>
+          <w:rFonts w:eastAsiaTheme="minorEastAsia"/>
+          <w:color w:val="525252" w:themeColor="accent3" w:themeShade="80"/>
+        </w:rPr>
+      </w:pPr>
+      <m:oMathPara>
+        <m:oMath>
+          <m:r>
+            <w:rPr>
+              <w:rFonts w:ascii="Cambria Math" w:hAnsi="Cambria Math"/>
+              <w:color w:val="525252" w:themeColor="accent3" w:themeShade="80"/>
+            </w:rPr>
+            <m:t>p= 0.99330714907571514 ; α=-4.6 ;x=12</m:t>
+          </m:r>
+        </m:oMath>
+      </m:oMathPara>
+    </w:p>
+    <w:p>
+      <w:pPr>
+        <w:rPr>
+          <w:rFonts w:eastAsiaTheme="minorEastAsia"/>
+          <w:color w:val="525252" w:themeColor="accent3" w:themeShade="80"/>
+        </w:rPr>
+      </w:pPr>
+    </w:p>
+    <w:p>
+      <w:pPr>
+        <w:rPr>
+          <w:color w:val="525252" w:themeColor="accent3" w:themeShade="80"/>
+        </w:rPr>
+      </w:pPr>
+      <m:oMathPara>
+        <m:oMath>
+          <m:r>
+            <w:rPr>
+              <w:rFonts w:ascii="Cambria Math" w:hAnsi="Cambria Math"/>
+              <w:color w:val="525252" w:themeColor="accent3" w:themeShade="80"/>
+            </w:rPr>
+            <m:t>f</m:t>
+          </m:r>
+          <m:d>
+            <m:dPr>
+              <m:ctrlPr>
+                <w:rPr>
+                  <w:rFonts w:ascii="Cambria Math" w:hAnsi="Cambria Math"/>
+                  <w:i/>
+                  <w:color w:val="525252" w:themeColor="accent3" w:themeShade="80"/>
+                </w:rPr>
+              </m:ctrlPr>
+            </m:dPr>
+            <m:e>
+              <m:r>
+                <w:rPr>
+                  <w:rFonts w:ascii="Cambria Math" w:hAnsi="Cambria Math"/>
+                  <w:color w:val="525252" w:themeColor="accent3" w:themeShade="80"/>
+                </w:rPr>
+                <m:t>p, α,x</m:t>
+              </m:r>
+            </m:e>
+          </m:d>
+          <m:r>
+            <w:rPr>
+              <w:rFonts w:ascii="Cambria Math" w:hAnsi="Cambria Math"/>
+              <w:color w:val="525252" w:themeColor="accent3" w:themeShade="80"/>
+            </w:rPr>
+            <m:t>=</m:t>
+          </m:r>
+          <m:f>
+            <m:fPr>
+              <m:ctrlPr>
+                <w:rPr>
+                  <w:rFonts w:ascii="Cambria Math" w:hAnsi="Cambria Math"/>
+                  <w:i/>
+                  <w:color w:val="525252" w:themeColor="accent3" w:themeShade="80"/>
+                </w:rPr>
+              </m:ctrlPr>
+            </m:fPr>
+            <m:num>
+              <m:func>
+                <m:funcPr>
+                  <m:ctrlPr>
+                    <w:rPr>
+                      <w:rFonts w:ascii="Cambria Math" w:hAnsi="Cambria Math"/>
+                      <w:color w:val="525252" w:themeColor="accent3" w:themeShade="80"/>
+                    </w:rPr>
+                  </m:ctrlPr>
+                </m:funcPr>
+                <m:fName>
+                  <m:r>
+                    <m:rPr>
+                      <m:sty m:val="p"/>
+                    </m:rPr>
+                    <w:rPr>
+                      <w:rFonts w:ascii="Cambria Math" w:hAnsi="Cambria Math"/>
+                      <w:color w:val="525252" w:themeColor="accent3" w:themeShade="80"/>
+                    </w:rPr>
+                    <m:t>ln</m:t>
+                  </m:r>
+                </m:fName>
+                <m:e>
+                  <m:d>
+                    <m:dPr>
+                      <m:ctrlPr>
+                        <w:rPr>
+                          <w:rFonts w:ascii="Cambria Math" w:hAnsi="Cambria Math"/>
+                          <w:i/>
+                          <w:color w:val="525252" w:themeColor="accent3" w:themeShade="80"/>
+                        </w:rPr>
+                      </m:ctrlPr>
+                    </m:dPr>
+                    <m:e>
+                      <m:f>
+                        <m:fPr>
+                          <m:ctrlPr>
+                            <w:rPr>
+                              <w:rFonts w:ascii="Cambria Math" w:hAnsi="Cambria Math"/>
+                              <w:i/>
+                              <w:color w:val="525252" w:themeColor="accent3" w:themeShade="80"/>
+                            </w:rPr>
+                          </m:ctrlPr>
+                        </m:fPr>
+                        <m:num>
+                          <m:r>
+                            <w:rPr>
+                              <w:rFonts w:ascii="Cambria Math" w:hAnsi="Cambria Math"/>
+                              <w:color w:val="525252" w:themeColor="accent3" w:themeShade="80"/>
+                            </w:rPr>
+                            <m:t>0.993</m:t>
+                          </m:r>
+                        </m:num>
+                        <m:den>
+                          <m:r>
+                            <w:rPr>
+                              <w:rFonts w:ascii="Cambria Math" w:hAnsi="Cambria Math"/>
+                              <w:color w:val="525252" w:themeColor="accent3" w:themeShade="80"/>
+                            </w:rPr>
+                            <m:t>1-0.993</m:t>
+                          </m:r>
+                        </m:den>
+                      </m:f>
+                    </m:e>
+                  </m:d>
+                </m:e>
+              </m:func>
+              <m:r>
+                <w:rPr>
+                  <w:rFonts w:ascii="Cambria Math" w:hAnsi="Cambria Math"/>
+                  <w:color w:val="525252" w:themeColor="accent3" w:themeShade="80"/>
+                </w:rPr>
+                <m:t>-(-4.6)</m:t>
+              </m:r>
+            </m:num>
+            <m:den>
+              <m:r>
+                <w:rPr>
+                  <w:rFonts w:ascii="Cambria Math" w:hAnsi="Cambria Math"/>
+                  <w:color w:val="525252" w:themeColor="accent3" w:themeShade="80"/>
+                </w:rPr>
+                <m:t>12</m:t>
+              </m:r>
+            </m:den>
+          </m:f>
+          <m:r>
+            <w:rPr>
+              <w:rFonts w:ascii="Cambria Math" w:eastAsiaTheme="minorEastAsia" w:hAnsi="Cambria Math"/>
+              <w:color w:val="525252" w:themeColor="accent3" w:themeShade="80"/>
+            </w:rPr>
+            <m:t>=</m:t>
+          </m:r>
+          <m:r>
+            <w:rPr>
+              <w:rFonts w:ascii="Cambria Math" w:hAnsi="Cambria Math"/>
+              <w:color w:val="525252" w:themeColor="accent3" w:themeShade="80"/>
+            </w:rPr>
+            <m:t xml:space="preserve"> 0.7962 ≈0.8 wie oben</m:t>
+          </m:r>
+        </m:oMath>
+      </m:oMathPara>
+    </w:p>
+    <w:p>
+      <w:pPr>
+        <w:rPr>
+          <w:color w:val="525252" w:themeColor="accent3" w:themeShade="80"/>
+          <w:lang w:val="en-US"/>
+        </w:rPr>
+      </w:pPr>
+    </w:p>
+    <w:p>
+      <w:pPr>
+        <w:rPr>
+          <w:color w:val="525252" w:themeColor="accent3" w:themeShade="80"/>
+        </w:rPr>
+      </w:pPr>
+      <w:r>
+        <w:rPr>
+          <w:color w:val="525252" w:themeColor="accent3" w:themeShade="80"/>
+        </w:rPr>
+        <w:t>Wir können mir dieser Fo</w:t>
+      </w:r>
+      <w:r>
+        <w:rPr>
+          <w:color w:val="525252" w:themeColor="accent3" w:themeShade="80"/>
+        </w:rPr>
+        <w:t xml:space="preserve">rmel also sagen </w:t>
+      </w:r>
+      <w:r>
+        <w:rPr>
+          <w:color w:val="525252" w:themeColor="accent3" w:themeShade="80"/>
+        </w:rPr>
+        <w:t>w</w:t>
+      </w:r>
+      <w:r>
+        <w:rPr>
+          <w:color w:val="525252" w:themeColor="accent3" w:themeShade="80"/>
+        </w:rPr>
+        <w:t xml:space="preserve">egen dem </w:t>
+      </w:r>
+      <w:proofErr w:type="spellStart"/>
+      <w:r>
+        <w:rPr>
+          <w:color w:val="525252" w:themeColor="accent3" w:themeShade="80"/>
+        </w:rPr>
+        <w:t>intercept</w:t>
+      </w:r>
+      <w:proofErr w:type="spellEnd"/>
+      <w:r>
+        <w:rPr>
+          <w:color w:val="525252" w:themeColor="accent3" w:themeShade="80"/>
+        </w:rPr>
+        <w:t xml:space="preserve"> -4.6 und der </w:t>
+      </w:r>
+      <w:proofErr w:type="spellStart"/>
+      <w:r>
+        <w:rPr>
+          <w:color w:val="525252" w:themeColor="accent3" w:themeShade="80"/>
+        </w:rPr>
+        <w:t>max</w:t>
+      </w:r>
+      <w:proofErr w:type="spellEnd"/>
+      <w:r>
+        <w:rPr>
+          <w:color w:val="525252" w:themeColor="accent3" w:themeShade="80"/>
+        </w:rPr>
+        <w:t xml:space="preserve"> </w:t>
+      </w:r>
+      <w:proofErr w:type="spellStart"/>
+      <w:r>
+        <w:rPr>
+          <w:color w:val="525252" w:themeColor="accent3" w:themeShade="80"/>
+        </w:rPr>
+        <w:t>größe</w:t>
+      </w:r>
+      <w:proofErr w:type="spellEnd"/>
+      <w:r>
+        <w:rPr>
+          <w:color w:val="525252" w:themeColor="accent3" w:themeShade="80"/>
+        </w:rPr>
+        <w:t xml:space="preserve"> der Werte, wollen wir diesen p wert</w:t>
+      </w:r>
+      <w:r>
+        <w:rPr>
+          <w:color w:val="525252" w:themeColor="accent3" w:themeShade="80"/>
+        </w:rPr>
+        <w:t xml:space="preserve">. Die </w:t>
+      </w:r>
+      <w:proofErr w:type="spellStart"/>
+      <w:r>
+        <w:rPr>
+          <w:color w:val="525252" w:themeColor="accent3" w:themeShade="80"/>
+        </w:rPr>
+        <w:t>formel</w:t>
+      </w:r>
+      <w:proofErr w:type="spellEnd"/>
+      <w:r>
+        <w:rPr>
+          <w:color w:val="525252" w:themeColor="accent3" w:themeShade="80"/>
+        </w:rPr>
+        <w:t xml:space="preserve"> gibt uns das </w:t>
+      </w:r>
+      <w:proofErr w:type="spellStart"/>
+      <w:r>
+        <w:rPr>
+          <w:color w:val="525252" w:themeColor="accent3" w:themeShade="80"/>
+        </w:rPr>
+        <w:t>max</w:t>
+      </w:r>
+      <w:proofErr w:type="spellEnd"/>
+      <w:r>
+        <w:rPr>
+          <w:color w:val="525252" w:themeColor="accent3" w:themeShade="80"/>
+        </w:rPr>
+        <w:t xml:space="preserve"> </w:t>
+      </w:r>
+      <w:proofErr w:type="spellStart"/>
+      <w:r>
+        <w:rPr>
+          <w:color w:val="525252" w:themeColor="accent3" w:themeShade="80"/>
+        </w:rPr>
+        <w:t>beta</w:t>
+      </w:r>
+      <w:proofErr w:type="spellEnd"/>
+      <w:r>
+        <w:rPr>
+          <w:color w:val="525252" w:themeColor="accent3" w:themeShade="80"/>
+        </w:rPr>
+        <w:t>, das wir setzen sollten.</w:t>
+      </w:r>
+    </w:p>
+    <w:p>
+      <w:pPr>
+        <w:rPr>
+          <w:color w:val="525252" w:themeColor="accent3" w:themeShade="80"/>
+        </w:rPr>
+      </w:pPr>
+      <w:r>
+        <w:rPr>
+          <w:color w:val="525252" w:themeColor="accent3" w:themeShade="80"/>
+        </w:rPr>
+        <w:t>Das gilt für alle Verteilungen, wir müssen nur</w:t>
+      </w:r>
+      <w:r>
+        <w:rPr>
+          <w:color w:val="525252" w:themeColor="accent3" w:themeShade="80"/>
+        </w:rPr>
+        <w:t xml:space="preserve"> </w:t>
+      </w:r>
+      <w:r>
+        <w:rPr>
+          <w:color w:val="525252" w:themeColor="accent3" w:themeShade="80"/>
+        </w:rPr>
+        <w:t>j</w:t>
+      </w:r>
+      <w:r>
+        <w:rPr>
+          <w:color w:val="525252" w:themeColor="accent3" w:themeShade="80"/>
+        </w:rPr>
+        <w:t xml:space="preserve">e nach Verteilung </w:t>
+      </w:r>
+      <w:r>
+        <w:rPr>
+          <w:color w:val="525252" w:themeColor="accent3" w:themeShade="80"/>
+        </w:rPr>
+        <w:t>das</w:t>
+      </w:r>
+      <w:r>
+        <w:rPr>
+          <w:color w:val="525252" w:themeColor="accent3" w:themeShade="80"/>
+        </w:rPr>
+        <w:t xml:space="preserve"> Sigma dann anders setzen.</w:t>
+      </w:r>
+      <w:r>
+        <w:rPr>
+          <w:color w:val="525252" w:themeColor="accent3" w:themeShade="80"/>
+        </w:rPr>
+        <w:t xml:space="preserve"> Bei normal sagt man ja </w:t>
+      </w:r>
+      <m:oMath>
+        <m:r>
+          <w:rPr>
+            <w:rFonts w:ascii="Cambria Math" w:hAnsi="Cambria Math"/>
+            <w:color w:val="525252" w:themeColor="accent3" w:themeShade="80"/>
+          </w:rPr>
+          <m:t>2</m:t>
+        </m:r>
+        <m:r>
+          <w:rPr>
+            <w:rFonts w:ascii="Cambria Math" w:hAnsi="Cambria Math"/>
+            <w:color w:val="525252" w:themeColor="accent3" w:themeShade="80"/>
+            <w:lang w:val="en-US"/>
+          </w:rPr>
+          <m:t>σ</m:t>
+        </m:r>
+      </m:oMath>
+      <w:r>
+        <w:rPr>
+          <w:rFonts w:eastAsiaTheme="minorEastAsia"/>
+          <w:color w:val="525252" w:themeColor="accent3" w:themeShade="80"/>
+        </w:rPr>
+        <w:t xml:space="preserve"> sind ungefähr 95% der We</w:t>
+      </w:r>
+      <w:r>
+        <w:rPr>
+          <w:rFonts w:eastAsiaTheme="minorEastAsia"/>
+          <w:color w:val="525252" w:themeColor="accent3" w:themeShade="80"/>
+        </w:rPr>
+        <w:t>rte, bei anderen Verteilungen halt andere.</w:t>
+      </w:r>
+    </w:p>
+    <w:p>
+      <w:pPr>
+        <w:rPr>
+          <w:color w:val="525252" w:themeColor="accent3" w:themeShade="80"/>
+        </w:rPr>
+      </w:pPr>
+    </w:p>
     <w:p>
       <w:pPr>
         <w:pStyle w:val="berschrift1"/>
@@ -47,12 +1886,9 @@
           <w:lang w:val="en-US" w:eastAsia="en-US"/>
           <w14:ligatures w14:val="standardContextual"/>
         </w:rPr>
-        <w:t>At first glance, with nearly 50,000 observations, a frequentist approach may appear fully sufficient. In a narrow sense, this is true: point estimates will be similar, as the likelihood is strong and largely dominates the posterior. However, frequentist inference stops at a point estimate. Bayesian inference does not. It yields a full posterior distribution, allowing directly interpretable statements such as: with 95% probability, the effect lies within this range. This is substantially more informative and practically useful than a p-value attached to a single estimate.</w:t>
-      </w:r>
-    </w:p>
-    <w:p>
-      <w:pPr>
-        <w:pStyle w:val="StandardWeb"/>
+        <w:t xml:space="preserve">At first glance, with nearly 50,000 observations, a frequentist approach may appear fully sufficient. In a narrow sense, this is true: point estimates will be similar, as the likelihood is strong and largely dominates the posterior. However, frequentist inference stops at a point estimate. Bayesian inference does not. It yields a full posterior distribution, allowing directly </w:t>
+      </w:r>
+      <w:r>
         <w:rPr>
           <w:rFonts w:ascii="Arial" w:eastAsiaTheme="minorHAnsi" w:hAnsi="Arial" w:cstheme="minorBidi"/>
           <w:kern w:val="2"/>
@@ -60,8 +1896,13 @@
           <w:lang w:val="en-US" w:eastAsia="en-US"/>
           <w14:ligatures w14:val="standardContextual"/>
         </w:rPr>
-      </w:pPr>
-      <w:r>
+        <w:lastRenderedPageBreak/>
+        <w:t>interpretable statements such as: with 95% probability, the effect lies within this range. This is substantially more informative and practically useful than a p-value attached to a single estimate.</w:t>
+      </w:r>
+    </w:p>
+    <w:p>
+      <w:pPr>
+        <w:pStyle w:val="StandardWeb"/>
         <w:rPr>
           <w:rFonts w:ascii="Arial" w:eastAsiaTheme="minorHAnsi" w:hAnsi="Arial" w:cstheme="minorBidi"/>
           <w:kern w:val="2"/>
@@ -69,12 +1910,8 @@
           <w:lang w:val="en-US" w:eastAsia="en-US"/>
           <w14:ligatures w14:val="standardContextual"/>
         </w:rPr>
-        <w:t>The distinction becomes critical once the structure of the data is considered. Fifty thousand observations do not imply fifty thousand independent pieces of information. The data are deeply hierarchical: players are nested within teams, actions occur within the same five-minute sections, and information is unevenly distributed across groups. While the referenced paper uses fixed effects with clustered standard errors, this is not equivalent to a hierarchical model. Fixed effects estimate group parameters independently and do not allow for partial pooling. Clustered standard errors only adjust uncertainty; they do not change point estimates and therefore do not correct unstable or extreme group-level effects.</w:t>
-      </w:r>
-    </w:p>
-    <w:p>
-      <w:pPr>
-        <w:pStyle w:val="StandardWeb"/>
+      </w:pPr>
+      <w:r>
         <w:rPr>
           <w:rFonts w:ascii="Arial" w:eastAsiaTheme="minorHAnsi" w:hAnsi="Arial" w:cstheme="minorBidi"/>
           <w:kern w:val="2"/>
@@ -82,8 +1919,12 @@
           <w:lang w:val="en-US" w:eastAsia="en-US"/>
           <w14:ligatures w14:val="standardContextual"/>
         </w:rPr>
-      </w:pPr>
-      <w:r>
+        <w:t>The distinction becomes critical once the structure of the data is considered. Fifty thousand observations do not imply fifty thousand independent pieces of information. The data are deeply hierarchical: players are nested within teams, actions occur within the same five-minute sections, and information is unevenly distributed across groups. While the referenced paper uses fixed effects with clustered standard errors, this is not equivalent to a hierarchical model. Fixed effects estimate group parameters independently and do not allow for partial pooling. Clustered standard errors only adjust uncertainty; they do not change point estimates and therefore do not correct unstable or extreme group-level effects.</w:t>
+      </w:r>
+    </w:p>
+    <w:p>
+      <w:pPr>
+        <w:pStyle w:val="StandardWeb"/>
         <w:rPr>
           <w:rFonts w:ascii="Arial" w:eastAsiaTheme="minorHAnsi" w:hAnsi="Arial" w:cstheme="minorBidi"/>
           <w:kern w:val="2"/>
@@ -91,8 +1932,7 @@
           <w:lang w:val="en-US" w:eastAsia="en-US"/>
           <w14:ligatures w14:val="standardContextual"/>
         </w:rPr>
-        <w:t>Bayesian multilevel models explicitly model this structure. Through partial pooling, estimates are stabilized by borrowing strength across groups, shrinking extreme values</w:t>
-      </w:r>
+      </w:pPr>
       <w:r>
         <w:rPr>
           <w:rFonts w:ascii="Arial" w:eastAsiaTheme="minorHAnsi" w:hAnsi="Arial" w:cstheme="minorBidi"/>
@@ -101,7 +1941,7 @@
           <w:lang w:val="en-US" w:eastAsia="en-US"/>
           <w14:ligatures w14:val="standardContextual"/>
         </w:rPr>
-        <w:t xml:space="preserve">, </w:t>
+        <w:t>Bayesian multilevel models explicitly model this structure. Through partial pooling, estimates are stabilized by borrowing strength across groups, shrinking extreme values</w:t>
       </w:r>
       <w:r>
         <w:rPr>
@@ -111,7 +1951,7 @@
           <w:lang w:val="en-US" w:eastAsia="en-US"/>
           <w14:ligatures w14:val="standardContextual"/>
         </w:rPr>
-        <w:t>especially in sparsely observed groups</w:t>
+        <w:t xml:space="preserve">, </w:t>
       </w:r>
       <w:r>
         <w:rPr>
@@ -121,7 +1961,7 @@
           <w:lang w:val="en-US" w:eastAsia="en-US"/>
           <w14:ligatures w14:val="standardContextual"/>
         </w:rPr>
-        <w:t xml:space="preserve">, </w:t>
+        <w:t>especially in sparsely observed groups</w:t>
       </w:r>
       <w:r>
         <w:rPr>
@@ -131,12 +1971,9 @@
           <w:lang w:val="en-US" w:eastAsia="en-US"/>
           <w14:ligatures w14:val="standardContextual"/>
         </w:rPr>
-        <w:t>and producing uncertainty that reflects both within- and between-group variation. Importantly, this means the estimates themselves change in a principled way, not just their standard errors.</w:t>
-      </w:r>
-    </w:p>
-    <w:p>
-      <w:pPr>
-        <w:pStyle w:val="StandardWeb"/>
+        <w:t xml:space="preserve">, </w:t>
+      </w:r>
+      <w:r>
         <w:rPr>
           <w:rFonts w:ascii="Arial" w:eastAsiaTheme="minorHAnsi" w:hAnsi="Arial" w:cstheme="minorBidi"/>
           <w:kern w:val="2"/>
@@ -144,8 +1981,12 @@
           <w:lang w:val="en-US" w:eastAsia="en-US"/>
           <w14:ligatures w14:val="standardContextual"/>
         </w:rPr>
-      </w:pPr>
-      <w:r>
+        <w:t>and producing uncertainty that reflects both within- and between-group variation. Importantly, this means the estimates themselves change in a principled way, not just their standard errors.</w:t>
+      </w:r>
+    </w:p>
+    <w:p>
+      <w:pPr>
+        <w:pStyle w:val="StandardWeb"/>
         <w:rPr>
           <w:rFonts w:ascii="Arial" w:eastAsiaTheme="minorHAnsi" w:hAnsi="Arial" w:cstheme="minorBidi"/>
           <w:kern w:val="2"/>
@@ -153,8 +1994,7 @@
           <w:lang w:val="en-US" w:eastAsia="en-US"/>
           <w14:ligatures w14:val="standardContextual"/>
         </w:rPr>
-        <w:t>Beyond estimation, Bayesian methods allow direct assessment of generalizability using tools such as LOO cross-validation, enabling systematic comparison of predictive performance across models</w:t>
-      </w:r>
+      </w:pPr>
       <w:r>
         <w:rPr>
           <w:rFonts w:ascii="Arial" w:eastAsiaTheme="minorHAnsi" w:hAnsi="Arial" w:cstheme="minorBidi"/>
@@ -163,7 +2003,7 @@
           <w:lang w:val="en-US" w:eastAsia="en-US"/>
           <w14:ligatures w14:val="standardContextual"/>
         </w:rPr>
-        <w:t xml:space="preserve">, </w:t>
+        <w:t>Beyond estimation, Bayesian methods allow direct assessment of generalizability using tools such as LOO cross-validation, enabling systematic comparison of predictive performance across models</w:t>
       </w:r>
       <w:r>
         <w:rPr>
@@ -173,12 +2013,9 @@
           <w:lang w:val="en-US" w:eastAsia="en-US"/>
           <w14:ligatures w14:val="standardContextual"/>
         </w:rPr>
-        <w:t>something that is not addressed in the frequentist framework used in the paper. Finally, priors and prior predictive checks force explicit modeling assumptions and allow us to assess whether our understanding of the problem is coherent even before observing the data.</w:t>
-      </w:r>
-    </w:p>
-    <w:p>
-      <w:pPr>
-        <w:pStyle w:val="StandardWeb"/>
+        <w:t xml:space="preserve">, </w:t>
+      </w:r>
+      <w:r>
         <w:rPr>
           <w:rFonts w:ascii="Arial" w:eastAsiaTheme="minorHAnsi" w:hAnsi="Arial" w:cstheme="minorBidi"/>
           <w:kern w:val="2"/>
@@ -186,8 +2023,12 @@
           <w:lang w:val="en-US" w:eastAsia="en-US"/>
           <w14:ligatures w14:val="standardContextual"/>
         </w:rPr>
-      </w:pPr>
-      <w:r>
+        <w:t>something that is not addressed in the frequentist framework used in the paper. Finally, priors and prior predictive checks force explicit modeling assumptions and allow us to assess whether our understanding of the problem is coherent even before observing the data.</w:t>
+      </w:r>
+    </w:p>
+    <w:p>
+      <w:pPr>
+        <w:pStyle w:val="StandardWeb"/>
         <w:rPr>
           <w:rFonts w:ascii="Arial" w:eastAsiaTheme="minorHAnsi" w:hAnsi="Arial" w:cstheme="minorBidi"/>
           <w:kern w:val="2"/>
@@ -195,8 +2036,7 @@
           <w:lang w:val="en-US" w:eastAsia="en-US"/>
           <w14:ligatures w14:val="standardContextual"/>
         </w:rPr>
-        <w:t>Bayesian models are computationally more demanding. In return, they provide stabilized estimates, interpretable uncertainty, improved generalization, and greater transparency. With complex, hierarchical data, this is not an unnecessary complication</w:t>
-      </w:r>
+      </w:pPr>
       <w:r>
         <w:rPr>
           <w:rFonts w:ascii="Arial" w:eastAsiaTheme="minorHAnsi" w:hAnsi="Arial" w:cstheme="minorBidi"/>
@@ -205,7 +2045,7 @@
           <w:lang w:val="en-US" w:eastAsia="en-US"/>
           <w14:ligatures w14:val="standardContextual"/>
         </w:rPr>
-        <w:t xml:space="preserve">, </w:t>
+        <w:t>Bayesian models are computationally more demanding. In return, they provide stabilized estimates, interpretable uncertainty, improved generalization, and greater transparency. With complex, hierarchical data, this is not an unnecessary complication</w:t>
       </w:r>
       <w:r>
         <w:rPr>
@@ -215,6 +2055,16 @@
           <w:lang w:val="en-US" w:eastAsia="en-US"/>
           <w14:ligatures w14:val="standardContextual"/>
         </w:rPr>
+        <w:t xml:space="preserve">, </w:t>
+      </w:r>
+      <w:r>
+        <w:rPr>
+          <w:rFonts w:ascii="Arial" w:eastAsiaTheme="minorHAnsi" w:hAnsi="Arial" w:cstheme="minorBidi"/>
+          <w:kern w:val="2"/>
+          <w:sz w:val="22"/>
+          <w:lang w:val="en-US" w:eastAsia="en-US"/>
+          <w14:ligatures w14:val="standardContextual"/>
+        </w:rPr>
         <w:t>it is the approach that matches the structure of the problem.</w:t>
       </w:r>
     </w:p>
@@ -237,8 +2087,9 @@
           <w:lang w:eastAsia="en-US"/>
           <w14:ligatures w14:val="standardContextual"/>
         </w:rPr>
-        <w:t>Dann müssen wir diese di</w:t>
-      </w:r>
+        <w:t xml:space="preserve">Dann müssen wir diese </w:t>
+      </w:r>
+      <w:proofErr w:type="spellStart"/>
       <w:r>
         <w:rPr>
           <w:rFonts w:ascii="Arial" w:eastAsiaTheme="minorHAnsi" w:hAnsi="Arial" w:cstheme="minorBidi"/>
@@ -247,7 +2098,28 @@
           <w:lang w:eastAsia="en-US"/>
           <w14:ligatures w14:val="standardContextual"/>
         </w:rPr>
-        <w:t>nger nutzen</w:t>
+        <w:t>di</w:t>
+      </w:r>
+      <w:r>
+        <w:rPr>
+          <w:rFonts w:ascii="Arial" w:eastAsiaTheme="minorHAnsi" w:hAnsi="Arial" w:cstheme="minorBidi"/>
+          <w:kern w:val="2"/>
+          <w:sz w:val="22"/>
+          <w:lang w:eastAsia="en-US"/>
+          <w14:ligatures w14:val="standardContextual"/>
+        </w:rPr>
+        <w:t>nger</w:t>
+      </w:r>
+      <w:proofErr w:type="spellEnd"/>
+      <w:r>
+        <w:rPr>
+          <w:rFonts w:ascii="Arial" w:eastAsiaTheme="minorHAnsi" w:hAnsi="Arial" w:cstheme="minorBidi"/>
+          <w:kern w:val="2"/>
+          <w:sz w:val="22"/>
+          <w:lang w:eastAsia="en-US"/>
+          <w14:ligatures w14:val="standardContextual"/>
+        </w:rPr>
+        <w:t xml:space="preserve"> nutzen</w:t>
       </w:r>
     </w:p>
     <w:p>
@@ -265,7 +2137,35 @@
         <w:rPr>
           <w:lang w:val="en-US"/>
         </w:rPr>
-        <w:t>Model with partial pooling (hierarcial instead of ficed effects.)</w:t>
+        <w:t>Model with partial pooling (</w:t>
+      </w:r>
+      <w:proofErr w:type="spellStart"/>
+      <w:r>
+        <w:rPr>
+          <w:lang w:val="en-US"/>
+        </w:rPr>
+        <w:t>hierarcial</w:t>
+      </w:r>
+      <w:proofErr w:type="spellEnd"/>
+      <w:r>
+        <w:rPr>
+          <w:lang w:val="en-US"/>
+        </w:rPr>
+        <w:t xml:space="preserve"> instead of </w:t>
+      </w:r>
+      <w:proofErr w:type="spellStart"/>
+      <w:r>
+        <w:rPr>
+          <w:lang w:val="en-US"/>
+        </w:rPr>
+        <w:t>ficed</w:t>
+      </w:r>
+      <w:proofErr w:type="spellEnd"/>
+      <w:r>
+        <w:rPr>
+          <w:lang w:val="en-US"/>
+        </w:rPr>
+        <w:t xml:space="preserve"> effects.)</w:t>
       </w:r>
     </w:p>
     <w:p>
@@ -301,7 +2201,21 @@
         <w:rPr>
           <w:lang w:val="en-US"/>
         </w:rPr>
-        <w:t>Posterior credible interval for “effort” speed coefficient, show its different than 0. Mcmc_areas() plot</w:t>
+        <w:t xml:space="preserve">Posterior credible interval for “effort” speed coefficient, show its different than 0. </w:t>
+      </w:r>
+      <w:proofErr w:type="spellStart"/>
+      <w:r>
+        <w:rPr>
+          <w:lang w:val="en-US"/>
+        </w:rPr>
+        <w:t>Mcmc_areas</w:t>
+      </w:r>
+      <w:proofErr w:type="spellEnd"/>
+      <w:r>
+        <w:rPr>
+          <w:lang w:val="en-US"/>
+        </w:rPr>
+        <w:t>() plot</w:t>
       </w:r>
     </w:p>
     <w:p>
@@ -333,7 +2247,21 @@
         <w:rPr>
           <w:lang w:val="en-US"/>
         </w:rPr>
-        <w:t>How we got the hebrew n</w:t>
+        <w:t xml:space="preserve">How we got the </w:t>
+      </w:r>
+      <w:proofErr w:type="spellStart"/>
+      <w:r>
+        <w:rPr>
+          <w:lang w:val="en-US"/>
+        </w:rPr>
+        <w:t>hebrew</w:t>
+      </w:r>
+      <w:proofErr w:type="spellEnd"/>
+      <w:r>
+        <w:rPr>
+          <w:lang w:val="en-US"/>
+        </w:rPr>
+        <w:t xml:space="preserve"> n</w:t>
       </w:r>
       <w:r>
         <w:rPr>
@@ -370,7 +2298,7 @@
                 <wp:cNvGraphicFramePr/>
                 <a:graphic xmlns:a="http://schemas.openxmlformats.org/drawingml/2006/main">
                   <a:graphicData uri="http://schemas.microsoft.com/office/word/2010/wordprocessingInk">
-                    <w14:contentPart bwMode="auto" r:id="rId5">
+                    <w14:contentPart bwMode="auto" r:id="rId6">
                       <w14:nvContentPartPr>
                         <w14:cNvContentPartPr/>
                       </w14:nvContentPartPr>
@@ -406,13 +2334,13 @@
                 <o:lock v:ext="edit" aspectratio="t"/>
               </v:shapetype>
               <v:shape id="Freihand 4" o:spid="_x0000_s1026" type="#_x0000_t75" style="position:absolute;margin-left:295.6pt;margin-top:378.15pt;width:23.45pt;height:22.75pt;z-index:251659264;visibility:visible;mso-wrap-style:square;mso-wrap-distance-left:9pt;mso-wrap-distance-top:0;mso-wrap-distance-right:9pt;mso-wrap-distance-bottom:0;mso-position-horizontal:absolute;mso-position-horizontal-relative:text;mso-position-vertical:absolute;mso-position-vertical-relative:text" o:gfxdata="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">
-                <v:imagedata r:id="rId6" o:title=""/>
+                <v:imagedata r:id="rId7" o:title=""/>
               </v:shape>
             </w:pict>
           </mc:Fallback>
         </mc:AlternateContent>
       </w:r>
-      <w:hyperlink r:id="rId7" w:anchor="Regular_season_table" w:history="1">
+      <w:hyperlink r:id="rId8" w:anchor="Regular_season_table" w:history="1">
         <w:r>
           <w:rPr>
             <w:rStyle w:val="Hyperlink"/>
@@ -451,12 +2379,14 @@
         </w:rPr>
         <w:t>“</w:t>
       </w:r>
+      <w:proofErr w:type="spellStart"/>
       <w:r>
         <w:rPr>
           <w:lang w:val="en-US"/>
         </w:rPr>
         <w:t>team_rank</w:t>
       </w:r>
+      <w:proofErr w:type="spellEnd"/>
       <w:r>
         <w:rPr>
           <w:lang w:val="en-US"/>
@@ -523,7 +2453,7 @@
                     </pic:cNvPicPr>
                   </pic:nvPicPr>
                   <pic:blipFill>
-                    <a:blip r:embed="rId8">
+                    <a:blip r:embed="rId9">
                       <a:extLst>
                         <a:ext uri="{28A0092B-C50C-407E-A947-70E740481C1C}">
                           <a14:useLocalDpi xmlns:a14="http://schemas.microsoft.com/office/drawing/2010/main" val="0"/>
@@ -577,7 +2507,7 @@
                     </pic:cNvPicPr>
                   </pic:nvPicPr>
                   <pic:blipFill>
-                    <a:blip r:embed="rId9">
+                    <a:blip r:embed="rId10">
                       <a:extLst>
                         <a:ext uri="{28A0092B-C50C-407E-A947-70E740481C1C}">
                           <a14:useLocalDpi xmlns:a14="http://schemas.microsoft.com/office/drawing/2010/main" val="0"/>
@@ -992,9 +2922,27 @@
           <w:lang w:val="en-US"/>
         </w:rPr>
       </w:pPr>
-      <w:r>
-        <w:t>Summarize results and conclude</w:t>
-      </w:r>
+      <w:proofErr w:type="spellStart"/>
+      <w:r>
+        <w:t>Summarize</w:t>
+      </w:r>
+      <w:proofErr w:type="spellEnd"/>
+      <w:r>
+        <w:t xml:space="preserve"> </w:t>
+      </w:r>
+      <w:proofErr w:type="spellStart"/>
+      <w:r>
+        <w:t>results</w:t>
+      </w:r>
+      <w:proofErr w:type="spellEnd"/>
+      <w:r>
+        <w:t xml:space="preserve"> and </w:t>
+      </w:r>
+      <w:proofErr w:type="spellStart"/>
+      <w:r>
+        <w:t>conclude</w:t>
+      </w:r>
+      <w:proofErr w:type="spellEnd"/>
     </w:p>
     <w:sectPr>
       <w:pgSz w:w="11906" w:h="16838"/>
@@ -1849,6 +3797,7 @@
   <w:style w:type="character" w:default="1" w:styleId="Absatz-Standardschriftart">
     <w:name w:val="Default Paragraph Font"/>
     <w:uiPriority w:val="1"/>
+    <w:semiHidden/>
     <w:unhideWhenUsed/>
   </w:style>
   <w:style w:type="table" w:default="1" w:styleId="NormaleTabelle">
@@ -2192,6 +4141,16 @@
       <w14:ligatures w14:val="none"/>
     </w:rPr>
   </w:style>
+  <w:style w:type="character" w:styleId="Platzhaltertext">
+    <w:name w:val="Placeholder Text"/>
+    <w:basedOn w:val="Absatz-Standardschriftart"/>
+    <w:uiPriority w:val="99"/>
+    <w:semiHidden/>
+    <w:rsid w:val="00944AD0"/>
+    <w:rPr>
+      <w:color w:val="666666"/>
+    </w:rPr>
+  </w:style>
 </w:styles>
 </file>
 

</xml_diff>

<commit_message>
Weakly Priors Update bis column 4
Priors durchgegangen weakly gesetzt und im Word dokumentiert
</commit_message>
<xml_diff>
--- a/Report Word Version.docx
+++ b/Report Word Version.docx
@@ -7,6 +7,3960 @@
         <w:pStyle w:val="berschrift1"/>
       </w:pPr>
       <w:r>
+        <w:t xml:space="preserve">Prior </w:t>
+      </w:r>
+      <w:proofErr w:type="spellStart"/>
+      <w:r>
+        <w:t>reasoning</w:t>
+      </w:r>
+      <w:proofErr w:type="spellEnd"/>
+    </w:p>
+    <w:p>
+      <w:pPr>
+        <w:rPr>
+          <w:u w:val="single"/>
+        </w:rPr>
+      </w:pPr>
+    </w:p>
+    <w:p>
+      <w:pPr>
+        <w:rPr>
+          <w:u w:val="single"/>
+          <w:lang w:val="en-US"/>
+        </w:rPr>
+      </w:pPr>
+      <w:r>
+        <w:rPr>
+          <w:u w:val="single"/>
+          <w:lang w:val="en-US"/>
+        </w:rPr>
+        <w:t>Column 1</w:t>
+      </w:r>
+    </w:p>
+    <w:p>
+      <w:pPr>
+        <w:rPr>
+          <w:lang w:val="en-US"/>
+        </w:rPr>
+      </w:pPr>
+      <w:r>
+        <w:rPr>
+          <w:lang w:val="en-US"/>
+        </w:rPr>
+        <w:t xml:space="preserve"># default for all coefficients </w:t>
+      </w:r>
+      <w:r>
+        <w:rPr>
+          <w:lang w:val="en-US"/>
+        </w:rPr>
+        <w:t>(no change)</w:t>
+      </w:r>
+    </w:p>
+    <w:p>
+      <w:pPr>
+        <w:rPr>
+          <w:i/>
+          <w:iCs/>
+          <w:lang w:val="en-US"/>
+        </w:rPr>
+      </w:pPr>
+      <w:proofErr w:type="spellStart"/>
+      <w:r>
+        <w:rPr>
+          <w:i/>
+          <w:iCs/>
+          <w:lang w:val="en-US"/>
+        </w:rPr>
+        <w:t>set_</w:t>
+      </w:r>
+      <w:proofErr w:type="gramStart"/>
+      <w:r>
+        <w:rPr>
+          <w:i/>
+          <w:iCs/>
+          <w:lang w:val="en-US"/>
+        </w:rPr>
+        <w:t>prior</w:t>
+      </w:r>
+      <w:proofErr w:type="spellEnd"/>
+      <w:r>
+        <w:rPr>
+          <w:i/>
+          <w:iCs/>
+          <w:lang w:val="en-US"/>
+        </w:rPr>
+        <w:t>(</w:t>
+      </w:r>
+      <w:proofErr w:type="gramEnd"/>
+      <w:r>
+        <w:rPr>
+          <w:i/>
+          <w:iCs/>
+          <w:lang w:val="en-US"/>
+        </w:rPr>
+        <w:t>"</w:t>
+      </w:r>
+      <w:proofErr w:type="gramStart"/>
+      <w:r>
+        <w:rPr>
+          <w:i/>
+          <w:iCs/>
+          <w:lang w:val="en-US"/>
+        </w:rPr>
+        <w:t>normal(</w:t>
+      </w:r>
+      <w:proofErr w:type="gramEnd"/>
+      <w:r>
+        <w:rPr>
+          <w:i/>
+          <w:iCs/>
+          <w:lang w:val="en-US"/>
+        </w:rPr>
+        <w:t>0, 0.</w:t>
+      </w:r>
+      <w:r>
+        <w:rPr>
+          <w:i/>
+          <w:iCs/>
+          <w:lang w:val="en-US"/>
+        </w:rPr>
+        <w:t>4</w:t>
+      </w:r>
+      <w:r>
+        <w:rPr>
+          <w:i/>
+          <w:iCs/>
+          <w:lang w:val="en-US"/>
+        </w:rPr>
+        <w:t>)</w:t>
+      </w:r>
+      <w:proofErr w:type="gramStart"/>
+      <w:r>
+        <w:rPr>
+          <w:i/>
+          <w:iCs/>
+          <w:lang w:val="en-US"/>
+        </w:rPr>
+        <w:t xml:space="preserve">",   </w:t>
+      </w:r>
+      <w:proofErr w:type="gramEnd"/>
+      <w:r>
+        <w:rPr>
+          <w:i/>
+          <w:iCs/>
+          <w:lang w:val="en-US"/>
+        </w:rPr>
+        <w:t>class = "b")</w:t>
+      </w:r>
+    </w:p>
+    <w:p>
+      <w:pPr>
+        <w:rPr>
+          <w:lang w:val="en-US"/>
+        </w:rPr>
+      </w:pPr>
+      <w:r>
+        <w:rPr>
+          <w:lang w:val="en-US"/>
+        </w:rPr>
+        <w:t>We are saying that each dummy changes the probability to score</w:t>
+      </w:r>
+      <w:r>
+        <w:rPr>
+          <w:lang w:val="en-US"/>
+        </w:rPr>
+        <w:t xml:space="preserve"> a goal</w:t>
+      </w:r>
+      <w:r>
+        <w:rPr>
+          <w:lang w:val="en-US"/>
+        </w:rPr>
+        <w:t xml:space="preserve"> to </w:t>
+      </w:r>
+      <w:r>
+        <w:rPr>
+          <w:lang w:val="en-US"/>
+        </w:rPr>
+        <w:t xml:space="preserve">be </w:t>
+      </w:r>
+      <w:r>
+        <w:rPr>
+          <w:lang w:val="en-US"/>
+        </w:rPr>
+        <w:t>between 0.</w:t>
+      </w:r>
+      <w:r>
+        <w:rPr>
+          <w:lang w:val="en-US"/>
+        </w:rPr>
+        <w:t>45</w:t>
+      </w:r>
+      <w:r>
+        <w:rPr>
+          <w:lang w:val="en-US"/>
+        </w:rPr>
+        <w:t xml:space="preserve">% </w:t>
+      </w:r>
+      <w:r>
+        <w:rPr>
+          <w:lang w:val="en-US"/>
+        </w:rPr>
+        <w:t>and</w:t>
+      </w:r>
+      <w:r>
+        <w:rPr>
+          <w:lang w:val="en-US"/>
+        </w:rPr>
+        <w:t xml:space="preserve"> </w:t>
+      </w:r>
+      <w:r>
+        <w:rPr>
+          <w:lang w:val="en-US"/>
+        </w:rPr>
+        <w:t>2.18</w:t>
+      </w:r>
+      <w:r>
+        <w:rPr>
+          <w:lang w:val="en-US"/>
+        </w:rPr>
+        <w:t>%.</w:t>
+      </w:r>
+    </w:p>
+    <w:p>
+      <w:pPr>
+        <w:rPr>
+          <w:lang w:val="en-US"/>
+        </w:rPr>
+      </w:pPr>
+      <w:r>
+        <w:rPr>
+          <w:lang w:val="en-US"/>
+        </w:rPr>
+        <w:t xml:space="preserve"># Speed </w:t>
+      </w:r>
+      <w:r>
+        <w:rPr>
+          <w:color w:val="C00000"/>
+          <w:lang w:val="en-US"/>
+        </w:rPr>
+        <w:t>(reduced effect to adjust for it having 12 units)</w:t>
+      </w:r>
+    </w:p>
+    <w:p>
+      <w:pPr>
+        <w:rPr>
+          <w:i/>
+          <w:iCs/>
+          <w:lang w:val="en-US"/>
+        </w:rPr>
+      </w:pPr>
+      <w:proofErr w:type="spellStart"/>
+      <w:r>
+        <w:rPr>
+          <w:i/>
+          <w:iCs/>
+          <w:lang w:val="en-US"/>
+        </w:rPr>
+        <w:t>set_</w:t>
+      </w:r>
+      <w:proofErr w:type="gramStart"/>
+      <w:r>
+        <w:rPr>
+          <w:i/>
+          <w:iCs/>
+          <w:lang w:val="en-US"/>
+        </w:rPr>
+        <w:t>prior</w:t>
+      </w:r>
+      <w:proofErr w:type="spellEnd"/>
+      <w:r>
+        <w:rPr>
+          <w:i/>
+          <w:iCs/>
+          <w:lang w:val="en-US"/>
+        </w:rPr>
+        <w:t>(</w:t>
+      </w:r>
+      <w:proofErr w:type="gramEnd"/>
+      <w:r>
+        <w:rPr>
+          <w:i/>
+          <w:iCs/>
+          <w:lang w:val="en-US"/>
+        </w:rPr>
+        <w:t>"</w:t>
+      </w:r>
+      <w:proofErr w:type="gramStart"/>
+      <w:r>
+        <w:rPr>
+          <w:i/>
+          <w:iCs/>
+          <w:lang w:val="en-US"/>
+        </w:rPr>
+        <w:t>normal(</w:t>
+      </w:r>
+      <w:proofErr w:type="gramEnd"/>
+      <w:r>
+        <w:rPr>
+          <w:i/>
+          <w:iCs/>
+          <w:lang w:val="en-US"/>
+        </w:rPr>
+        <w:t xml:space="preserve">0, 0.08)", class = "b", </w:t>
+      </w:r>
+      <w:proofErr w:type="spellStart"/>
+      <w:r>
+        <w:rPr>
+          <w:i/>
+          <w:iCs/>
+          <w:lang w:val="en-US"/>
+        </w:rPr>
+        <w:t>coef</w:t>
+      </w:r>
+      <w:proofErr w:type="spellEnd"/>
+      <w:r>
+        <w:rPr>
+          <w:i/>
+          <w:iCs/>
+          <w:lang w:val="en-US"/>
+        </w:rPr>
+        <w:t xml:space="preserve"> = "</w:t>
+      </w:r>
+      <w:proofErr w:type="spellStart"/>
+      <w:r>
+        <w:rPr>
+          <w:i/>
+          <w:iCs/>
+          <w:lang w:val="en-US"/>
+        </w:rPr>
+        <w:t>plaavspeed_c</w:t>
+      </w:r>
+      <w:proofErr w:type="spellEnd"/>
+      <w:r>
+        <w:rPr>
+          <w:i/>
+          <w:iCs/>
+          <w:lang w:val="en-US"/>
+        </w:rPr>
+        <w:t>")</w:t>
+      </w:r>
+    </w:p>
+    <w:p>
+      <w:pPr>
+        <w:rPr>
+          <w:lang w:val="en-US"/>
+        </w:rPr>
+      </w:pPr>
+      <w:r>
+        <w:rPr>
+          <w:lang w:val="en-US"/>
+        </w:rPr>
+        <w:t xml:space="preserve">We are saying that running at top speed 12km/h changes the probability to score compared to 0km/h </w:t>
+      </w:r>
+      <w:r>
+        <w:rPr>
+          <w:lang w:val="en-US"/>
+        </w:rPr>
+        <w:t xml:space="preserve">to be </w:t>
+      </w:r>
+      <w:r>
+        <w:rPr>
+          <w:lang w:val="en-US"/>
+        </w:rPr>
+        <w:t>between 0.1% to 6.4%.</w:t>
+      </w:r>
+    </w:p>
+    <w:p>
+      <w:pPr>
+        <w:rPr>
+          <w:lang w:val="en-US"/>
+        </w:rPr>
+      </w:pPr>
+    </w:p>
+    <w:p>
+      <w:pPr>
+        <w:jc w:val="center"/>
+        <w:rPr>
+          <w:lang w:val="en-US"/>
+        </w:rPr>
+      </w:pPr>
+      <w:r>
+        <w:rPr>
+          <w:noProof/>
+          <w:lang w:val="en-US"/>
+        </w:rPr>
+        <w:drawing>
+          <wp:inline distT="0" distB="0" distL="0" distR="0" wp14:anchorId="70214581" wp14:editId="13382442">
+            <wp:extent cx="4595263" cy="2839216"/>
+            <wp:effectExtent l="0" t="0" r="0" b="0"/>
+            <wp:docPr id="264032073" name="Grafik 5"/>
+            <wp:cNvGraphicFramePr>
+              <a:graphicFrameLocks xmlns:a="http://schemas.openxmlformats.org/drawingml/2006/main" noChangeAspect="1"/>
+            </wp:cNvGraphicFramePr>
+            <a:graphic xmlns:a="http://schemas.openxmlformats.org/drawingml/2006/main">
+              <a:graphicData uri="http://schemas.openxmlformats.org/drawingml/2006/picture">
+                <pic:pic xmlns:pic="http://schemas.openxmlformats.org/drawingml/2006/picture">
+                  <pic:nvPicPr>
+                    <pic:cNvPr id="0" name="Picture 5"/>
+                    <pic:cNvPicPr>
+                      <a:picLocks noChangeAspect="1" noChangeArrowheads="1"/>
+                    </pic:cNvPicPr>
+                  </pic:nvPicPr>
+                  <pic:blipFill>
+                    <a:blip r:embed="rId5" cstate="print">
+                      <a:extLst>
+                        <a:ext uri="{28A0092B-C50C-407E-A947-70E740481C1C}">
+                          <a14:useLocalDpi xmlns:a14="http://schemas.microsoft.com/office/drawing/2010/main" val="0"/>
+                        </a:ext>
+                      </a:extLst>
+                    </a:blip>
+                    <a:srcRect/>
+                    <a:stretch>
+                      <a:fillRect/>
+                    </a:stretch>
+                  </pic:blipFill>
+                  <pic:spPr bwMode="auto">
+                    <a:xfrm>
+                      <a:off x="0" y="0"/>
+                      <a:ext cx="4651527" cy="2873979"/>
+                    </a:xfrm>
+                    <a:prstGeom prst="rect">
+                      <a:avLst/>
+                    </a:prstGeom>
+                    <a:noFill/>
+                  </pic:spPr>
+                </pic:pic>
+              </a:graphicData>
+            </a:graphic>
+          </wp:inline>
+        </w:drawing>
+      </w:r>
+    </w:p>
+    <w:p>
+      <w:pPr>
+        <w:rPr>
+          <w:lang w:val="en-US"/>
+        </w:rPr>
+      </w:pPr>
+      <w:r>
+        <w:rPr>
+          <w:lang w:val="en-US"/>
+        </w:rPr>
+        <w:t xml:space="preserve">Prior only </w:t>
+      </w:r>
+      <w:proofErr w:type="spellStart"/>
+      <w:r>
+        <w:rPr>
+          <w:lang w:val="en-US"/>
+        </w:rPr>
+        <w:t>pp_check</w:t>
+      </w:r>
+      <w:proofErr w:type="spellEnd"/>
+      <w:r>
+        <w:rPr>
+          <w:lang w:val="en-US"/>
+        </w:rPr>
+        <w:t xml:space="preserve"> von column 1. </w:t>
+      </w:r>
+      <w:r>
+        <w:rPr>
+          <w:lang w:val="en-US"/>
+        </w:rPr>
+        <w:t xml:space="preserve">Looks good, some lines predict less goals, some predict more </w:t>
+      </w:r>
+      <w:r>
+        <w:rPr>
+          <w:lang w:val="en-US"/>
+        </w:rPr>
+        <w:t xml:space="preserve">goals. </w:t>
+      </w:r>
+      <w:r>
+        <w:rPr>
+          <w:lang w:val="en-US"/>
+        </w:rPr>
+        <w:t xml:space="preserve">The black line is in the middle of our </w:t>
+      </w:r>
+      <w:proofErr w:type="gramStart"/>
+      <w:r>
+        <w:rPr>
+          <w:lang w:val="en-US"/>
+        </w:rPr>
+        <w:t>priors</w:t>
+      </w:r>
+      <w:proofErr w:type="gramEnd"/>
+      <w:r>
+        <w:rPr>
+          <w:lang w:val="en-US"/>
+        </w:rPr>
+        <w:t xml:space="preserve">, so know general trend of it being above or below black. </w:t>
+      </w:r>
+    </w:p>
+    <w:p>
+      <w:pPr>
+        <w:rPr>
+          <w:lang w:val="en-US"/>
+        </w:rPr>
+      </w:pPr>
+    </w:p>
+    <w:p>
+      <w:pPr>
+        <w:rPr>
+          <w:u w:val="single"/>
+          <w:lang w:val="en-US"/>
+        </w:rPr>
+      </w:pPr>
+      <w:r>
+        <w:rPr>
+          <w:u w:val="single"/>
+          <w:lang w:val="en-US"/>
+        </w:rPr>
+        <w:t xml:space="preserve">Column </w:t>
+      </w:r>
+      <w:r>
+        <w:rPr>
+          <w:u w:val="single"/>
+          <w:lang w:val="en-US"/>
+        </w:rPr>
+        <w:t>2</w:t>
+      </w:r>
+    </w:p>
+    <w:p>
+      <w:pPr>
+        <w:rPr>
+          <w:lang w:val="en-US"/>
+        </w:rPr>
+      </w:pPr>
+      <w:r>
+        <w:rPr>
+          <w:lang w:val="en-US"/>
+        </w:rPr>
+        <w:t>Alt:</w:t>
+      </w:r>
+    </w:p>
+    <w:p>
+      <w:pPr>
+        <w:rPr>
+          <w:lang w:val="en-US"/>
+        </w:rPr>
+      </w:pPr>
+      <w:r>
+        <w:rPr>
+          <w:noProof/>
+          <w:lang w:val="en-US"/>
+        </w:rPr>
+        <w:lastRenderedPageBreak/>
+        <w:drawing>
+          <wp:inline distT="0" distB="0" distL="0" distR="0" wp14:anchorId="4D21A54A" wp14:editId="1838D68A">
+            <wp:extent cx="4278607" cy="2643568"/>
+            <wp:effectExtent l="0" t="0" r="8255" b="4445"/>
+            <wp:docPr id="878801665" name="Grafik 6"/>
+            <wp:cNvGraphicFramePr>
+              <a:graphicFrameLocks xmlns:a="http://schemas.openxmlformats.org/drawingml/2006/main" noChangeAspect="1"/>
+            </wp:cNvGraphicFramePr>
+            <a:graphic xmlns:a="http://schemas.openxmlformats.org/drawingml/2006/main">
+              <a:graphicData uri="http://schemas.openxmlformats.org/drawingml/2006/picture">
+                <pic:pic xmlns:pic="http://schemas.openxmlformats.org/drawingml/2006/picture">
+                  <pic:nvPicPr>
+                    <pic:cNvPr id="0" name="Picture 6"/>
+                    <pic:cNvPicPr>
+                      <a:picLocks noChangeAspect="1" noChangeArrowheads="1"/>
+                    </pic:cNvPicPr>
+                  </pic:nvPicPr>
+                  <pic:blipFill>
+                    <a:blip r:embed="rId6" cstate="print">
+                      <a:extLst>
+                        <a:ext uri="{28A0092B-C50C-407E-A947-70E740481C1C}">
+                          <a14:useLocalDpi xmlns:a14="http://schemas.microsoft.com/office/drawing/2010/main" val="0"/>
+                        </a:ext>
+                      </a:extLst>
+                    </a:blip>
+                    <a:srcRect/>
+                    <a:stretch>
+                      <a:fillRect/>
+                    </a:stretch>
+                  </pic:blipFill>
+                  <pic:spPr bwMode="auto">
+                    <a:xfrm>
+                      <a:off x="0" y="0"/>
+                      <a:ext cx="4315977" cy="2666658"/>
+                    </a:xfrm>
+                    <a:prstGeom prst="rect">
+                      <a:avLst/>
+                    </a:prstGeom>
+                    <a:noFill/>
+                  </pic:spPr>
+                </pic:pic>
+              </a:graphicData>
+            </a:graphic>
+          </wp:inline>
+        </w:drawing>
+      </w:r>
+    </w:p>
+    <w:p>
+      <w:r>
+        <w:t>Irgendwas stimmt hier nicht. E</w:t>
+      </w:r>
+      <w:r>
+        <w:t>s wird viel zu oft Goal geschätzt und zu selten 0.</w:t>
+      </w:r>
+      <w:r>
+        <w:t xml:space="preserve"> </w:t>
+      </w:r>
+      <w:r>
+        <w:t>Sieht für mic</w:t>
+      </w:r>
+      <w:r>
+        <w:t>h</w:t>
+      </w:r>
+      <w:r>
+        <w:t xml:space="preserve"> aus wie 50/50</w:t>
+      </w:r>
+      <w:r>
+        <w:t xml:space="preserve"> Chance d</w:t>
+      </w:r>
+      <w:r>
+        <w:t xml:space="preserve">iese </w:t>
+      </w:r>
+      <w:proofErr w:type="spellStart"/>
+      <w:r>
+        <w:t>priors</w:t>
+      </w:r>
+      <w:proofErr w:type="spellEnd"/>
+      <w:r>
+        <w:t xml:space="preserve"> sind</w:t>
+      </w:r>
+      <w:r>
+        <w:t xml:space="preserve"> </w:t>
+      </w:r>
+      <w:r>
+        <w:t xml:space="preserve">zu </w:t>
+      </w:r>
+      <w:proofErr w:type="spellStart"/>
+      <w:r>
+        <w:t>w</w:t>
+      </w:r>
+      <w:r>
+        <w:t>ide</w:t>
+      </w:r>
+      <w:proofErr w:type="spellEnd"/>
+      <w:r>
+        <w:t>.</w:t>
+      </w:r>
+    </w:p>
+    <w:p/>
+    <w:p>
+      <w:pPr>
+        <w:rPr>
+          <w:lang w:val="en-US"/>
+        </w:rPr>
+      </w:pPr>
+      <w:r>
+        <w:rPr>
+          <w:lang w:val="en-US"/>
+        </w:rPr>
+        <w:t xml:space="preserve"># </w:t>
+      </w:r>
+      <w:proofErr w:type="spellStart"/>
+      <w:r>
+        <w:rPr>
+          <w:lang w:val="en-US"/>
+        </w:rPr>
+        <w:t>dhomegame</w:t>
+      </w:r>
+      <w:proofErr w:type="spellEnd"/>
+      <w:r>
+        <w:rPr>
+          <w:lang w:val="en-US"/>
+        </w:rPr>
+        <w:t xml:space="preserve"> is binary </w:t>
+      </w:r>
+      <w:r>
+        <w:rPr>
+          <w:lang w:val="en-US"/>
+        </w:rPr>
+        <w:t xml:space="preserve">for if it is a </w:t>
+      </w:r>
+      <w:proofErr w:type="spellStart"/>
+      <w:r>
+        <w:rPr>
+          <w:lang w:val="en-US"/>
+        </w:rPr>
+        <w:t>homegame</w:t>
+      </w:r>
+      <w:proofErr w:type="spellEnd"/>
+    </w:p>
+    <w:p>
+      <w:pPr>
+        <w:rPr>
+          <w:i/>
+          <w:iCs/>
+          <w:lang w:val="en-US"/>
+        </w:rPr>
+      </w:pPr>
+      <w:proofErr w:type="spellStart"/>
+      <w:r>
+        <w:rPr>
+          <w:i/>
+          <w:iCs/>
+          <w:lang w:val="en-US"/>
+        </w:rPr>
+        <w:t>set_</w:t>
+      </w:r>
+      <w:proofErr w:type="gramStart"/>
+      <w:r>
+        <w:rPr>
+          <w:i/>
+          <w:iCs/>
+          <w:lang w:val="en-US"/>
+        </w:rPr>
+        <w:t>prior</w:t>
+      </w:r>
+      <w:proofErr w:type="spellEnd"/>
+      <w:r>
+        <w:rPr>
+          <w:i/>
+          <w:iCs/>
+          <w:lang w:val="en-US"/>
+        </w:rPr>
+        <w:t>(</w:t>
+      </w:r>
+      <w:proofErr w:type="gramEnd"/>
+      <w:r>
+        <w:rPr>
+          <w:i/>
+          <w:iCs/>
+          <w:lang w:val="en-US"/>
+        </w:rPr>
+        <w:t>"</w:t>
+      </w:r>
+      <w:proofErr w:type="gramStart"/>
+      <w:r>
+        <w:rPr>
+          <w:i/>
+          <w:iCs/>
+          <w:lang w:val="en-US"/>
+        </w:rPr>
+        <w:t>normal(</w:t>
+      </w:r>
+      <w:proofErr w:type="gramEnd"/>
+      <w:r>
+        <w:rPr>
+          <w:i/>
+          <w:iCs/>
+          <w:lang w:val="en-US"/>
+        </w:rPr>
+        <w:t xml:space="preserve">0, 0.4)", class = "b", </w:t>
+      </w:r>
+      <w:proofErr w:type="spellStart"/>
+      <w:r>
+        <w:rPr>
+          <w:i/>
+          <w:iCs/>
+          <w:lang w:val="en-US"/>
+        </w:rPr>
+        <w:t>coef</w:t>
+      </w:r>
+      <w:proofErr w:type="spellEnd"/>
+      <w:r>
+        <w:rPr>
+          <w:i/>
+          <w:iCs/>
+          <w:lang w:val="en-US"/>
+        </w:rPr>
+        <w:t xml:space="preserve"> = "</w:t>
+      </w:r>
+      <w:proofErr w:type="spellStart"/>
+      <w:r>
+        <w:rPr>
+          <w:i/>
+          <w:iCs/>
+          <w:lang w:val="en-US"/>
+        </w:rPr>
+        <w:t>dhomegame</w:t>
+      </w:r>
+      <w:proofErr w:type="spellEnd"/>
+      <w:r>
+        <w:rPr>
+          <w:i/>
+          <w:iCs/>
+          <w:lang w:val="en-US"/>
+        </w:rPr>
+        <w:t>")</w:t>
+      </w:r>
+    </w:p>
+    <w:p>
+      <w:pPr>
+        <w:rPr>
+          <w:lang w:val="en-US"/>
+        </w:rPr>
+      </w:pPr>
+      <w:r>
+        <w:rPr>
+          <w:lang w:val="en-US"/>
+        </w:rPr>
+        <w:t xml:space="preserve">We are saying that </w:t>
+      </w:r>
+      <w:r>
+        <w:rPr>
+          <w:lang w:val="en-US"/>
+        </w:rPr>
+        <w:t>playing at home</w:t>
+      </w:r>
+      <w:r>
+        <w:rPr>
+          <w:lang w:val="en-US"/>
+        </w:rPr>
+        <w:t xml:space="preserve"> changes the probability to score to between (</w:t>
+      </w:r>
+      <w:proofErr w:type="gramStart"/>
+      <w:r>
+        <w:rPr>
+          <w:lang w:val="en-US"/>
+        </w:rPr>
+        <w:t>0.0045 ;</w:t>
+      </w:r>
+      <w:proofErr w:type="gramEnd"/>
+      <w:r>
+        <w:rPr>
+          <w:lang w:val="en-US"/>
+        </w:rPr>
+        <w:t xml:space="preserve"> 0.0218) so 0.45% to 2.18%.</w:t>
+      </w:r>
+    </w:p>
+    <w:p>
+      <w:pPr>
+        <w:rPr>
+          <w:lang w:val="en-US"/>
+        </w:rPr>
+      </w:pPr>
+    </w:p>
+    <w:p>
+      <w:pPr>
+        <w:rPr>
+          <w:lang w:val="en-US"/>
+        </w:rPr>
+      </w:pPr>
+      <w:r>
+        <w:rPr>
+          <w:lang w:val="en-US"/>
+        </w:rPr>
+        <w:t xml:space="preserve"># </w:t>
+      </w:r>
+      <w:proofErr w:type="spellStart"/>
+      <w:r>
+        <w:rPr>
+          <w:lang w:val="en-US"/>
+        </w:rPr>
+        <w:t>rankgap</w:t>
+      </w:r>
+      <w:proofErr w:type="spellEnd"/>
+      <w:r>
+        <w:rPr>
+          <w:lang w:val="en-US"/>
+        </w:rPr>
+        <w:t xml:space="preserve">, goes from -13 to 13 </w:t>
+      </w:r>
+      <w:r>
+        <w:rPr>
+          <w:color w:val="C00000"/>
+          <w:lang w:val="en-US"/>
+        </w:rPr>
+        <w:t xml:space="preserve">(reduced effect to adjust for it having </w:t>
+      </w:r>
+      <w:r>
+        <w:rPr>
+          <w:color w:val="C00000"/>
+          <w:lang w:val="en-US"/>
+        </w:rPr>
+        <w:t>26</w:t>
+      </w:r>
+      <w:r>
+        <w:rPr>
+          <w:color w:val="C00000"/>
+          <w:lang w:val="en-US"/>
+        </w:rPr>
+        <w:t xml:space="preserve"> units)</w:t>
+      </w:r>
+    </w:p>
+    <w:p>
+      <w:pPr>
+        <w:rPr>
+          <w:i/>
+          <w:iCs/>
+          <w:lang w:val="en-US"/>
+        </w:rPr>
+      </w:pPr>
+      <w:proofErr w:type="spellStart"/>
+      <w:r>
+        <w:rPr>
+          <w:i/>
+          <w:iCs/>
+          <w:lang w:val="en-US"/>
+        </w:rPr>
+        <w:t>set_</w:t>
+      </w:r>
+      <w:proofErr w:type="gramStart"/>
+      <w:r>
+        <w:rPr>
+          <w:i/>
+          <w:iCs/>
+          <w:lang w:val="en-US"/>
+        </w:rPr>
+        <w:t>prior</w:t>
+      </w:r>
+      <w:proofErr w:type="spellEnd"/>
+      <w:r>
+        <w:rPr>
+          <w:i/>
+          <w:iCs/>
+          <w:lang w:val="en-US"/>
+        </w:rPr>
+        <w:t>(</w:t>
+      </w:r>
+      <w:proofErr w:type="gramEnd"/>
+      <w:r>
+        <w:rPr>
+          <w:i/>
+          <w:iCs/>
+          <w:lang w:val="en-US"/>
+        </w:rPr>
+        <w:t>"</w:t>
+      </w:r>
+      <w:proofErr w:type="gramStart"/>
+      <w:r>
+        <w:rPr>
+          <w:i/>
+          <w:iCs/>
+          <w:lang w:val="en-US"/>
+        </w:rPr>
+        <w:t>normal(</w:t>
+      </w:r>
+      <w:proofErr w:type="gramEnd"/>
+      <w:r>
+        <w:rPr>
+          <w:i/>
+          <w:iCs/>
+          <w:lang w:val="en-US"/>
+        </w:rPr>
+        <w:t xml:space="preserve">0, 0.045)", class = "b", </w:t>
+      </w:r>
+      <w:proofErr w:type="spellStart"/>
+      <w:r>
+        <w:rPr>
+          <w:i/>
+          <w:iCs/>
+          <w:lang w:val="en-US"/>
+        </w:rPr>
+        <w:t>coef</w:t>
+      </w:r>
+      <w:proofErr w:type="spellEnd"/>
+      <w:r>
+        <w:rPr>
+          <w:i/>
+          <w:iCs/>
+          <w:lang w:val="en-US"/>
+        </w:rPr>
+        <w:t xml:space="preserve"> = "</w:t>
+      </w:r>
+      <w:proofErr w:type="spellStart"/>
+      <w:r>
+        <w:rPr>
+          <w:i/>
+          <w:iCs/>
+          <w:lang w:val="en-US"/>
+        </w:rPr>
+        <w:t>rank_gap_c</w:t>
+      </w:r>
+      <w:proofErr w:type="spellEnd"/>
+      <w:r>
+        <w:rPr>
+          <w:i/>
+          <w:iCs/>
+          <w:lang w:val="en-US"/>
+        </w:rPr>
+        <w:t>"),</w:t>
+      </w:r>
+    </w:p>
+    <w:p>
+      <w:pPr>
+        <w:rPr>
+          <w:lang w:val="en-US"/>
+        </w:rPr>
+      </w:pPr>
+      <w:r>
+        <w:rPr>
+          <w:lang w:val="en-US"/>
+        </w:rPr>
+        <w:t xml:space="preserve">We are saying that playing someone that is 13 positions under you changes the probability to score compared to playing someone 13 </w:t>
+      </w:r>
+      <w:proofErr w:type="gramStart"/>
+      <w:r>
+        <w:rPr>
+          <w:lang w:val="en-US"/>
+        </w:rPr>
+        <w:t>position</w:t>
+      </w:r>
+      <w:proofErr w:type="gramEnd"/>
+      <w:r>
+        <w:rPr>
+          <w:lang w:val="en-US"/>
+        </w:rPr>
+        <w:t xml:space="preserve"> above you between (</w:t>
+      </w:r>
+      <w:proofErr w:type="gramStart"/>
+      <w:r>
+        <w:rPr>
+          <w:lang w:val="en-US"/>
+        </w:rPr>
+        <w:t>0.0009 ;</w:t>
+      </w:r>
+      <w:proofErr w:type="gramEnd"/>
+      <w:r>
+        <w:rPr>
+          <w:lang w:val="en-US"/>
+        </w:rPr>
+        <w:t xml:space="preserve"> 0.094) so 0.0% to 9.4%.</w:t>
+      </w:r>
+    </w:p>
+    <w:p>
+      <w:pPr>
+        <w:rPr>
+          <w:lang w:val="en-US"/>
+        </w:rPr>
+      </w:pPr>
+    </w:p>
+    <w:p>
+      <w:pPr>
+        <w:rPr>
+          <w:color w:val="C00000"/>
+          <w:lang w:val="en-US"/>
+        </w:rPr>
+      </w:pPr>
+      <w:r>
+        <w:rPr>
+          <w:lang w:val="en-US"/>
+        </w:rPr>
+        <w:t xml:space="preserve"># </w:t>
+      </w:r>
+      <w:proofErr w:type="spellStart"/>
+      <w:r>
+        <w:rPr>
+          <w:lang w:val="en-US"/>
+        </w:rPr>
+        <w:t>player_cumsections</w:t>
+      </w:r>
+      <w:proofErr w:type="spellEnd"/>
+      <w:r>
+        <w:rPr>
+          <w:lang w:val="en-US"/>
+        </w:rPr>
+        <w:t xml:space="preserve"> </w:t>
+      </w:r>
+      <w:proofErr w:type="gramStart"/>
+      <w:r>
+        <w:rPr>
+          <w:lang w:val="en-US"/>
+        </w:rPr>
+        <w:t>goes</w:t>
+      </w:r>
+      <w:proofErr w:type="gramEnd"/>
+      <w:r>
+        <w:rPr>
+          <w:lang w:val="en-US"/>
+        </w:rPr>
+        <w:t xml:space="preserve"> from 1 to 19.</w:t>
+      </w:r>
+      <w:r>
+        <w:rPr>
+          <w:lang w:val="en-US"/>
+        </w:rPr>
+        <w:t xml:space="preserve"> </w:t>
+      </w:r>
+      <w:r>
+        <w:rPr>
+          <w:color w:val="C00000"/>
+          <w:lang w:val="en-US"/>
+        </w:rPr>
+        <w:t xml:space="preserve">(reduced effect to adjust for it having </w:t>
+      </w:r>
+      <w:r>
+        <w:rPr>
+          <w:color w:val="C00000"/>
+          <w:lang w:val="en-US"/>
+        </w:rPr>
+        <w:t>19</w:t>
+      </w:r>
+      <w:r>
+        <w:rPr>
+          <w:color w:val="C00000"/>
+          <w:lang w:val="en-US"/>
+        </w:rPr>
+        <w:t xml:space="preserve"> units)</w:t>
+      </w:r>
+    </w:p>
+    <w:p>
+      <w:pPr>
+        <w:rPr>
+          <w:i/>
+          <w:iCs/>
+          <w:lang w:val="en-US"/>
+        </w:rPr>
+      </w:pPr>
+      <w:proofErr w:type="spellStart"/>
+      <w:r>
+        <w:rPr>
+          <w:i/>
+          <w:iCs/>
+          <w:lang w:val="en-US"/>
+        </w:rPr>
+        <w:t>set_</w:t>
+      </w:r>
+      <w:proofErr w:type="gramStart"/>
+      <w:r>
+        <w:rPr>
+          <w:i/>
+          <w:iCs/>
+          <w:lang w:val="en-US"/>
+        </w:rPr>
+        <w:t>prior</w:t>
+      </w:r>
+      <w:proofErr w:type="spellEnd"/>
+      <w:r>
+        <w:rPr>
+          <w:i/>
+          <w:iCs/>
+          <w:lang w:val="en-US"/>
+        </w:rPr>
+        <w:t>(</w:t>
+      </w:r>
+      <w:proofErr w:type="gramEnd"/>
+      <w:r>
+        <w:rPr>
+          <w:i/>
+          <w:iCs/>
+          <w:lang w:val="en-US"/>
+        </w:rPr>
+        <w:t>"</w:t>
+      </w:r>
+      <w:proofErr w:type="gramStart"/>
+      <w:r>
+        <w:rPr>
+          <w:i/>
+          <w:iCs/>
+          <w:lang w:val="en-US"/>
+        </w:rPr>
+        <w:t>normal(</w:t>
+      </w:r>
+      <w:proofErr w:type="gramEnd"/>
+      <w:r>
+        <w:rPr>
+          <w:i/>
+          <w:iCs/>
+          <w:lang w:val="en-US"/>
+        </w:rPr>
+        <w:t xml:space="preserve">0, 0.06)", class = "b", </w:t>
+      </w:r>
+      <w:proofErr w:type="spellStart"/>
+      <w:r>
+        <w:rPr>
+          <w:i/>
+          <w:iCs/>
+          <w:lang w:val="en-US"/>
+        </w:rPr>
+        <w:t>coef</w:t>
+      </w:r>
+      <w:proofErr w:type="spellEnd"/>
+      <w:r>
+        <w:rPr>
+          <w:i/>
+          <w:iCs/>
+          <w:lang w:val="en-US"/>
+        </w:rPr>
+        <w:t xml:space="preserve"> = "</w:t>
+      </w:r>
+      <w:proofErr w:type="spellStart"/>
+      <w:r>
+        <w:rPr>
+          <w:i/>
+          <w:iCs/>
+          <w:lang w:val="en-US"/>
+        </w:rPr>
+        <w:t>player_cumsections_c</w:t>
+      </w:r>
+      <w:proofErr w:type="spellEnd"/>
+      <w:r>
+        <w:rPr>
+          <w:i/>
+          <w:iCs/>
+          <w:lang w:val="en-US"/>
+        </w:rPr>
+        <w:t>")</w:t>
+      </w:r>
+    </w:p>
+    <w:p>
+      <w:pPr>
+        <w:rPr>
+          <w:lang w:val="en-US"/>
+        </w:rPr>
+      </w:pPr>
+      <w:r>
+        <w:rPr>
+          <w:lang w:val="en-US"/>
+        </w:rPr>
+        <w:t>We are saying that playing 19 sections cumulatively changes the probability to score compared to playing only one section between (</w:t>
+      </w:r>
+      <w:proofErr w:type="gramStart"/>
+      <w:r>
+        <w:rPr>
+          <w:lang w:val="en-US"/>
+        </w:rPr>
+        <w:t>0.0009 ;</w:t>
+      </w:r>
+      <w:proofErr w:type="gramEnd"/>
+      <w:r>
+        <w:rPr>
+          <w:lang w:val="en-US"/>
+        </w:rPr>
+        <w:t xml:space="preserve"> 0.088) so 0.01% to 8.8%.</w:t>
+      </w:r>
+    </w:p>
+    <w:p>
+      <w:pPr>
+        <w:rPr>
+          <w:lang w:val="en-US"/>
+        </w:rPr>
+      </w:pPr>
+    </w:p>
+    <w:p>
+      <w:pPr>
+        <w:rPr>
+          <w:color w:val="C00000"/>
+          <w:lang w:val="en-US"/>
+        </w:rPr>
+      </w:pPr>
+      <w:r>
+        <w:rPr>
+          <w:lang w:val="en-US"/>
+        </w:rPr>
+        <w:t xml:space="preserve"># player_cumsections_2 </w:t>
+      </w:r>
+      <w:r>
+        <w:rPr>
+          <w:lang w:val="en-US"/>
+        </w:rPr>
+        <w:t xml:space="preserve">is quadratic and </w:t>
+      </w:r>
+      <w:r>
+        <w:rPr>
+          <w:lang w:val="en-US"/>
+        </w:rPr>
+        <w:t>goes from 1 to 361</w:t>
+      </w:r>
+      <w:r>
+        <w:rPr>
+          <w:lang w:val="en-US"/>
+        </w:rPr>
+        <w:t xml:space="preserve"> </w:t>
+      </w:r>
+      <w:r>
+        <w:rPr>
+          <w:color w:val="C00000"/>
+          <w:lang w:val="en-US"/>
+        </w:rPr>
+        <w:t xml:space="preserve">(reduced effect to adjust for it having </w:t>
+      </w:r>
+      <w:r>
+        <w:rPr>
+          <w:color w:val="C00000"/>
+          <w:lang w:val="en-US"/>
+        </w:rPr>
+        <w:t>361</w:t>
+      </w:r>
+      <w:r>
+        <w:rPr>
+          <w:color w:val="C00000"/>
+          <w:lang w:val="en-US"/>
+        </w:rPr>
+        <w:t xml:space="preserve"> units)</w:t>
+      </w:r>
+    </w:p>
+    <w:p>
+      <w:pPr>
+        <w:rPr>
+          <w:i/>
+          <w:iCs/>
+          <w:lang w:val="en-US"/>
+        </w:rPr>
+      </w:pPr>
+      <w:proofErr w:type="spellStart"/>
+      <w:r>
+        <w:rPr>
+          <w:i/>
+          <w:iCs/>
+          <w:lang w:val="en-US"/>
+        </w:rPr>
+        <w:t>set_</w:t>
+      </w:r>
+      <w:proofErr w:type="gramStart"/>
+      <w:r>
+        <w:rPr>
+          <w:i/>
+          <w:iCs/>
+          <w:lang w:val="en-US"/>
+        </w:rPr>
+        <w:t>prior</w:t>
+      </w:r>
+      <w:proofErr w:type="spellEnd"/>
+      <w:r>
+        <w:rPr>
+          <w:i/>
+          <w:iCs/>
+          <w:lang w:val="en-US"/>
+        </w:rPr>
+        <w:t>(</w:t>
+      </w:r>
+      <w:proofErr w:type="gramEnd"/>
+      <w:r>
+        <w:rPr>
+          <w:i/>
+          <w:iCs/>
+          <w:lang w:val="en-US"/>
+        </w:rPr>
+        <w:t>"</w:t>
+      </w:r>
+      <w:proofErr w:type="gramStart"/>
+      <w:r>
+        <w:rPr>
+          <w:i/>
+          <w:iCs/>
+          <w:lang w:val="en-US"/>
+        </w:rPr>
+        <w:t>normal(</w:t>
+      </w:r>
+      <w:proofErr w:type="gramEnd"/>
+      <w:r>
+        <w:rPr>
+          <w:i/>
+          <w:iCs/>
+          <w:lang w:val="en-US"/>
+        </w:rPr>
+        <w:t xml:space="preserve">0, 0.003)", class = "b", </w:t>
+      </w:r>
+      <w:proofErr w:type="spellStart"/>
+      <w:r>
+        <w:rPr>
+          <w:i/>
+          <w:iCs/>
+          <w:lang w:val="en-US"/>
+        </w:rPr>
+        <w:t>coef</w:t>
+      </w:r>
+      <w:proofErr w:type="spellEnd"/>
+      <w:r>
+        <w:rPr>
+          <w:i/>
+          <w:iCs/>
+          <w:lang w:val="en-US"/>
+        </w:rPr>
+        <w:t xml:space="preserve"> = "player_cumsections_2_c")</w:t>
+      </w:r>
+    </w:p>
+    <w:p>
+      <w:pPr>
+        <w:rPr>
+          <w:lang w:val="en-US"/>
+        </w:rPr>
+      </w:pPr>
+      <w:r>
+        <w:rPr>
+          <w:lang w:val="en-US"/>
+        </w:rPr>
+        <w:lastRenderedPageBreak/>
+        <w:t xml:space="preserve">We are saying that playing 361 </w:t>
+      </w:r>
+      <w:proofErr w:type="spellStart"/>
+      <w:proofErr w:type="gramStart"/>
+      <w:r>
+        <w:rPr>
+          <w:lang w:val="en-US"/>
+        </w:rPr>
+        <w:t>squaredsection</w:t>
+      </w:r>
+      <w:proofErr w:type="spellEnd"/>
+      <w:proofErr w:type="gramEnd"/>
+      <w:r>
+        <w:rPr>
+          <w:lang w:val="en-US"/>
+        </w:rPr>
+        <w:t xml:space="preserve">-units cumulatively changes the probability to score compared to playing only one </w:t>
+      </w:r>
+      <w:proofErr w:type="spellStart"/>
+      <w:r>
+        <w:rPr>
+          <w:lang w:val="en-US"/>
+        </w:rPr>
+        <w:t>squaredsection</w:t>
+      </w:r>
+      <w:proofErr w:type="spellEnd"/>
+      <w:r>
+        <w:rPr>
+          <w:lang w:val="en-US"/>
+        </w:rPr>
+        <w:t>-unit between (</w:t>
+      </w:r>
+      <w:proofErr w:type="gramStart"/>
+      <w:r>
+        <w:rPr>
+          <w:lang w:val="en-US"/>
+        </w:rPr>
+        <w:t>0.0011 ;</w:t>
+      </w:r>
+      <w:proofErr w:type="gramEnd"/>
+      <w:r>
+        <w:rPr>
+          <w:lang w:val="en-US"/>
+        </w:rPr>
+        <w:t xml:space="preserve"> 0.079) so 0.01% to 7.9%.</w:t>
+      </w:r>
+    </w:p>
+    <w:p>
+      <w:pPr>
+        <w:rPr>
+          <w:lang w:val="en-US"/>
+        </w:rPr>
+      </w:pPr>
+      <w:r>
+        <w:rPr>
+          <w:noProof/>
+          <w:lang w:val="en-US"/>
+        </w:rPr>
+        <w:drawing>
+          <wp:inline distT="0" distB="0" distL="0" distR="0" wp14:anchorId="56288A1D" wp14:editId="4F54EE3A">
+            <wp:extent cx="4945715" cy="3055746"/>
+            <wp:effectExtent l="0" t="0" r="7620" b="0"/>
+            <wp:docPr id="1200192112" name="Grafik 7"/>
+            <wp:cNvGraphicFramePr>
+              <a:graphicFrameLocks xmlns:a="http://schemas.openxmlformats.org/drawingml/2006/main" noChangeAspect="1"/>
+            </wp:cNvGraphicFramePr>
+            <a:graphic xmlns:a="http://schemas.openxmlformats.org/drawingml/2006/main">
+              <a:graphicData uri="http://schemas.openxmlformats.org/drawingml/2006/picture">
+                <pic:pic xmlns:pic="http://schemas.openxmlformats.org/drawingml/2006/picture">
+                  <pic:nvPicPr>
+                    <pic:cNvPr id="0" name="Picture 7"/>
+                    <pic:cNvPicPr>
+                      <a:picLocks noChangeAspect="1" noChangeArrowheads="1"/>
+                    </pic:cNvPicPr>
+                  </pic:nvPicPr>
+                  <pic:blipFill>
+                    <a:blip r:embed="rId7" cstate="print">
+                      <a:extLst>
+                        <a:ext uri="{28A0092B-C50C-407E-A947-70E740481C1C}">
+                          <a14:useLocalDpi xmlns:a14="http://schemas.microsoft.com/office/drawing/2010/main" val="0"/>
+                        </a:ext>
+                      </a:extLst>
+                    </a:blip>
+                    <a:srcRect/>
+                    <a:stretch>
+                      <a:fillRect/>
+                    </a:stretch>
+                  </pic:blipFill>
+                  <pic:spPr bwMode="auto">
+                    <a:xfrm>
+                      <a:off x="0" y="0"/>
+                      <a:ext cx="4972209" cy="3072115"/>
+                    </a:xfrm>
+                    <a:prstGeom prst="rect">
+                      <a:avLst/>
+                    </a:prstGeom>
+                    <a:noFill/>
+                  </pic:spPr>
+                </pic:pic>
+              </a:graphicData>
+            </a:graphic>
+          </wp:inline>
+        </w:drawing>
+      </w:r>
+    </w:p>
+    <w:p>
+      <w:r>
+        <w:t>Jetzt sieht das wieder n</w:t>
+      </w:r>
+      <w:r>
+        <w:t>ice aus.</w:t>
+      </w:r>
+    </w:p>
+    <w:p/>
+    <w:p>
+      <w:pPr>
+        <w:rPr>
+          <w:u w:val="single"/>
+        </w:rPr>
+      </w:pPr>
+      <w:proofErr w:type="spellStart"/>
+      <w:r>
+        <w:rPr>
+          <w:u w:val="single"/>
+        </w:rPr>
+        <w:t>Column</w:t>
+      </w:r>
+      <w:proofErr w:type="spellEnd"/>
+      <w:r>
+        <w:rPr>
+          <w:u w:val="single"/>
+        </w:rPr>
+        <w:t xml:space="preserve"> 3</w:t>
+      </w:r>
+    </w:p>
+    <w:p>
+      <w:r>
+        <w:t>Alt:</w:t>
+      </w:r>
+    </w:p>
+    <w:p>
+      <w:r>
+        <w:rPr>
+          <w:noProof/>
+        </w:rPr>
+        <w:drawing>
+          <wp:inline distT="0" distB="0" distL="0" distR="0" wp14:anchorId="40F240D3" wp14:editId="5F4159E7">
+            <wp:extent cx="4730502" cy="2922774"/>
+            <wp:effectExtent l="0" t="0" r="0" b="0"/>
+            <wp:docPr id="1766604668" name="Grafik 8"/>
+            <wp:cNvGraphicFramePr>
+              <a:graphicFrameLocks xmlns:a="http://schemas.openxmlformats.org/drawingml/2006/main" noChangeAspect="1"/>
+            </wp:cNvGraphicFramePr>
+            <a:graphic xmlns:a="http://schemas.openxmlformats.org/drawingml/2006/main">
+              <a:graphicData uri="http://schemas.openxmlformats.org/drawingml/2006/picture">
+                <pic:pic xmlns:pic="http://schemas.openxmlformats.org/drawingml/2006/picture">
+                  <pic:nvPicPr>
+                    <pic:cNvPr id="0" name="Picture 8"/>
+                    <pic:cNvPicPr>
+                      <a:picLocks noChangeAspect="1" noChangeArrowheads="1"/>
+                    </pic:cNvPicPr>
+                  </pic:nvPicPr>
+                  <pic:blipFill>
+                    <a:blip r:embed="rId8" cstate="print">
+                      <a:extLst>
+                        <a:ext uri="{28A0092B-C50C-407E-A947-70E740481C1C}">
+                          <a14:useLocalDpi xmlns:a14="http://schemas.microsoft.com/office/drawing/2010/main" val="0"/>
+                        </a:ext>
+                      </a:extLst>
+                    </a:blip>
+                    <a:srcRect/>
+                    <a:stretch>
+                      <a:fillRect/>
+                    </a:stretch>
+                  </pic:blipFill>
+                  <pic:spPr bwMode="auto">
+                    <a:xfrm>
+                      <a:off x="0" y="0"/>
+                      <a:ext cx="4760326" cy="2941201"/>
+                    </a:xfrm>
+                    <a:prstGeom prst="rect">
+                      <a:avLst/>
+                    </a:prstGeom>
+                    <a:noFill/>
+                  </pic:spPr>
+                </pic:pic>
+              </a:graphicData>
+            </a:graphic>
+          </wp:inline>
+        </w:drawing>
+      </w:r>
+    </w:p>
+    <w:p>
+      <w:proofErr w:type="spellStart"/>
+      <w:r>
+        <w:t>Too</w:t>
+      </w:r>
+      <w:proofErr w:type="spellEnd"/>
+      <w:r>
+        <w:t xml:space="preserve"> </w:t>
+      </w:r>
+      <w:proofErr w:type="spellStart"/>
+      <w:r>
+        <w:t>wide</w:t>
+      </w:r>
+      <w:proofErr w:type="spellEnd"/>
+      <w:r>
+        <w:t>.</w:t>
+      </w:r>
+    </w:p>
+    <w:p/>
+    <w:p>
+      <w:pPr>
+        <w:rPr>
+          <w:color w:val="C00000"/>
+          <w:lang w:val="en-US"/>
+        </w:rPr>
+      </w:pPr>
+      <w:r>
+        <w:rPr>
+          <w:lang w:val="en-US"/>
+        </w:rPr>
+        <w:t xml:space="preserve"># </w:t>
+      </w:r>
+      <w:proofErr w:type="spellStart"/>
+      <w:r>
+        <w:rPr>
+          <w:lang w:val="en-US"/>
+        </w:rPr>
+        <w:t>scoregap_pre</w:t>
+      </w:r>
+      <w:proofErr w:type="spellEnd"/>
+      <w:r>
+        <w:rPr>
+          <w:lang w:val="en-US"/>
+        </w:rPr>
+        <w:t xml:space="preserve"> goes from -4 t</w:t>
+      </w:r>
+      <w:r>
+        <w:rPr>
+          <w:lang w:val="en-US"/>
+        </w:rPr>
+        <w:t xml:space="preserve">o 4 </w:t>
+      </w:r>
+      <w:r>
+        <w:rPr>
+          <w:color w:val="C00000"/>
+          <w:lang w:val="en-US"/>
+        </w:rPr>
+        <w:t xml:space="preserve">(reduced effect to adjust for it having </w:t>
+      </w:r>
+      <w:r>
+        <w:rPr>
+          <w:color w:val="C00000"/>
+          <w:lang w:val="en-US"/>
+        </w:rPr>
+        <w:t>8</w:t>
+      </w:r>
+      <w:r>
+        <w:rPr>
+          <w:color w:val="C00000"/>
+          <w:lang w:val="en-US"/>
+        </w:rPr>
+        <w:t xml:space="preserve"> units)</w:t>
+      </w:r>
+    </w:p>
+    <w:p>
+      <w:pPr>
+        <w:rPr>
+          <w:i/>
+          <w:iCs/>
+          <w:lang w:val="en-US"/>
+        </w:rPr>
+      </w:pPr>
+      <w:proofErr w:type="spellStart"/>
+      <w:r>
+        <w:rPr>
+          <w:i/>
+          <w:iCs/>
+          <w:lang w:val="en-US"/>
+        </w:rPr>
+        <w:lastRenderedPageBreak/>
+        <w:t>set_</w:t>
+      </w:r>
+      <w:proofErr w:type="gramStart"/>
+      <w:r>
+        <w:rPr>
+          <w:i/>
+          <w:iCs/>
+          <w:lang w:val="en-US"/>
+        </w:rPr>
+        <w:t>prior</w:t>
+      </w:r>
+      <w:proofErr w:type="spellEnd"/>
+      <w:r>
+        <w:rPr>
+          <w:i/>
+          <w:iCs/>
+          <w:lang w:val="en-US"/>
+        </w:rPr>
+        <w:t>(</w:t>
+      </w:r>
+      <w:proofErr w:type="gramEnd"/>
+      <w:r>
+        <w:rPr>
+          <w:i/>
+          <w:iCs/>
+          <w:lang w:val="en-US"/>
+        </w:rPr>
+        <w:t>"</w:t>
+      </w:r>
+      <w:proofErr w:type="gramStart"/>
+      <w:r>
+        <w:rPr>
+          <w:i/>
+          <w:iCs/>
+          <w:lang w:val="en-US"/>
+        </w:rPr>
+        <w:t>normal(</w:t>
+      </w:r>
+      <w:proofErr w:type="gramEnd"/>
+      <w:r>
+        <w:rPr>
+          <w:i/>
+          <w:iCs/>
+          <w:lang w:val="en-US"/>
+        </w:rPr>
+        <w:t xml:space="preserve">0, 0.15)", class = "b", </w:t>
+      </w:r>
+      <w:proofErr w:type="spellStart"/>
+      <w:r>
+        <w:rPr>
+          <w:i/>
+          <w:iCs/>
+          <w:lang w:val="en-US"/>
+        </w:rPr>
+        <w:t>coef</w:t>
+      </w:r>
+      <w:proofErr w:type="spellEnd"/>
+      <w:r>
+        <w:rPr>
+          <w:i/>
+          <w:iCs/>
+          <w:lang w:val="en-US"/>
+        </w:rPr>
+        <w:t xml:space="preserve"> = "</w:t>
+      </w:r>
+      <w:proofErr w:type="spellStart"/>
+      <w:r>
+        <w:rPr>
+          <w:i/>
+          <w:iCs/>
+          <w:lang w:val="en-US"/>
+        </w:rPr>
+        <w:t>scoregap_pre_c</w:t>
+      </w:r>
+      <w:proofErr w:type="spellEnd"/>
+      <w:r>
+        <w:rPr>
+          <w:i/>
+          <w:iCs/>
+          <w:lang w:val="en-US"/>
+        </w:rPr>
+        <w:t>")</w:t>
+      </w:r>
+    </w:p>
+    <w:p>
+      <w:pPr>
+        <w:rPr>
+          <w:lang w:val="en-US"/>
+        </w:rPr>
+      </w:pPr>
+      <w:r>
+        <w:rPr>
+          <w:lang w:val="en-US"/>
+        </w:rPr>
+        <w:t xml:space="preserve">We are saying that having a score advantage of 4 goals changes the probability </w:t>
+      </w:r>
+      <w:proofErr w:type="gramStart"/>
+      <w:r>
+        <w:rPr>
+          <w:lang w:val="en-US"/>
+        </w:rPr>
+        <w:t>to score</w:t>
+      </w:r>
+      <w:proofErr w:type="gramEnd"/>
+      <w:r>
+        <w:rPr>
+          <w:lang w:val="en-US"/>
+        </w:rPr>
+        <w:t xml:space="preserve"> compared </w:t>
+      </w:r>
+      <w:proofErr w:type="gramStart"/>
+      <w:r>
+        <w:rPr>
+          <w:lang w:val="en-US"/>
+        </w:rPr>
+        <w:t>having</w:t>
+      </w:r>
+      <w:proofErr w:type="gramEnd"/>
+      <w:r>
+        <w:rPr>
+          <w:lang w:val="en-US"/>
+        </w:rPr>
+        <w:t xml:space="preserve"> 4 less goals than the </w:t>
+      </w:r>
+      <w:proofErr w:type="spellStart"/>
+      <w:r>
+        <w:rPr>
+          <w:lang w:val="en-US"/>
+        </w:rPr>
+        <w:t>oppononte</w:t>
+      </w:r>
+      <w:proofErr w:type="spellEnd"/>
+      <w:r>
+        <w:rPr>
+          <w:lang w:val="en-US"/>
+        </w:rPr>
+        <w:t xml:space="preserve"> to between (</w:t>
+      </w:r>
+      <w:proofErr w:type="gramStart"/>
+      <w:r>
+        <w:rPr>
+          <w:lang w:val="en-US"/>
+        </w:rPr>
+        <w:t>0.009 ;</w:t>
+      </w:r>
+      <w:proofErr w:type="gramEnd"/>
+      <w:r>
+        <w:rPr>
+          <w:lang w:val="en-US"/>
+        </w:rPr>
+        <w:t xml:space="preserve"> 0.098) so 0.01% to 9.8%.</w:t>
+      </w:r>
+    </w:p>
+    <w:p>
+      <w:pPr>
+        <w:rPr>
+          <w:lang w:val="en-US"/>
+        </w:rPr>
+      </w:pPr>
+    </w:p>
+    <w:p>
+      <w:pPr>
+        <w:rPr>
+          <w:lang w:val="en-US"/>
+        </w:rPr>
+      </w:pPr>
+      <w:r>
+        <w:rPr>
+          <w:lang w:val="en-US"/>
+        </w:rPr>
+        <w:t xml:space="preserve"># </w:t>
+      </w:r>
+      <w:proofErr w:type="spellStart"/>
+      <w:r>
+        <w:rPr>
+          <w:lang w:val="en-US"/>
+        </w:rPr>
+        <w:t>dteamgoal_pre</w:t>
+      </w:r>
+      <w:proofErr w:type="spellEnd"/>
+      <w:r>
+        <w:rPr>
+          <w:lang w:val="en-US"/>
+        </w:rPr>
+        <w:t xml:space="preserve"> goes from 0 to 1</w:t>
+      </w:r>
+    </w:p>
+    <w:p>
+      <w:pPr>
+        <w:rPr>
+          <w:i/>
+          <w:iCs/>
+          <w:lang w:val="en-US"/>
+        </w:rPr>
+      </w:pPr>
+      <w:proofErr w:type="spellStart"/>
+      <w:r>
+        <w:rPr>
+          <w:i/>
+          <w:iCs/>
+          <w:lang w:val="en-US"/>
+        </w:rPr>
+        <w:t>set_</w:t>
+      </w:r>
+      <w:proofErr w:type="gramStart"/>
+      <w:r>
+        <w:rPr>
+          <w:i/>
+          <w:iCs/>
+          <w:lang w:val="en-US"/>
+        </w:rPr>
+        <w:t>prior</w:t>
+      </w:r>
+      <w:proofErr w:type="spellEnd"/>
+      <w:r>
+        <w:rPr>
+          <w:i/>
+          <w:iCs/>
+          <w:lang w:val="en-US"/>
+        </w:rPr>
+        <w:t>(</w:t>
+      </w:r>
+      <w:proofErr w:type="gramEnd"/>
+      <w:r>
+        <w:rPr>
+          <w:i/>
+          <w:iCs/>
+          <w:lang w:val="en-US"/>
+        </w:rPr>
+        <w:t>"</w:t>
+      </w:r>
+      <w:proofErr w:type="gramStart"/>
+      <w:r>
+        <w:rPr>
+          <w:i/>
+          <w:iCs/>
+          <w:lang w:val="en-US"/>
+        </w:rPr>
+        <w:t>normal(</w:t>
+      </w:r>
+      <w:proofErr w:type="gramEnd"/>
+      <w:r>
+        <w:rPr>
+          <w:i/>
+          <w:iCs/>
+          <w:lang w:val="en-US"/>
+        </w:rPr>
+        <w:t>0, 0.4)</w:t>
+      </w:r>
+      <w:proofErr w:type="gramStart"/>
+      <w:r>
+        <w:rPr>
+          <w:i/>
+          <w:iCs/>
+          <w:lang w:val="en-US"/>
+        </w:rPr>
+        <w:t xml:space="preserve">",   </w:t>
+      </w:r>
+      <w:proofErr w:type="gramEnd"/>
+      <w:r>
+        <w:rPr>
+          <w:i/>
+          <w:iCs/>
+          <w:lang w:val="en-US"/>
+        </w:rPr>
+        <w:t>class = "b")</w:t>
+      </w:r>
+    </w:p>
+    <w:p>
+      <w:pPr>
+        <w:rPr>
+          <w:lang w:val="en-US"/>
+        </w:rPr>
+      </w:pPr>
+      <w:r>
+        <w:rPr>
+          <w:lang w:val="en-US"/>
+        </w:rPr>
+        <w:t xml:space="preserve">We are saying that </w:t>
+      </w:r>
+      <w:r>
+        <w:rPr>
+          <w:lang w:val="en-US"/>
+        </w:rPr>
+        <w:t>scoring a goal in the section before</w:t>
+      </w:r>
+      <w:r>
+        <w:rPr>
+          <w:lang w:val="en-US"/>
+        </w:rPr>
+        <w:t xml:space="preserve"> changes the probability to score</w:t>
+      </w:r>
+      <w:r>
+        <w:rPr>
+          <w:lang w:val="en-US"/>
+        </w:rPr>
+        <w:t xml:space="preserve"> a goal</w:t>
+      </w:r>
+      <w:r>
+        <w:rPr>
+          <w:lang w:val="en-US"/>
+        </w:rPr>
+        <w:t xml:space="preserve"> to </w:t>
+      </w:r>
+      <w:r>
+        <w:rPr>
+          <w:lang w:val="en-US"/>
+        </w:rPr>
+        <w:t xml:space="preserve">be </w:t>
+      </w:r>
+      <w:r>
+        <w:rPr>
+          <w:lang w:val="en-US"/>
+        </w:rPr>
+        <w:t>between 0.</w:t>
+      </w:r>
+      <w:r>
+        <w:rPr>
+          <w:lang w:val="en-US"/>
+        </w:rPr>
+        <w:t>45</w:t>
+      </w:r>
+      <w:r>
+        <w:rPr>
+          <w:lang w:val="en-US"/>
+        </w:rPr>
+        <w:t xml:space="preserve">% </w:t>
+      </w:r>
+      <w:r>
+        <w:rPr>
+          <w:lang w:val="en-US"/>
+        </w:rPr>
+        <w:t>and</w:t>
+      </w:r>
+      <w:r>
+        <w:rPr>
+          <w:lang w:val="en-US"/>
+        </w:rPr>
+        <w:t xml:space="preserve"> </w:t>
+      </w:r>
+      <w:r>
+        <w:rPr>
+          <w:lang w:val="en-US"/>
+        </w:rPr>
+        <w:t>2.18</w:t>
+      </w:r>
+      <w:r>
+        <w:rPr>
+          <w:lang w:val="en-US"/>
+        </w:rPr>
+        <w:t>%.</w:t>
+      </w:r>
+    </w:p>
+    <w:p>
+      <w:pPr>
+        <w:rPr>
+          <w:lang w:val="en-US"/>
+        </w:rPr>
+      </w:pPr>
+    </w:p>
+    <w:p>
+      <w:pPr>
+        <w:rPr>
+          <w:lang w:val="en-US"/>
+        </w:rPr>
+      </w:pPr>
+      <w:r>
+        <w:rPr>
+          <w:lang w:val="en-US"/>
+        </w:rPr>
+        <w:t xml:space="preserve"># </w:t>
+      </w:r>
+      <w:proofErr w:type="spellStart"/>
+      <w:r>
+        <w:rPr>
+          <w:lang w:val="en-US"/>
+        </w:rPr>
+        <w:t>dplagoal_pre</w:t>
+      </w:r>
+      <w:proofErr w:type="spellEnd"/>
+      <w:r>
+        <w:rPr>
+          <w:lang w:val="en-US"/>
+        </w:rPr>
+        <w:t xml:space="preserve"> goes from 0 to 1</w:t>
+      </w:r>
+    </w:p>
+    <w:p>
+      <w:pPr>
+        <w:rPr>
+          <w:i/>
+          <w:iCs/>
+          <w:lang w:val="en-US"/>
+        </w:rPr>
+      </w:pPr>
+      <w:proofErr w:type="spellStart"/>
+      <w:r>
+        <w:rPr>
+          <w:i/>
+          <w:iCs/>
+          <w:lang w:val="en-US"/>
+        </w:rPr>
+        <w:t>set_</w:t>
+      </w:r>
+      <w:proofErr w:type="gramStart"/>
+      <w:r>
+        <w:rPr>
+          <w:i/>
+          <w:iCs/>
+          <w:lang w:val="en-US"/>
+        </w:rPr>
+        <w:t>prior</w:t>
+      </w:r>
+      <w:proofErr w:type="spellEnd"/>
+      <w:r>
+        <w:rPr>
+          <w:i/>
+          <w:iCs/>
+          <w:lang w:val="en-US"/>
+        </w:rPr>
+        <w:t>(</w:t>
+      </w:r>
+      <w:proofErr w:type="gramEnd"/>
+      <w:r>
+        <w:rPr>
+          <w:i/>
+          <w:iCs/>
+          <w:lang w:val="en-US"/>
+        </w:rPr>
+        <w:t>"</w:t>
+      </w:r>
+      <w:proofErr w:type="gramStart"/>
+      <w:r>
+        <w:rPr>
+          <w:i/>
+          <w:iCs/>
+          <w:lang w:val="en-US"/>
+        </w:rPr>
+        <w:t>normal(</w:t>
+      </w:r>
+      <w:proofErr w:type="gramEnd"/>
+      <w:r>
+        <w:rPr>
+          <w:i/>
+          <w:iCs/>
+          <w:lang w:val="en-US"/>
+        </w:rPr>
+        <w:t>0, 0.4)</w:t>
+      </w:r>
+      <w:proofErr w:type="gramStart"/>
+      <w:r>
+        <w:rPr>
+          <w:i/>
+          <w:iCs/>
+          <w:lang w:val="en-US"/>
+        </w:rPr>
+        <w:t xml:space="preserve">",   </w:t>
+      </w:r>
+      <w:proofErr w:type="gramEnd"/>
+      <w:r>
+        <w:rPr>
+          <w:i/>
+          <w:iCs/>
+          <w:lang w:val="en-US"/>
+        </w:rPr>
+        <w:t>class = "b")</w:t>
+      </w:r>
+    </w:p>
+    <w:p>
+      <w:pPr>
+        <w:rPr>
+          <w:lang w:val="en-US"/>
+        </w:rPr>
+      </w:pPr>
+    </w:p>
+    <w:p>
+      <w:pPr>
+        <w:rPr>
+          <w:lang w:val="en-US"/>
+        </w:rPr>
+      </w:pPr>
+      <w:r>
+        <w:rPr>
+          <w:lang w:val="en-US"/>
+        </w:rPr>
+        <w:t xml:space="preserve">We are saying that scoring a goal yourself in the section before changes the probability to score a goal to be </w:t>
+      </w:r>
+      <w:proofErr w:type="gramStart"/>
+      <w:r>
+        <w:rPr>
+          <w:lang w:val="en-US"/>
+        </w:rPr>
+        <w:t>between  0.45</w:t>
+      </w:r>
+      <w:proofErr w:type="gramEnd"/>
+      <w:r>
+        <w:rPr>
+          <w:lang w:val="en-US"/>
+        </w:rPr>
+        <w:t>% and 2.18%.</w:t>
+      </w:r>
+    </w:p>
+    <w:p>
+      <w:pPr>
+        <w:rPr>
+          <w:lang w:val="en-US"/>
+        </w:rPr>
+      </w:pPr>
+    </w:p>
+    <w:p>
+      <w:pPr>
+        <w:rPr>
+          <w:lang w:val="en-US"/>
+        </w:rPr>
+      </w:pPr>
+      <w:r>
+        <w:rPr>
+          <w:lang w:val="en-US"/>
+        </w:rPr>
+        <w:t>#</w:t>
+      </w:r>
+      <w:r>
+        <w:rPr>
+          <w:lang w:val="en-US"/>
+        </w:rPr>
+        <w:t>dteamred_pre</w:t>
+      </w:r>
+      <w:r>
+        <w:rPr>
+          <w:lang w:val="en-US"/>
+        </w:rPr>
+        <w:t xml:space="preserve"> </w:t>
+      </w:r>
+      <w:r>
+        <w:rPr>
+          <w:lang w:val="en-US"/>
+        </w:rPr>
+        <w:t>goes from 0 to 1</w:t>
+      </w:r>
+    </w:p>
+    <w:p>
+      <w:pPr>
+        <w:rPr>
+          <w:i/>
+          <w:iCs/>
+          <w:lang w:val="en-US"/>
+        </w:rPr>
+      </w:pPr>
+      <w:proofErr w:type="spellStart"/>
+      <w:r>
+        <w:rPr>
+          <w:i/>
+          <w:iCs/>
+          <w:lang w:val="en-US"/>
+        </w:rPr>
+        <w:t>set_</w:t>
+      </w:r>
+      <w:proofErr w:type="gramStart"/>
+      <w:r>
+        <w:rPr>
+          <w:i/>
+          <w:iCs/>
+          <w:lang w:val="en-US"/>
+        </w:rPr>
+        <w:t>prior</w:t>
+      </w:r>
+      <w:proofErr w:type="spellEnd"/>
+      <w:r>
+        <w:rPr>
+          <w:i/>
+          <w:iCs/>
+          <w:lang w:val="en-US"/>
+        </w:rPr>
+        <w:t>(</w:t>
+      </w:r>
+      <w:proofErr w:type="gramEnd"/>
+      <w:r>
+        <w:rPr>
+          <w:i/>
+          <w:iCs/>
+          <w:lang w:val="en-US"/>
+        </w:rPr>
+        <w:t>"</w:t>
+      </w:r>
+      <w:proofErr w:type="gramStart"/>
+      <w:r>
+        <w:rPr>
+          <w:i/>
+          <w:iCs/>
+          <w:lang w:val="en-US"/>
+        </w:rPr>
+        <w:t>normal(</w:t>
+      </w:r>
+      <w:proofErr w:type="gramEnd"/>
+      <w:r>
+        <w:rPr>
+          <w:i/>
+          <w:iCs/>
+          <w:lang w:val="en-US"/>
+        </w:rPr>
+        <w:t>0, 0.4)</w:t>
+      </w:r>
+      <w:proofErr w:type="gramStart"/>
+      <w:r>
+        <w:rPr>
+          <w:i/>
+          <w:iCs/>
+          <w:lang w:val="en-US"/>
+        </w:rPr>
+        <w:t xml:space="preserve">",   </w:t>
+      </w:r>
+      <w:proofErr w:type="gramEnd"/>
+      <w:r>
+        <w:rPr>
+          <w:i/>
+          <w:iCs/>
+          <w:lang w:val="en-US"/>
+        </w:rPr>
+        <w:t>class = "b")</w:t>
+      </w:r>
+    </w:p>
+    <w:p>
+      <w:pPr>
+        <w:rPr>
+          <w:lang w:val="en-US"/>
+        </w:rPr>
+      </w:pPr>
+      <w:r>
+        <w:rPr>
+          <w:lang w:val="en-US"/>
+        </w:rPr>
+        <w:t xml:space="preserve">We are saying that your team getting a red card in the section before changes the probability to score a goal to be </w:t>
+      </w:r>
+      <w:proofErr w:type="gramStart"/>
+      <w:r>
+        <w:rPr>
+          <w:lang w:val="en-US"/>
+        </w:rPr>
+        <w:t>between  0.45</w:t>
+      </w:r>
+      <w:proofErr w:type="gramEnd"/>
+      <w:r>
+        <w:rPr>
+          <w:lang w:val="en-US"/>
+        </w:rPr>
+        <w:t>% and 2.18%.</w:t>
+      </w:r>
+    </w:p>
+    <w:p>
+      <w:pPr>
+        <w:rPr>
+          <w:lang w:val="en-US"/>
+        </w:rPr>
+      </w:pPr>
+    </w:p>
+    <w:p>
+      <w:pPr>
+        <w:rPr>
+          <w:lang w:val="en-US"/>
+        </w:rPr>
+      </w:pPr>
+      <w:r>
+        <w:rPr>
+          <w:lang w:val="en-US"/>
+        </w:rPr>
+        <w:t xml:space="preserve">#dteamminj_sec_pre goes from 0 to 1 </w:t>
+      </w:r>
+    </w:p>
+    <w:p>
+      <w:pPr>
+        <w:rPr>
+          <w:i/>
+          <w:iCs/>
+          <w:lang w:val="en-US"/>
+        </w:rPr>
+      </w:pPr>
+      <w:proofErr w:type="spellStart"/>
+      <w:r>
+        <w:rPr>
+          <w:i/>
+          <w:iCs/>
+          <w:lang w:val="en-US"/>
+        </w:rPr>
+        <w:t>set_</w:t>
+      </w:r>
+      <w:proofErr w:type="gramStart"/>
+      <w:r>
+        <w:rPr>
+          <w:i/>
+          <w:iCs/>
+          <w:lang w:val="en-US"/>
+        </w:rPr>
+        <w:t>prior</w:t>
+      </w:r>
+      <w:proofErr w:type="spellEnd"/>
+      <w:r>
+        <w:rPr>
+          <w:i/>
+          <w:iCs/>
+          <w:lang w:val="en-US"/>
+        </w:rPr>
+        <w:t>(</w:t>
+      </w:r>
+      <w:proofErr w:type="gramEnd"/>
+      <w:r>
+        <w:rPr>
+          <w:i/>
+          <w:iCs/>
+          <w:lang w:val="en-US"/>
+        </w:rPr>
+        <w:t>"</w:t>
+      </w:r>
+      <w:proofErr w:type="gramStart"/>
+      <w:r>
+        <w:rPr>
+          <w:i/>
+          <w:iCs/>
+          <w:lang w:val="en-US"/>
+        </w:rPr>
+        <w:t>normal(</w:t>
+      </w:r>
+      <w:proofErr w:type="gramEnd"/>
+      <w:r>
+        <w:rPr>
+          <w:i/>
+          <w:iCs/>
+          <w:lang w:val="en-US"/>
+        </w:rPr>
+        <w:t>0, 0.4)</w:t>
+      </w:r>
+      <w:proofErr w:type="gramStart"/>
+      <w:r>
+        <w:rPr>
+          <w:i/>
+          <w:iCs/>
+          <w:lang w:val="en-US"/>
+        </w:rPr>
+        <w:t xml:space="preserve">",   </w:t>
+      </w:r>
+      <w:proofErr w:type="gramEnd"/>
+      <w:r>
+        <w:rPr>
+          <w:i/>
+          <w:iCs/>
+          <w:lang w:val="en-US"/>
+        </w:rPr>
+        <w:t>class = "b")</w:t>
+      </w:r>
+    </w:p>
+    <w:p>
+      <w:pPr>
+        <w:rPr>
+          <w:lang w:val="en-US"/>
+        </w:rPr>
+      </w:pPr>
+      <w:r>
+        <w:rPr>
+          <w:lang w:val="en-US"/>
+        </w:rPr>
+        <w:t xml:space="preserve">We are saying that your team getting </w:t>
+      </w:r>
+      <w:proofErr w:type="spellStart"/>
+      <w:proofErr w:type="gramStart"/>
+      <w:r>
+        <w:rPr>
+          <w:lang w:val="en-US"/>
+        </w:rPr>
+        <w:t>a</w:t>
+      </w:r>
+      <w:proofErr w:type="spellEnd"/>
+      <w:proofErr w:type="gramEnd"/>
+      <w:r>
+        <w:rPr>
+          <w:lang w:val="en-US"/>
+        </w:rPr>
+        <w:t xml:space="preserve"> injury in the section before changes the probability to score a goal to be </w:t>
+      </w:r>
+      <w:proofErr w:type="gramStart"/>
+      <w:r>
+        <w:rPr>
+          <w:lang w:val="en-US"/>
+        </w:rPr>
+        <w:t>between  0.45</w:t>
+      </w:r>
+      <w:proofErr w:type="gramEnd"/>
+      <w:r>
+        <w:rPr>
+          <w:lang w:val="en-US"/>
+        </w:rPr>
+        <w:t>% and 2.18%.</w:t>
+      </w:r>
+    </w:p>
+    <w:p>
+      <w:pPr>
+        <w:rPr>
+          <w:lang w:val="en-US"/>
+        </w:rPr>
+      </w:pPr>
+    </w:p>
+    <w:p>
+      <w:pPr>
+        <w:rPr>
+          <w:lang w:val="en-US"/>
+        </w:rPr>
+      </w:pPr>
+      <w:r>
+        <w:rPr>
+          <w:lang w:val="en-US"/>
+        </w:rPr>
+        <w:t>#</w:t>
+      </w:r>
+      <w:r>
+        <w:rPr>
+          <w:lang w:val="en-US"/>
+        </w:rPr>
+        <w:t xml:space="preserve"> </w:t>
+      </w:r>
+      <w:proofErr w:type="spellStart"/>
+      <w:r>
+        <w:rPr>
+          <w:lang w:val="en-US"/>
+        </w:rPr>
+        <w:t>team_avespeed_pre_c</w:t>
+      </w:r>
+      <w:proofErr w:type="spellEnd"/>
+      <w:r>
+        <w:rPr>
+          <w:lang w:val="en-US"/>
+        </w:rPr>
+        <w:t xml:space="preserve"> goes from 0 to 49 </w:t>
+      </w:r>
+      <w:r>
+        <w:rPr>
+          <w:color w:val="C00000"/>
+          <w:lang w:val="en-US"/>
+        </w:rPr>
+        <w:t xml:space="preserve">(reduced effect to adjust for it having </w:t>
+      </w:r>
+      <w:r>
+        <w:rPr>
+          <w:color w:val="C00000"/>
+          <w:lang w:val="en-US"/>
+        </w:rPr>
+        <w:t>49</w:t>
+      </w:r>
+      <w:r>
+        <w:rPr>
+          <w:color w:val="C00000"/>
+          <w:lang w:val="en-US"/>
+        </w:rPr>
+        <w:t xml:space="preserve"> units)</w:t>
+      </w:r>
+    </w:p>
+    <w:p>
+      <w:pPr>
+        <w:rPr>
+          <w:i/>
+          <w:iCs/>
+          <w:lang w:val="en-US"/>
+        </w:rPr>
+      </w:pPr>
+      <w:proofErr w:type="spellStart"/>
+      <w:r>
+        <w:rPr>
+          <w:i/>
+          <w:iCs/>
+          <w:lang w:val="en-US"/>
+        </w:rPr>
+        <w:t>set_</w:t>
+      </w:r>
+      <w:proofErr w:type="gramStart"/>
+      <w:r>
+        <w:rPr>
+          <w:i/>
+          <w:iCs/>
+          <w:lang w:val="en-US"/>
+        </w:rPr>
+        <w:t>prior</w:t>
+      </w:r>
+      <w:proofErr w:type="spellEnd"/>
+      <w:r>
+        <w:rPr>
+          <w:i/>
+          <w:iCs/>
+          <w:lang w:val="en-US"/>
+        </w:rPr>
+        <w:t>(</w:t>
+      </w:r>
+      <w:proofErr w:type="gramEnd"/>
+      <w:r>
+        <w:rPr>
+          <w:i/>
+          <w:iCs/>
+          <w:lang w:val="en-US"/>
+        </w:rPr>
+        <w:t>"</w:t>
+      </w:r>
+      <w:proofErr w:type="gramStart"/>
+      <w:r>
+        <w:rPr>
+          <w:i/>
+          <w:iCs/>
+          <w:lang w:val="en-US"/>
+        </w:rPr>
+        <w:t>normal(</w:t>
+      </w:r>
+      <w:proofErr w:type="gramEnd"/>
+      <w:r>
+        <w:rPr>
+          <w:i/>
+          <w:iCs/>
+          <w:lang w:val="en-US"/>
+        </w:rPr>
+        <w:t xml:space="preserve">0, 0.025)", class = "b", </w:t>
+      </w:r>
+      <w:proofErr w:type="spellStart"/>
+      <w:r>
+        <w:rPr>
+          <w:i/>
+          <w:iCs/>
+          <w:lang w:val="en-US"/>
+        </w:rPr>
+        <w:t>coef</w:t>
+      </w:r>
+      <w:proofErr w:type="spellEnd"/>
+      <w:r>
+        <w:rPr>
+          <w:i/>
+          <w:iCs/>
+          <w:lang w:val="en-US"/>
+        </w:rPr>
+        <w:t xml:space="preserve"> = "</w:t>
+      </w:r>
+      <w:proofErr w:type="spellStart"/>
+      <w:r>
+        <w:rPr>
+          <w:i/>
+          <w:iCs/>
+          <w:lang w:val="en-US"/>
+        </w:rPr>
+        <w:t>team_avespeed_pre_c</w:t>
+      </w:r>
+      <w:proofErr w:type="spellEnd"/>
+      <w:r>
+        <w:rPr>
+          <w:i/>
+          <w:iCs/>
+          <w:lang w:val="en-US"/>
+        </w:rPr>
+        <w:t>")</w:t>
+      </w:r>
+    </w:p>
+    <w:p>
+      <w:pPr>
+        <w:rPr>
+          <w:lang w:val="en-US"/>
+        </w:rPr>
+      </w:pPr>
+      <w:r>
+        <w:rPr>
+          <w:lang w:val="en-US"/>
+        </w:rPr>
+        <w:t xml:space="preserve">We are saying that a team running 49km/h in the section before changes the </w:t>
+      </w:r>
+      <w:proofErr w:type="spellStart"/>
+      <w:r>
+        <w:rPr>
+          <w:lang w:val="en-US"/>
+        </w:rPr>
+        <w:t>likelyhood</w:t>
+      </w:r>
+      <w:proofErr w:type="spellEnd"/>
+      <w:r>
+        <w:rPr>
+          <w:lang w:val="en-US"/>
+        </w:rPr>
+        <w:t xml:space="preserve"> of scoring </w:t>
+      </w:r>
+      <w:proofErr w:type="spellStart"/>
+      <w:r>
+        <w:rPr>
+          <w:lang w:val="en-US"/>
+        </w:rPr>
+        <w:t>agoal</w:t>
+      </w:r>
+      <w:proofErr w:type="spellEnd"/>
+      <w:r>
+        <w:rPr>
+          <w:lang w:val="en-US"/>
+        </w:rPr>
+        <w:t xml:space="preserve"> compared to te</w:t>
+      </w:r>
+      <w:r>
+        <w:rPr>
+          <w:lang w:val="en-US"/>
+        </w:rPr>
+        <w:t>a</w:t>
+      </w:r>
+      <w:r>
+        <w:rPr>
+          <w:lang w:val="en-US"/>
+        </w:rPr>
+        <w:t>m running 0km/h between (</w:t>
+      </w:r>
+      <w:proofErr w:type="gramStart"/>
+      <w:r>
+        <w:rPr>
+          <w:lang w:val="en-US"/>
+        </w:rPr>
+        <w:t>0.0008 ;</w:t>
+      </w:r>
+      <w:proofErr w:type="gramEnd"/>
+      <w:r>
+        <w:rPr>
+          <w:lang w:val="en-US"/>
+        </w:rPr>
+        <w:t xml:space="preserve"> 0.103) so 0.01% to 10,3%.</w:t>
+      </w:r>
+    </w:p>
+    <w:p>
+      <w:pPr>
+        <w:rPr>
+          <w:lang w:val="en-US"/>
+        </w:rPr>
+      </w:pPr>
+      <w:r>
+        <w:rPr>
+          <w:noProof/>
+          <w:lang w:val="en-US"/>
+        </w:rPr>
+        <w:lastRenderedPageBreak/>
+        <w:drawing>
+          <wp:inline distT="0" distB="0" distL="0" distR="0" wp14:anchorId="0FC0983B" wp14:editId="29026E30">
+            <wp:extent cx="5765385" cy="3562184"/>
+            <wp:effectExtent l="0" t="0" r="6985" b="635"/>
+            <wp:docPr id="940898574" name="Grafik 9"/>
+            <wp:cNvGraphicFramePr>
+              <a:graphicFrameLocks xmlns:a="http://schemas.openxmlformats.org/drawingml/2006/main" noChangeAspect="1"/>
+            </wp:cNvGraphicFramePr>
+            <a:graphic xmlns:a="http://schemas.openxmlformats.org/drawingml/2006/main">
+              <a:graphicData uri="http://schemas.openxmlformats.org/drawingml/2006/picture">
+                <pic:pic xmlns:pic="http://schemas.openxmlformats.org/drawingml/2006/picture">
+                  <pic:nvPicPr>
+                    <pic:cNvPr id="0" name="Picture 9"/>
+                    <pic:cNvPicPr>
+                      <a:picLocks noChangeAspect="1" noChangeArrowheads="1"/>
+                    </pic:cNvPicPr>
+                  </pic:nvPicPr>
+                  <pic:blipFill>
+                    <a:blip r:embed="rId9" cstate="print">
+                      <a:extLst>
+                        <a:ext uri="{28A0092B-C50C-407E-A947-70E740481C1C}">
+                          <a14:useLocalDpi xmlns:a14="http://schemas.microsoft.com/office/drawing/2010/main" val="0"/>
+                        </a:ext>
+                      </a:extLst>
+                    </a:blip>
+                    <a:srcRect/>
+                    <a:stretch>
+                      <a:fillRect/>
+                    </a:stretch>
+                  </pic:blipFill>
+                  <pic:spPr bwMode="auto">
+                    <a:xfrm>
+                      <a:off x="0" y="0"/>
+                      <a:ext cx="5803682" cy="3585846"/>
+                    </a:xfrm>
+                    <a:prstGeom prst="rect">
+                      <a:avLst/>
+                    </a:prstGeom>
+                    <a:noFill/>
+                  </pic:spPr>
+                </pic:pic>
+              </a:graphicData>
+            </a:graphic>
+          </wp:inline>
+        </w:drawing>
+      </w:r>
+    </w:p>
+    <w:p>
+      <w:pPr>
+        <w:rPr>
+          <w:lang w:val="en-US"/>
+        </w:rPr>
+      </w:pPr>
+      <w:r>
+        <w:rPr>
+          <w:lang w:val="en-US"/>
+        </w:rPr>
+        <w:t>Wieder gut.</w:t>
+      </w:r>
+    </w:p>
+    <w:p>
+      <w:pPr>
+        <w:rPr>
+          <w:lang w:val="en-US"/>
+        </w:rPr>
+      </w:pPr>
+    </w:p>
+    <w:p>
+      <w:pPr>
+        <w:rPr>
+          <w:u w:val="single"/>
+        </w:rPr>
+      </w:pPr>
+      <w:proofErr w:type="spellStart"/>
+      <w:r>
+        <w:rPr>
+          <w:u w:val="single"/>
+        </w:rPr>
+        <w:t>Column</w:t>
+      </w:r>
+      <w:proofErr w:type="spellEnd"/>
+      <w:r>
+        <w:rPr>
+          <w:u w:val="single"/>
+        </w:rPr>
+        <w:t xml:space="preserve"> </w:t>
+      </w:r>
+      <w:r>
+        <w:rPr>
+          <w:u w:val="single"/>
+        </w:rPr>
+        <w:t>4</w:t>
+      </w:r>
+    </w:p>
+    <w:p>
+      <w:pPr>
+        <w:rPr>
+          <w:u w:val="single"/>
+        </w:rPr>
+      </w:pPr>
+    </w:p>
+    <w:p>
+      <w:pPr>
+        <w:rPr>
+          <w:u w:val="single"/>
+        </w:rPr>
+      </w:pPr>
+      <w:r>
+        <w:rPr>
+          <w:noProof/>
+          <w:u w:val="single"/>
+        </w:rPr>
+        <w:drawing>
+          <wp:inline distT="0" distB="0" distL="0" distR="0" wp14:anchorId="2992CB3C" wp14:editId="25EA990E">
+            <wp:extent cx="4993802" cy="3085456"/>
+            <wp:effectExtent l="0" t="0" r="0" b="1270"/>
+            <wp:docPr id="531946886" name="Grafik 11"/>
+            <wp:cNvGraphicFramePr>
+              <a:graphicFrameLocks xmlns:a="http://schemas.openxmlformats.org/drawingml/2006/main" noChangeAspect="1"/>
+            </wp:cNvGraphicFramePr>
+            <a:graphic xmlns:a="http://schemas.openxmlformats.org/drawingml/2006/main">
+              <a:graphicData uri="http://schemas.openxmlformats.org/drawingml/2006/picture">
+                <pic:pic xmlns:pic="http://schemas.openxmlformats.org/drawingml/2006/picture">
+                  <pic:nvPicPr>
+                    <pic:cNvPr id="0" name="Picture 11"/>
+                    <pic:cNvPicPr>
+                      <a:picLocks noChangeAspect="1" noChangeArrowheads="1"/>
+                    </pic:cNvPicPr>
+                  </pic:nvPicPr>
+                  <pic:blipFill>
+                    <a:blip r:embed="rId10" cstate="print">
+                      <a:extLst>
+                        <a:ext uri="{28A0092B-C50C-407E-A947-70E740481C1C}">
+                          <a14:useLocalDpi xmlns:a14="http://schemas.microsoft.com/office/drawing/2010/main" val="0"/>
+                        </a:ext>
+                      </a:extLst>
+                    </a:blip>
+                    <a:srcRect/>
+                    <a:stretch>
+                      <a:fillRect/>
+                    </a:stretch>
+                  </pic:blipFill>
+                  <pic:spPr bwMode="auto">
+                    <a:xfrm>
+                      <a:off x="0" y="0"/>
+                      <a:ext cx="5011734" cy="3096535"/>
+                    </a:xfrm>
+                    <a:prstGeom prst="rect">
+                      <a:avLst/>
+                    </a:prstGeom>
+                    <a:noFill/>
+                  </pic:spPr>
+                </pic:pic>
+              </a:graphicData>
+            </a:graphic>
+          </wp:inline>
+        </w:drawing>
+      </w:r>
+    </w:p>
+    <w:p>
+      <w:r>
+        <w:t>Wieder zu oft 1 geschätzt.</w:t>
+      </w:r>
+    </w:p>
+    <w:p>
+      <w:pPr>
+        <w:rPr>
+          <w:u w:val="single"/>
+        </w:rPr>
+      </w:pPr>
+    </w:p>
+    <w:p>
+      <w:pPr>
+        <w:rPr>
+          <w:lang w:val="en-US"/>
+        </w:rPr>
+      </w:pPr>
+      <w:r>
+        <w:rPr>
+          <w:lang w:val="en-US"/>
+        </w:rPr>
+        <w:t xml:space="preserve"># </w:t>
+      </w:r>
+      <w:proofErr w:type="spellStart"/>
+      <w:r>
+        <w:rPr>
+          <w:lang w:val="en-US"/>
+        </w:rPr>
+        <w:t>team_crowd</w:t>
+      </w:r>
+      <w:proofErr w:type="spellEnd"/>
+      <w:r>
+        <w:rPr>
+          <w:lang w:val="en-US"/>
+        </w:rPr>
+        <w:t xml:space="preserve"> goes from 6 t</w:t>
+      </w:r>
+      <w:r>
+        <w:rPr>
+          <w:lang w:val="en-US"/>
+        </w:rPr>
+        <w:t xml:space="preserve">o 25180 </w:t>
+      </w:r>
+      <w:r>
+        <w:rPr>
+          <w:color w:val="C00000"/>
+          <w:lang w:val="en-US"/>
+        </w:rPr>
+        <w:t xml:space="preserve">(reduced effect to adjust for it having </w:t>
+      </w:r>
+      <w:r>
+        <w:rPr>
+          <w:color w:val="C00000"/>
+          <w:lang w:val="en-US"/>
+        </w:rPr>
+        <w:t>25174</w:t>
+      </w:r>
+      <w:r>
+        <w:rPr>
+          <w:color w:val="C00000"/>
+          <w:lang w:val="en-US"/>
+        </w:rPr>
+        <w:t xml:space="preserve"> units)</w:t>
+      </w:r>
+    </w:p>
+    <w:p>
+      <w:pPr>
+        <w:rPr>
+          <w:i/>
+          <w:iCs/>
+          <w:lang w:val="en-US"/>
+        </w:rPr>
+      </w:pPr>
+      <w:proofErr w:type="spellStart"/>
+      <w:r>
+        <w:rPr>
+          <w:i/>
+          <w:iCs/>
+          <w:lang w:val="en-US"/>
+        </w:rPr>
+        <w:lastRenderedPageBreak/>
+        <w:t>set_</w:t>
+      </w:r>
+      <w:proofErr w:type="gramStart"/>
+      <w:r>
+        <w:rPr>
+          <w:i/>
+          <w:iCs/>
+          <w:lang w:val="en-US"/>
+        </w:rPr>
+        <w:t>prior</w:t>
+      </w:r>
+      <w:proofErr w:type="spellEnd"/>
+      <w:r>
+        <w:rPr>
+          <w:i/>
+          <w:iCs/>
+          <w:lang w:val="en-US"/>
+        </w:rPr>
+        <w:t>(</w:t>
+      </w:r>
+      <w:proofErr w:type="gramEnd"/>
+      <w:r>
+        <w:rPr>
+          <w:i/>
+          <w:iCs/>
+          <w:lang w:val="en-US"/>
+        </w:rPr>
+        <w:t>"</w:t>
+      </w:r>
+      <w:proofErr w:type="gramStart"/>
+      <w:r>
+        <w:rPr>
+          <w:i/>
+          <w:iCs/>
+          <w:lang w:val="en-US"/>
+        </w:rPr>
+        <w:t>normal(</w:t>
+      </w:r>
+      <w:proofErr w:type="gramEnd"/>
+      <w:r>
+        <w:rPr>
+          <w:i/>
+          <w:iCs/>
+          <w:lang w:val="en-US"/>
+        </w:rPr>
+        <w:t xml:space="preserve">0, 4.8e-05)", class = "b", </w:t>
+      </w:r>
+      <w:proofErr w:type="spellStart"/>
+      <w:r>
+        <w:rPr>
+          <w:i/>
+          <w:iCs/>
+          <w:lang w:val="en-US"/>
+        </w:rPr>
+        <w:t>coef</w:t>
+      </w:r>
+      <w:proofErr w:type="spellEnd"/>
+      <w:r>
+        <w:rPr>
+          <w:i/>
+          <w:iCs/>
+          <w:lang w:val="en-US"/>
+        </w:rPr>
+        <w:t xml:space="preserve"> = "</w:t>
+      </w:r>
+      <w:proofErr w:type="spellStart"/>
+      <w:r>
+        <w:rPr>
+          <w:i/>
+          <w:iCs/>
+          <w:lang w:val="en-US"/>
+        </w:rPr>
+        <w:t>team_crowd_c</w:t>
+      </w:r>
+      <w:proofErr w:type="spellEnd"/>
+      <w:r>
+        <w:rPr>
+          <w:i/>
+          <w:iCs/>
+          <w:lang w:val="en-US"/>
+        </w:rPr>
+        <w:t>")</w:t>
+      </w:r>
+    </w:p>
+    <w:p>
+      <w:pPr>
+        <w:rPr>
+          <w:lang w:val="en-US"/>
+        </w:rPr>
+      </w:pPr>
+      <w:r>
+        <w:rPr>
+          <w:lang w:val="en-US"/>
+        </w:rPr>
+        <w:t xml:space="preserve">We are saying that a team </w:t>
+      </w:r>
+      <w:proofErr w:type="gramStart"/>
+      <w:r>
+        <w:rPr>
+          <w:lang w:val="en-US"/>
+        </w:rPr>
+        <w:t>having  25180</w:t>
+      </w:r>
+      <w:proofErr w:type="gramEnd"/>
+      <w:r>
+        <w:rPr>
+          <w:lang w:val="en-US"/>
+        </w:rPr>
+        <w:t xml:space="preserve"> home crowd members changes the probability of scoring a goal compared to having 6 </w:t>
+      </w:r>
+      <w:proofErr w:type="spellStart"/>
+      <w:proofErr w:type="gramStart"/>
+      <w:r>
+        <w:rPr>
+          <w:lang w:val="en-US"/>
+        </w:rPr>
+        <w:t>homecrowd</w:t>
+      </w:r>
+      <w:proofErr w:type="spellEnd"/>
+      <w:proofErr w:type="gramEnd"/>
+      <w:r>
+        <w:rPr>
+          <w:lang w:val="en-US"/>
+        </w:rPr>
+        <w:t xml:space="preserve"> members by (</w:t>
+      </w:r>
+      <w:proofErr w:type="gramStart"/>
+      <w:r>
+        <w:rPr>
+          <w:lang w:val="en-US"/>
+        </w:rPr>
+        <w:t>0.0008 ;</w:t>
+      </w:r>
+      <w:proofErr w:type="gramEnd"/>
+      <w:r>
+        <w:rPr>
+          <w:lang w:val="en-US"/>
+        </w:rPr>
+        <w:t xml:space="preserve"> 0.10) so 0.01% to 10%.</w:t>
+      </w:r>
+    </w:p>
+    <w:p>
+      <w:pPr>
+        <w:rPr>
+          <w:lang w:val="en-US"/>
+        </w:rPr>
+      </w:pPr>
+    </w:p>
+    <w:p>
+      <w:pPr>
+        <w:rPr>
+          <w:lang w:val="en-US"/>
+        </w:rPr>
+      </w:pPr>
+      <w:r>
+        <w:rPr>
+          <w:lang w:val="en-US"/>
+        </w:rPr>
+        <w:t xml:space="preserve"># </w:t>
+      </w:r>
+      <w:proofErr w:type="spellStart"/>
+      <w:r>
+        <w:rPr>
+          <w:lang w:val="en-US"/>
+        </w:rPr>
+        <w:t>opp</w:t>
+      </w:r>
+      <w:r>
+        <w:rPr>
+          <w:lang w:val="en-US"/>
+        </w:rPr>
+        <w:t>_crowd</w:t>
+      </w:r>
+      <w:proofErr w:type="spellEnd"/>
+      <w:r>
+        <w:rPr>
+          <w:lang w:val="en-US"/>
+        </w:rPr>
+        <w:t xml:space="preserve"> goes from</w:t>
+      </w:r>
+      <w:r>
+        <w:rPr>
+          <w:lang w:val="en-US"/>
+        </w:rPr>
+        <w:t xml:space="preserve"> </w:t>
+      </w:r>
+      <w:r>
+        <w:rPr>
+          <w:lang w:val="en-US"/>
+        </w:rPr>
+        <w:t>6 t</w:t>
+      </w:r>
+      <w:r>
+        <w:rPr>
+          <w:lang w:val="en-US"/>
+        </w:rPr>
+        <w:t>o 25180</w:t>
+      </w:r>
+      <w:r>
+        <w:rPr>
+          <w:lang w:val="en-US"/>
+        </w:rPr>
+        <w:t xml:space="preserve"> </w:t>
+      </w:r>
+      <w:r>
+        <w:rPr>
+          <w:color w:val="C00000"/>
+          <w:lang w:val="en-US"/>
+        </w:rPr>
+        <w:t xml:space="preserve">(reduced effect to adjust for it having </w:t>
+      </w:r>
+      <w:r>
+        <w:rPr>
+          <w:color w:val="C00000"/>
+          <w:lang w:val="en-US"/>
+        </w:rPr>
+        <w:t>25174</w:t>
+      </w:r>
+      <w:r>
+        <w:rPr>
+          <w:color w:val="C00000"/>
+          <w:lang w:val="en-US"/>
+        </w:rPr>
+        <w:t xml:space="preserve"> units)</w:t>
+      </w:r>
+    </w:p>
+    <w:p>
+      <w:pPr>
+        <w:rPr>
+          <w:i/>
+          <w:iCs/>
+          <w:lang w:val="en-US"/>
+        </w:rPr>
+      </w:pPr>
+      <w:proofErr w:type="spellStart"/>
+      <w:r>
+        <w:rPr>
+          <w:i/>
+          <w:iCs/>
+          <w:lang w:val="en-US"/>
+        </w:rPr>
+        <w:t>set_</w:t>
+      </w:r>
+      <w:proofErr w:type="gramStart"/>
+      <w:r>
+        <w:rPr>
+          <w:i/>
+          <w:iCs/>
+          <w:lang w:val="en-US"/>
+        </w:rPr>
+        <w:t>prior</w:t>
+      </w:r>
+      <w:proofErr w:type="spellEnd"/>
+      <w:r>
+        <w:rPr>
+          <w:i/>
+          <w:iCs/>
+          <w:lang w:val="en-US"/>
+        </w:rPr>
+        <w:t>(</w:t>
+      </w:r>
+      <w:proofErr w:type="gramEnd"/>
+      <w:r>
+        <w:rPr>
+          <w:i/>
+          <w:iCs/>
+          <w:lang w:val="en-US"/>
+        </w:rPr>
+        <w:t>"</w:t>
+      </w:r>
+      <w:proofErr w:type="gramStart"/>
+      <w:r>
+        <w:rPr>
+          <w:i/>
+          <w:iCs/>
+          <w:lang w:val="en-US"/>
+        </w:rPr>
+        <w:t>normal(</w:t>
+      </w:r>
+      <w:proofErr w:type="gramEnd"/>
+      <w:r>
+        <w:rPr>
+          <w:i/>
+          <w:iCs/>
+          <w:lang w:val="en-US"/>
+        </w:rPr>
+        <w:t xml:space="preserve">0, 4.8e-05)", class = "b", </w:t>
+      </w:r>
+      <w:proofErr w:type="spellStart"/>
+      <w:r>
+        <w:rPr>
+          <w:i/>
+          <w:iCs/>
+          <w:lang w:val="en-US"/>
+        </w:rPr>
+        <w:t>coef</w:t>
+      </w:r>
+      <w:proofErr w:type="spellEnd"/>
+      <w:r>
+        <w:rPr>
+          <w:i/>
+          <w:iCs/>
+          <w:lang w:val="en-US"/>
+        </w:rPr>
+        <w:t xml:space="preserve"> = "</w:t>
+      </w:r>
+      <w:proofErr w:type="spellStart"/>
+      <w:r>
+        <w:rPr>
+          <w:i/>
+          <w:iCs/>
+          <w:lang w:val="en-US"/>
+        </w:rPr>
+        <w:t>opp_crowd_c</w:t>
+      </w:r>
+      <w:proofErr w:type="spellEnd"/>
+      <w:r>
+        <w:rPr>
+          <w:i/>
+          <w:iCs/>
+          <w:lang w:val="en-US"/>
+        </w:rPr>
+        <w:t>")</w:t>
+      </w:r>
+    </w:p>
+    <w:p>
+      <w:pPr>
+        <w:rPr>
+          <w:lang w:val="en-US"/>
+        </w:rPr>
+      </w:pPr>
+      <w:r>
+        <w:rPr>
+          <w:lang w:val="en-US"/>
+        </w:rPr>
+        <w:t xml:space="preserve">We are saying that a team </w:t>
+      </w:r>
+      <w:proofErr w:type="gramStart"/>
+      <w:r>
+        <w:rPr>
+          <w:lang w:val="en-US"/>
+        </w:rPr>
+        <w:t>having  25180</w:t>
+      </w:r>
+      <w:proofErr w:type="gramEnd"/>
+      <w:r>
+        <w:rPr>
+          <w:lang w:val="en-US"/>
+        </w:rPr>
+        <w:t xml:space="preserve"> </w:t>
+      </w:r>
+      <w:proofErr w:type="spellStart"/>
+      <w:r>
+        <w:rPr>
+          <w:lang w:val="en-US"/>
+        </w:rPr>
+        <w:t>opp</w:t>
+      </w:r>
+      <w:proofErr w:type="spellEnd"/>
+      <w:r>
+        <w:rPr>
+          <w:lang w:val="en-US"/>
+        </w:rPr>
+        <w:t xml:space="preserve"> crowd members changes the probability of scoring a goal compared to having 6 </w:t>
+      </w:r>
+      <w:proofErr w:type="spellStart"/>
+      <w:r>
+        <w:rPr>
+          <w:lang w:val="en-US"/>
+        </w:rPr>
+        <w:t>oppcrowd</w:t>
+      </w:r>
+      <w:proofErr w:type="spellEnd"/>
+      <w:r>
+        <w:rPr>
+          <w:lang w:val="en-US"/>
+        </w:rPr>
+        <w:t xml:space="preserve"> members by (</w:t>
+      </w:r>
+      <w:proofErr w:type="gramStart"/>
+      <w:r>
+        <w:rPr>
+          <w:lang w:val="en-US"/>
+        </w:rPr>
+        <w:t>0.0008 ;</w:t>
+      </w:r>
+      <w:proofErr w:type="gramEnd"/>
+      <w:r>
+        <w:rPr>
+          <w:lang w:val="en-US"/>
+        </w:rPr>
+        <w:t xml:space="preserve"> 0.10) so 0.01% to 10%.</w:t>
+      </w:r>
+    </w:p>
+    <w:p>
+      <w:pPr>
+        <w:rPr>
+          <w:lang w:val="en-US"/>
+        </w:rPr>
+      </w:pPr>
+    </w:p>
+    <w:p>
+      <w:pPr>
+        <w:rPr>
+          <w:lang w:val="en-US"/>
+        </w:rPr>
+      </w:pPr>
+      <w:r>
+        <w:rPr>
+          <w:lang w:val="en-US"/>
+        </w:rPr>
+        <w:t xml:space="preserve"># </w:t>
+      </w:r>
+      <w:proofErr w:type="spellStart"/>
+      <w:r>
+        <w:rPr>
+          <w:lang w:val="en-US"/>
+        </w:rPr>
+        <w:t>p_odds_team</w:t>
+      </w:r>
+      <w:proofErr w:type="spellEnd"/>
+      <w:r>
+        <w:rPr>
+          <w:lang w:val="en-US"/>
+        </w:rPr>
+        <w:t xml:space="preserve"> goes from 0.05 to 0.8, so 0.75 units</w:t>
+      </w:r>
+      <w:r>
+        <w:rPr>
+          <w:lang w:val="en-US"/>
+        </w:rPr>
+        <w:t xml:space="preserve"> </w:t>
+      </w:r>
+      <w:r>
+        <w:rPr>
+          <w:color w:val="C00000"/>
+          <w:lang w:val="en-US"/>
+        </w:rPr>
+        <w:t>(</w:t>
+      </w:r>
+      <w:r>
+        <w:rPr>
+          <w:color w:val="C00000"/>
+          <w:lang w:val="en-US"/>
+        </w:rPr>
+        <w:t>increased</w:t>
+      </w:r>
+      <w:r>
+        <w:rPr>
+          <w:color w:val="C00000"/>
+          <w:lang w:val="en-US"/>
+        </w:rPr>
+        <w:t xml:space="preserve"> effect to adjust for </w:t>
+      </w:r>
+      <w:r>
+        <w:rPr>
+          <w:color w:val="C00000"/>
+          <w:lang w:val="en-US"/>
+        </w:rPr>
+        <w:t>having only 0.</w:t>
+      </w:r>
+      <w:r>
+        <w:rPr>
+          <w:color w:val="C00000"/>
+          <w:lang w:val="en-US"/>
+        </w:rPr>
+        <w:t>75</w:t>
+      </w:r>
+      <w:r>
+        <w:rPr>
+          <w:color w:val="C00000"/>
+          <w:lang w:val="en-US"/>
+        </w:rPr>
+        <w:t xml:space="preserve"> unit)</w:t>
+      </w:r>
+    </w:p>
+    <w:p>
+      <w:pPr>
+        <w:rPr>
+          <w:i/>
+          <w:iCs/>
+          <w:lang w:val="en-US"/>
+        </w:rPr>
+      </w:pPr>
+      <w:proofErr w:type="spellStart"/>
+      <w:r>
+        <w:rPr>
+          <w:i/>
+          <w:iCs/>
+          <w:lang w:val="en-US"/>
+        </w:rPr>
+        <w:t>set_</w:t>
+      </w:r>
+      <w:proofErr w:type="gramStart"/>
+      <w:r>
+        <w:rPr>
+          <w:i/>
+          <w:iCs/>
+          <w:lang w:val="en-US"/>
+        </w:rPr>
+        <w:t>prior</w:t>
+      </w:r>
+      <w:proofErr w:type="spellEnd"/>
+      <w:r>
+        <w:rPr>
+          <w:i/>
+          <w:iCs/>
+          <w:lang w:val="en-US"/>
+        </w:rPr>
+        <w:t>(</w:t>
+      </w:r>
+      <w:proofErr w:type="gramEnd"/>
+      <w:r>
+        <w:rPr>
+          <w:i/>
+          <w:iCs/>
+          <w:lang w:val="en-US"/>
+        </w:rPr>
+        <w:t>"</w:t>
+      </w:r>
+      <w:proofErr w:type="gramStart"/>
+      <w:r>
+        <w:rPr>
+          <w:i/>
+          <w:iCs/>
+          <w:lang w:val="en-US"/>
+        </w:rPr>
+        <w:t>normal(</w:t>
+      </w:r>
+      <w:proofErr w:type="gramEnd"/>
+      <w:r>
+        <w:rPr>
+          <w:i/>
+          <w:iCs/>
+          <w:lang w:val="en-US"/>
+        </w:rPr>
+        <w:t xml:space="preserve">0, 1.5)", class = "b", </w:t>
+      </w:r>
+      <w:proofErr w:type="spellStart"/>
+      <w:r>
+        <w:rPr>
+          <w:i/>
+          <w:iCs/>
+          <w:lang w:val="en-US"/>
+        </w:rPr>
+        <w:t>coef</w:t>
+      </w:r>
+      <w:proofErr w:type="spellEnd"/>
+      <w:r>
+        <w:rPr>
+          <w:i/>
+          <w:iCs/>
+          <w:lang w:val="en-US"/>
+        </w:rPr>
+        <w:t xml:space="preserve"> = "</w:t>
+      </w:r>
+      <w:proofErr w:type="spellStart"/>
+      <w:r>
+        <w:rPr>
+          <w:i/>
+          <w:iCs/>
+          <w:lang w:val="en-US"/>
+        </w:rPr>
+        <w:t>p_odds_team_c</w:t>
+      </w:r>
+      <w:proofErr w:type="spellEnd"/>
+      <w:r>
+        <w:rPr>
+          <w:i/>
+          <w:iCs/>
+          <w:lang w:val="en-US"/>
+        </w:rPr>
+        <w:t>")</w:t>
+      </w:r>
+    </w:p>
+    <w:p>
+      <w:pPr>
+        <w:rPr>
+          <w:lang w:val="en-US"/>
+        </w:rPr>
+      </w:pPr>
+      <w:r>
+        <w:rPr>
+          <w:lang w:val="en-US"/>
+        </w:rPr>
+        <w:t xml:space="preserve">We are saying that a team having </w:t>
+      </w:r>
+      <w:proofErr w:type="gramStart"/>
+      <w:r>
+        <w:rPr>
+          <w:lang w:val="en-US"/>
+        </w:rPr>
+        <w:t>as</w:t>
+      </w:r>
+      <w:proofErr w:type="gramEnd"/>
+      <w:r>
+        <w:rPr>
+          <w:lang w:val="en-US"/>
+        </w:rPr>
+        <w:t xml:space="preserve"> 0.75 chance of </w:t>
+      </w:r>
+      <w:proofErr w:type="spellStart"/>
+      <w:proofErr w:type="gramStart"/>
+      <w:r>
+        <w:rPr>
+          <w:lang w:val="en-US"/>
+        </w:rPr>
+        <w:t>wining</w:t>
+      </w:r>
+      <w:proofErr w:type="spellEnd"/>
+      <w:proofErr w:type="gramEnd"/>
+      <w:r>
+        <w:rPr>
+          <w:lang w:val="en-US"/>
+        </w:rPr>
+        <w:t xml:space="preserve"> compared to 0.05 changes the probability of a goal to be </w:t>
+      </w:r>
+      <w:proofErr w:type="gramStart"/>
+      <w:r>
+        <w:rPr>
+          <w:lang w:val="en-US"/>
+        </w:rPr>
+        <w:t>between  (0.00q ;</w:t>
+      </w:r>
+      <w:proofErr w:type="gramEnd"/>
+      <w:r>
+        <w:rPr>
+          <w:lang w:val="en-US"/>
+        </w:rPr>
+        <w:t xml:space="preserve"> 0.08) so 0.0</w:t>
+      </w:r>
+      <w:r>
+        <w:rPr>
+          <w:lang w:val="en-US"/>
+        </w:rPr>
+        <w:t>1</w:t>
+      </w:r>
+      <w:r>
+        <w:rPr>
+          <w:lang w:val="en-US"/>
+        </w:rPr>
+        <w:t>% to 8.6%.</w:t>
+      </w:r>
+    </w:p>
+    <w:p>
+      <w:pPr>
+        <w:rPr>
+          <w:i/>
+          <w:iCs/>
+          <w:lang w:val="en-US"/>
+        </w:rPr>
+      </w:pPr>
+    </w:p>
+    <w:p>
+      <w:pPr>
+        <w:rPr>
+          <w:lang w:val="en-US"/>
+        </w:rPr>
+      </w:pPr>
+      <w:r>
+        <w:rPr>
+          <w:lang w:val="en-US"/>
+        </w:rPr>
+        <w:t xml:space="preserve"># </w:t>
+      </w:r>
+      <w:proofErr w:type="spellStart"/>
+      <w:r>
+        <w:rPr>
+          <w:lang w:val="en-US"/>
+        </w:rPr>
+        <w:t>p_odds_</w:t>
+      </w:r>
+      <w:r>
+        <w:rPr>
+          <w:lang w:val="en-US"/>
+        </w:rPr>
+        <w:t>draw</w:t>
+      </w:r>
+      <w:proofErr w:type="spellEnd"/>
+      <w:r>
+        <w:rPr>
+          <w:lang w:val="en-US"/>
+        </w:rPr>
+        <w:t xml:space="preserve"> </w:t>
+      </w:r>
+      <w:r>
+        <w:rPr>
+          <w:lang w:val="en-US"/>
+        </w:rPr>
+        <w:t>goes from 0.</w:t>
+      </w:r>
+      <w:r>
+        <w:rPr>
+          <w:lang w:val="en-US"/>
+        </w:rPr>
+        <w:t>14</w:t>
+      </w:r>
+      <w:r>
+        <w:rPr>
+          <w:lang w:val="en-US"/>
+        </w:rPr>
+        <w:t xml:space="preserve"> to 0.</w:t>
+      </w:r>
+      <w:r>
+        <w:rPr>
+          <w:lang w:val="en-US"/>
+        </w:rPr>
+        <w:t xml:space="preserve">33, </w:t>
+      </w:r>
+      <w:r>
+        <w:rPr>
+          <w:lang w:val="en-US"/>
+        </w:rPr>
+        <w:t>o 0.</w:t>
+      </w:r>
+      <w:r>
+        <w:rPr>
+          <w:lang w:val="en-US"/>
+        </w:rPr>
+        <w:t>19</w:t>
+      </w:r>
+      <w:r>
+        <w:rPr>
+          <w:lang w:val="en-US"/>
+        </w:rPr>
+        <w:t xml:space="preserve"> unit</w:t>
+      </w:r>
+      <w:r>
+        <w:rPr>
+          <w:lang w:val="en-US"/>
+        </w:rPr>
+        <w:t xml:space="preserve">s </w:t>
+      </w:r>
+      <w:r>
+        <w:rPr>
+          <w:color w:val="C00000"/>
+          <w:lang w:val="en-US"/>
+        </w:rPr>
+        <w:t>(</w:t>
+      </w:r>
+      <w:r>
+        <w:rPr>
+          <w:color w:val="C00000"/>
+          <w:lang w:val="en-US"/>
+        </w:rPr>
+        <w:t>increased</w:t>
+      </w:r>
+      <w:r>
+        <w:rPr>
+          <w:color w:val="C00000"/>
+          <w:lang w:val="en-US"/>
+        </w:rPr>
+        <w:t xml:space="preserve"> effect to adjust for </w:t>
+      </w:r>
+      <w:r>
+        <w:rPr>
+          <w:color w:val="C00000"/>
+          <w:lang w:val="en-US"/>
+        </w:rPr>
+        <w:t>having only 0.19 unit)</w:t>
+      </w:r>
+    </w:p>
+    <w:p>
+      <w:pPr>
+        <w:rPr>
+          <w:i/>
+          <w:iCs/>
+          <w:lang w:val="en-US"/>
+        </w:rPr>
+      </w:pPr>
+      <w:proofErr w:type="spellStart"/>
+      <w:r>
+        <w:rPr>
+          <w:i/>
+          <w:iCs/>
+          <w:lang w:val="en-US"/>
+        </w:rPr>
+        <w:t>set_</w:t>
+      </w:r>
+      <w:proofErr w:type="gramStart"/>
+      <w:r>
+        <w:rPr>
+          <w:i/>
+          <w:iCs/>
+          <w:lang w:val="en-US"/>
+        </w:rPr>
+        <w:t>prior</w:t>
+      </w:r>
+      <w:proofErr w:type="spellEnd"/>
+      <w:r>
+        <w:rPr>
+          <w:i/>
+          <w:iCs/>
+          <w:lang w:val="en-US"/>
+        </w:rPr>
+        <w:t>(</w:t>
+      </w:r>
+      <w:proofErr w:type="gramEnd"/>
+      <w:r>
+        <w:rPr>
+          <w:i/>
+          <w:iCs/>
+          <w:lang w:val="en-US"/>
+        </w:rPr>
+        <w:t>"</w:t>
+      </w:r>
+      <w:proofErr w:type="gramStart"/>
+      <w:r>
+        <w:rPr>
+          <w:i/>
+          <w:iCs/>
+          <w:lang w:val="en-US"/>
+        </w:rPr>
+        <w:t>normal(</w:t>
+      </w:r>
+      <w:proofErr w:type="gramEnd"/>
+      <w:r>
+        <w:rPr>
+          <w:i/>
+          <w:iCs/>
+          <w:lang w:val="en-US"/>
+        </w:rPr>
+        <w:t xml:space="preserve">0, 2.5)", class = "b", </w:t>
+      </w:r>
+      <w:proofErr w:type="spellStart"/>
+      <w:r>
+        <w:rPr>
+          <w:i/>
+          <w:iCs/>
+          <w:lang w:val="en-US"/>
+        </w:rPr>
+        <w:t>coef</w:t>
+      </w:r>
+      <w:proofErr w:type="spellEnd"/>
+      <w:r>
+        <w:rPr>
+          <w:i/>
+          <w:iCs/>
+          <w:lang w:val="en-US"/>
+        </w:rPr>
+        <w:t xml:space="preserve"> = "</w:t>
+      </w:r>
+      <w:proofErr w:type="spellStart"/>
+      <w:r>
+        <w:rPr>
+          <w:i/>
+          <w:iCs/>
+          <w:lang w:val="en-US"/>
+        </w:rPr>
+        <w:t>p_odds_draw_c</w:t>
+      </w:r>
+      <w:proofErr w:type="spellEnd"/>
+      <w:r>
+        <w:rPr>
+          <w:i/>
+          <w:iCs/>
+          <w:lang w:val="en-US"/>
+        </w:rPr>
+        <w:t>")</w:t>
+      </w:r>
+    </w:p>
+    <w:p>
+      <w:pPr>
+        <w:rPr>
+          <w:lang w:val="en-US"/>
+        </w:rPr>
+      </w:pPr>
+      <w:r>
+        <w:rPr>
+          <w:lang w:val="en-US"/>
+        </w:rPr>
+        <w:t xml:space="preserve">We are saying that a team having </w:t>
+      </w:r>
+      <w:proofErr w:type="gramStart"/>
+      <w:r>
+        <w:rPr>
+          <w:lang w:val="en-US"/>
+        </w:rPr>
+        <w:t>as</w:t>
+      </w:r>
+      <w:proofErr w:type="gramEnd"/>
+      <w:r>
+        <w:rPr>
+          <w:lang w:val="en-US"/>
+        </w:rPr>
+        <w:t xml:space="preserve"> 0.33 chance of </w:t>
+      </w:r>
+      <w:proofErr w:type="gramStart"/>
+      <w:r>
+        <w:rPr>
+          <w:lang w:val="en-US"/>
+        </w:rPr>
+        <w:t>an</w:t>
+      </w:r>
+      <w:proofErr w:type="gramEnd"/>
+      <w:r>
+        <w:rPr>
+          <w:lang w:val="en-US"/>
+        </w:rPr>
+        <w:t xml:space="preserve"> draw compared to 0.14changes the probability of a goal to be </w:t>
+      </w:r>
+      <w:proofErr w:type="gramStart"/>
+      <w:r>
+        <w:rPr>
+          <w:lang w:val="en-US"/>
+        </w:rPr>
+        <w:t>between  (0.003 ;</w:t>
+      </w:r>
+      <w:proofErr w:type="gramEnd"/>
+      <w:r>
+        <w:rPr>
+          <w:lang w:val="en-US"/>
+        </w:rPr>
+        <w:t xml:space="preserve"> 0.025) so 0.03% to 2.5%.</w:t>
+      </w:r>
+    </w:p>
+    <w:p>
+      <w:pPr>
+        <w:rPr>
+          <w:lang w:val="en-US"/>
+        </w:rPr>
+      </w:pPr>
+    </w:p>
+    <w:p>
+      <w:pPr>
+        <w:rPr>
+          <w:lang w:val="en-US"/>
+        </w:rPr>
+      </w:pPr>
+      <w:r>
+        <w:rPr>
+          <w:noProof/>
+          <w:lang w:val="en-US"/>
+        </w:rPr>
+        <w:lastRenderedPageBreak/>
+        <w:drawing>
+          <wp:inline distT="0" distB="0" distL="0" distR="0" wp14:anchorId="4C8CC837" wp14:editId="015DE7C3">
+            <wp:extent cx="5765385" cy="3562185"/>
+            <wp:effectExtent l="0" t="0" r="6985" b="635"/>
+            <wp:docPr id="1581924712" name="Grafik 10"/>
+            <wp:cNvGraphicFramePr>
+              <a:graphicFrameLocks xmlns:a="http://schemas.openxmlformats.org/drawingml/2006/main" noChangeAspect="1"/>
+            </wp:cNvGraphicFramePr>
+            <a:graphic xmlns:a="http://schemas.openxmlformats.org/drawingml/2006/main">
+              <a:graphicData uri="http://schemas.openxmlformats.org/drawingml/2006/picture">
+                <pic:pic xmlns:pic="http://schemas.openxmlformats.org/drawingml/2006/picture">
+                  <pic:nvPicPr>
+                    <pic:cNvPr id="0" name="Picture 10"/>
+                    <pic:cNvPicPr>
+                      <a:picLocks noChangeAspect="1" noChangeArrowheads="1"/>
+                    </pic:cNvPicPr>
+                  </pic:nvPicPr>
+                  <pic:blipFill>
+                    <a:blip r:embed="rId11" cstate="print">
+                      <a:extLst>
+                        <a:ext uri="{28A0092B-C50C-407E-A947-70E740481C1C}">
+                          <a14:useLocalDpi xmlns:a14="http://schemas.microsoft.com/office/drawing/2010/main" val="0"/>
+                        </a:ext>
+                      </a:extLst>
+                    </a:blip>
+                    <a:srcRect/>
+                    <a:stretch>
+                      <a:fillRect/>
+                    </a:stretch>
+                  </pic:blipFill>
+                  <pic:spPr bwMode="auto">
+                    <a:xfrm>
+                      <a:off x="0" y="0"/>
+                      <a:ext cx="5795835" cy="3580998"/>
+                    </a:xfrm>
+                    <a:prstGeom prst="rect">
+                      <a:avLst/>
+                    </a:prstGeom>
+                    <a:noFill/>
+                  </pic:spPr>
+                </pic:pic>
+              </a:graphicData>
+            </a:graphic>
+          </wp:inline>
+        </w:drawing>
+      </w:r>
+    </w:p>
+    <w:p>
+      <w:r>
+        <w:t xml:space="preserve">Eventuell sogar </w:t>
+      </w:r>
+      <w:r>
+        <w:t>leicht zu optimistisch?</w:t>
+      </w:r>
+    </w:p>
+    <w:p/>
+    <w:p>
+      <w:pPr>
+        <w:rPr>
+          <w:u w:val="single"/>
+        </w:rPr>
+      </w:pPr>
+      <w:proofErr w:type="spellStart"/>
+      <w:r>
+        <w:rPr>
+          <w:u w:val="single"/>
+        </w:rPr>
+        <w:t>Column</w:t>
+      </w:r>
+      <w:proofErr w:type="spellEnd"/>
+      <w:r>
+        <w:rPr>
+          <w:u w:val="single"/>
+        </w:rPr>
+        <w:t xml:space="preserve"> 5</w:t>
+      </w:r>
+    </w:p>
+    <w:p>
+      <w:pPr>
+        <w:rPr>
+          <w:u w:val="single"/>
+        </w:rPr>
+      </w:pPr>
+    </w:p>
+    <w:p>
+      <w:pPr>
+        <w:rPr>
+          <w:u w:val="single"/>
+        </w:rPr>
+      </w:pPr>
+    </w:p>
+    <w:p>
+      <w:pPr>
+        <w:pStyle w:val="berschrift1"/>
+      </w:pPr>
+      <w:r>
         <w:t>Logit</w:t>
       </w:r>
       <w:r>
@@ -23,7 +3977,21 @@
         <w:rPr>
           <w:lang w:val="en-US"/>
         </w:rPr>
-        <w:t>We use weakly informative Normal priors centered at zero for regression coefficients. These priors regularize extreme estimates while allowing the data to dominate inference. The prior scale was chosen such that a two-standard-deviation change corresponds to a plausible change in outcome probability over the observed range of the predictor.</w:t>
+        <w:t xml:space="preserve">We use weakly informative Normal priors centered at zero for regression coefficients. These </w:t>
+      </w:r>
+      <w:proofErr w:type="gramStart"/>
+      <w:r>
+        <w:rPr>
+          <w:lang w:val="en-US"/>
+        </w:rPr>
+        <w:t>priors</w:t>
+      </w:r>
+      <w:proofErr w:type="gramEnd"/>
+      <w:r>
+        <w:rPr>
+          <w:lang w:val="en-US"/>
+        </w:rPr>
+        <w:t xml:space="preserve"> regularize extreme estimates while allowing the data to dominate inference. The prior scale was chosen such that a two-standard-deviation change corresponds to a plausible change in outcome probability over the observed range of the predictor.</w:t>
       </w:r>
     </w:p>
     <w:p>
@@ -60,7 +4028,21 @@
         <w:rPr>
           <w:lang w:val="en-US"/>
         </w:rPr>
-        <w:t>%, which we consider a reasonable upper bound.</w:t>
+        <w:t xml:space="preserve">%, which we consider a reasonable upper </w:t>
+      </w:r>
+      <w:proofErr w:type="gramStart"/>
+      <w:r>
+        <w:rPr>
+          <w:lang w:val="en-US"/>
+        </w:rPr>
+        <w:t>bound</w:t>
+      </w:r>
+      <w:proofErr w:type="gramEnd"/>
+      <w:r>
+        <w:rPr>
+          <w:lang w:val="en-US"/>
+        </w:rPr>
+        <w:t>.</w:t>
       </w:r>
     </w:p>
     <w:p>
@@ -126,6 +4108,7 @@
           <w:noProof/>
           <w:color w:val="525252" w:themeColor="accent3" w:themeShade="80"/>
         </w:rPr>
+        <w:lastRenderedPageBreak/>
         <w:drawing>
           <wp:inline distT="0" distB="0" distL="0" distR="0" wp14:anchorId="0F4B5A30" wp14:editId="2E9583EA">
             <wp:extent cx="4152900" cy="3182679"/>
@@ -144,7 +4127,7 @@
                     </pic:cNvPicPr>
                   </pic:nvPicPr>
                   <pic:blipFill>
-                    <a:blip r:embed="rId5">
+                    <a:blip r:embed="rId12">
                       <a:extLst>
                         <a:ext uri="{28A0092B-C50C-407E-A947-70E740481C1C}">
                           <a14:useLocalDpi xmlns:a14="http://schemas.microsoft.com/office/drawing/2010/main" val="0"/>
@@ -604,7 +4587,6 @@
         <w:rPr>
           <w:color w:val="525252" w:themeColor="accent3" w:themeShade="80"/>
         </w:rPr>
-        <w:lastRenderedPageBreak/>
         <w:t>In die Formel gepackt heißt es bei x=</w:t>
       </w:r>
       <w:r>
@@ -1078,7 +5060,21 @@
         <w:rPr>
           <w:color w:val="525252" w:themeColor="accent3" w:themeShade="80"/>
         </w:rPr>
-        <w:t>Idee, können wir eine Inversionsformel erstellen? Quasi wir wollen das der Effekt so viel ist, wie müssen wir dann die Priors setzen?</w:t>
+        <w:t xml:space="preserve">Idee, können wir eine Inversionsformel erstellen? Quasi wir wollen das der Effekt so viel ist, wie müssen wir dann </w:t>
+      </w:r>
+      <w:proofErr w:type="gramStart"/>
+      <w:r>
+        <w:rPr>
+          <w:color w:val="525252" w:themeColor="accent3" w:themeShade="80"/>
+        </w:rPr>
+        <w:t>die Priors</w:t>
+      </w:r>
+      <w:proofErr w:type="gramEnd"/>
+      <w:r>
+        <w:rPr>
+          <w:color w:val="525252" w:themeColor="accent3" w:themeShade="80"/>
+        </w:rPr>
+        <w:t xml:space="preserve"> setzen?</w:t>
       </w:r>
     </w:p>
     <w:p>
@@ -1094,6 +5090,7 @@
           <w:rFonts w:eastAsiaTheme="minorEastAsia"/>
           <w:color w:val="525252" w:themeColor="accent3" w:themeShade="80"/>
         </w:rPr>
+        <w:lastRenderedPageBreak/>
         <w:t xml:space="preserve">Ziel aus </w:t>
       </w:r>
       <m:oMath>
@@ -1858,7 +5855,13 @@
         <w:rPr>
           <w:lang w:val="en-US"/>
         </w:rPr>
-        <w:t>in table 2</w:t>
+        <w:t>for</w:t>
+      </w:r>
+      <w:r>
+        <w:rPr>
+          <w:lang w:val="en-US"/>
+        </w:rPr>
+        <w:t xml:space="preserve"> table 2</w:t>
       </w:r>
       <w:r>
         <w:rPr>
@@ -1886,8 +5889,9 @@
           <w:lang w:val="en-US" w:eastAsia="en-US"/>
           <w14:ligatures w14:val="standardContextual"/>
         </w:rPr>
-        <w:t xml:space="preserve">At first glance, with nearly 50,000 observations, a frequentist approach may appear fully sufficient. In a narrow sense, this is true: point estimates will be similar, as the likelihood is strong and largely dominates the posterior. However, frequentist inference stops at a point estimate. Bayesian inference does not. It yields a full posterior distribution, allowing directly </w:t>
-      </w:r>
+        <w:t xml:space="preserve">At first glance, with nearly 50,000 observations, a frequentist approach may appear fully sufficient. In a narrow sense, this is true: point estimates will be similar, as the likelihood is strong and largely dominates the posterior. However, frequentist inference stops at a point </w:t>
+      </w:r>
+      <w:proofErr w:type="gramStart"/>
       <w:r>
         <w:rPr>
           <w:rFonts w:ascii="Arial" w:eastAsiaTheme="minorHAnsi" w:hAnsi="Arial" w:cstheme="minorBidi"/>
@@ -1896,13 +5900,10 @@
           <w:lang w:val="en-US" w:eastAsia="en-US"/>
           <w14:ligatures w14:val="standardContextual"/>
         </w:rPr>
-        <w:lastRenderedPageBreak/>
-        <w:t>interpretable statements such as: with 95% probability, the effect lies within this range. This is substantially more informative and practically useful than a p-value attached to a single estimate.</w:t>
-      </w:r>
-    </w:p>
-    <w:p>
-      <w:pPr>
-        <w:pStyle w:val="StandardWeb"/>
+        <w:t>estimate</w:t>
+      </w:r>
+      <w:proofErr w:type="gramEnd"/>
+      <w:r>
         <w:rPr>
           <w:rFonts w:ascii="Arial" w:eastAsiaTheme="minorHAnsi" w:hAnsi="Arial" w:cstheme="minorBidi"/>
           <w:kern w:val="2"/>
@@ -1910,7 +5911,9 @@
           <w:lang w:val="en-US" w:eastAsia="en-US"/>
           <w14:ligatures w14:val="standardContextual"/>
         </w:rPr>
-      </w:pPr>
+        <w:t xml:space="preserve">. Bayesian inference does not. It yields a full posterior distribution, allowing directly interpretable statements </w:t>
+      </w:r>
+      <w:proofErr w:type="gramStart"/>
       <w:r>
         <w:rPr>
           <w:rFonts w:ascii="Arial" w:eastAsiaTheme="minorHAnsi" w:hAnsi="Arial" w:cstheme="minorBidi"/>
@@ -1919,12 +5922,10 @@
           <w:lang w:val="en-US" w:eastAsia="en-US"/>
           <w14:ligatures w14:val="standardContextual"/>
         </w:rPr>
-        <w:t>The distinction becomes critical once the structure of the data is considered. Fifty thousand observations do not imply fifty thousand independent pieces of information. The data are deeply hierarchical: players are nested within teams, actions occur within the same five-minute sections, and information is unevenly distributed across groups. While the referenced paper uses fixed effects with clustered standard errors, this is not equivalent to a hierarchical model. Fixed effects estimate group parameters independently and do not allow for partial pooling. Clustered standard errors only adjust uncertainty; they do not change point estimates and therefore do not correct unstable or extreme group-level effects.</w:t>
-      </w:r>
-    </w:p>
-    <w:p>
-      <w:pPr>
-        <w:pStyle w:val="StandardWeb"/>
+        <w:t>such as:</w:t>
+      </w:r>
+      <w:proofErr w:type="gramEnd"/>
+      <w:r>
         <w:rPr>
           <w:rFonts w:ascii="Arial" w:eastAsiaTheme="minorHAnsi" w:hAnsi="Arial" w:cstheme="minorBidi"/>
           <w:kern w:val="2"/>
@@ -1932,8 +5933,12 @@
           <w:lang w:val="en-US" w:eastAsia="en-US"/>
           <w14:ligatures w14:val="standardContextual"/>
         </w:rPr>
-      </w:pPr>
-      <w:r>
+        <w:t xml:space="preserve"> with 95% probability, the effect lies within this range. This is substantially more informative and practically useful than a p-value attached to a single estimate.</w:t>
+      </w:r>
+    </w:p>
+    <w:p>
+      <w:pPr>
+        <w:pStyle w:val="StandardWeb"/>
         <w:rPr>
           <w:rFonts w:ascii="Arial" w:eastAsiaTheme="minorHAnsi" w:hAnsi="Arial" w:cstheme="minorBidi"/>
           <w:kern w:val="2"/>
@@ -1941,8 +5946,7 @@
           <w:lang w:val="en-US" w:eastAsia="en-US"/>
           <w14:ligatures w14:val="standardContextual"/>
         </w:rPr>
-        <w:t>Bayesian multilevel models explicitly model this structure. Through partial pooling, estimates are stabilized by borrowing strength across groups, shrinking extreme values</w:t>
-      </w:r>
+      </w:pPr>
       <w:r>
         <w:rPr>
           <w:rFonts w:ascii="Arial" w:eastAsiaTheme="minorHAnsi" w:hAnsi="Arial" w:cstheme="minorBidi"/>
@@ -1951,9 +5955,12 @@
           <w:lang w:val="en-US" w:eastAsia="en-US"/>
           <w14:ligatures w14:val="standardContextual"/>
         </w:rPr>
-        <w:t xml:space="preserve">, </w:t>
-      </w:r>
-      <w:r>
+        <w:t>The distinction becomes critical once the structure of the data is considered. Fifty thousand observations do not imply fifty thousand independent pieces of information. The data are deeply hierarchical: players are nested within teams, actions occur within the same five-minute sections, and information is unevenly distributed across groups. While the referenced paper uses fixed effects with clustered standard errors, this is not equivalent to a hierarchical model. Fixed effects estimate group parameters independently and do not allow for partial pooling. Clustered standard errors only adjust uncertainty; they do not change point estimates and therefore do not correct unstable or extreme group-level effects.</w:t>
+      </w:r>
+    </w:p>
+    <w:p>
+      <w:pPr>
+        <w:pStyle w:val="StandardWeb"/>
         <w:rPr>
           <w:rFonts w:ascii="Arial" w:eastAsiaTheme="minorHAnsi" w:hAnsi="Arial" w:cstheme="minorBidi"/>
           <w:kern w:val="2"/>
@@ -1961,8 +5968,7 @@
           <w:lang w:val="en-US" w:eastAsia="en-US"/>
           <w14:ligatures w14:val="standardContextual"/>
         </w:rPr>
-        <w:t>especially in sparsely observed groups</w:t>
-      </w:r>
+      </w:pPr>
       <w:r>
         <w:rPr>
           <w:rFonts w:ascii="Arial" w:eastAsiaTheme="minorHAnsi" w:hAnsi="Arial" w:cstheme="minorBidi"/>
@@ -1971,7 +5977,7 @@
           <w:lang w:val="en-US" w:eastAsia="en-US"/>
           <w14:ligatures w14:val="standardContextual"/>
         </w:rPr>
-        <w:t xml:space="preserve">, </w:t>
+        <w:t>Bayesian multilevel models explicitly model this structure. Through partial pooling, estimates are stabilized by borrowing strength across groups, shrinking extreme values</w:t>
       </w:r>
       <w:r>
         <w:rPr>
@@ -1981,12 +5987,9 @@
           <w:lang w:val="en-US" w:eastAsia="en-US"/>
           <w14:ligatures w14:val="standardContextual"/>
         </w:rPr>
-        <w:t>and producing uncertainty that reflects both within- and between-group variation. Importantly, this means the estimates themselves change in a principled way, not just their standard errors.</w:t>
-      </w:r>
-    </w:p>
-    <w:p>
-      <w:pPr>
-        <w:pStyle w:val="StandardWeb"/>
+        <w:t xml:space="preserve">, </w:t>
+      </w:r>
+      <w:r>
         <w:rPr>
           <w:rFonts w:ascii="Arial" w:eastAsiaTheme="minorHAnsi" w:hAnsi="Arial" w:cstheme="minorBidi"/>
           <w:kern w:val="2"/>
@@ -1994,7 +5997,8 @@
           <w:lang w:val="en-US" w:eastAsia="en-US"/>
           <w14:ligatures w14:val="standardContextual"/>
         </w:rPr>
-      </w:pPr>
+        <w:t>especially in sparsely observed groups</w:t>
+      </w:r>
       <w:r>
         <w:rPr>
           <w:rFonts w:ascii="Arial" w:eastAsiaTheme="minorHAnsi" w:hAnsi="Arial" w:cstheme="minorBidi"/>
@@ -2003,7 +6007,7 @@
           <w:lang w:val="en-US" w:eastAsia="en-US"/>
           <w14:ligatures w14:val="standardContextual"/>
         </w:rPr>
-        <w:t>Beyond estimation, Bayesian methods allow direct assessment of generalizability using tools such as LOO cross-validation, enabling systematic comparison of predictive performance across models</w:t>
+        <w:t xml:space="preserve">, </w:t>
       </w:r>
       <w:r>
         <w:rPr>
@@ -2013,9 +6017,12 @@
           <w:lang w:val="en-US" w:eastAsia="en-US"/>
           <w14:ligatures w14:val="standardContextual"/>
         </w:rPr>
-        <w:t xml:space="preserve">, </w:t>
-      </w:r>
-      <w:r>
+        <w:t>and producing uncertainty that reflects both within- and between-group variation. Importantly, this means the estimates themselves change in a principled way, not just their standard errors.</w:t>
+      </w:r>
+    </w:p>
+    <w:p>
+      <w:pPr>
+        <w:pStyle w:val="StandardWeb"/>
         <w:rPr>
           <w:rFonts w:ascii="Arial" w:eastAsiaTheme="minorHAnsi" w:hAnsi="Arial" w:cstheme="minorBidi"/>
           <w:kern w:val="2"/>
@@ -2023,12 +6030,8 @@
           <w:lang w:val="en-US" w:eastAsia="en-US"/>
           <w14:ligatures w14:val="standardContextual"/>
         </w:rPr>
-        <w:t>something that is not addressed in the frequentist framework used in the paper. Finally, priors and prior predictive checks force explicit modeling assumptions and allow us to assess whether our understanding of the problem is coherent even before observing the data.</w:t>
-      </w:r>
-    </w:p>
-    <w:p>
-      <w:pPr>
-        <w:pStyle w:val="StandardWeb"/>
+      </w:pPr>
+      <w:r>
         <w:rPr>
           <w:rFonts w:ascii="Arial" w:eastAsiaTheme="minorHAnsi" w:hAnsi="Arial" w:cstheme="minorBidi"/>
           <w:kern w:val="2"/>
@@ -2036,7 +6039,9 @@
           <w:lang w:val="en-US" w:eastAsia="en-US"/>
           <w14:ligatures w14:val="standardContextual"/>
         </w:rPr>
-      </w:pPr>
+        <w:lastRenderedPageBreak/>
+        <w:t>Beyond estimation, Bayesian methods allow direct assessment of generalizability using tools such as LOO cross-validation, enabling systematic comparison of predictive performance across models</w:t>
+      </w:r>
       <w:r>
         <w:rPr>
           <w:rFonts w:ascii="Arial" w:eastAsiaTheme="minorHAnsi" w:hAnsi="Arial" w:cstheme="minorBidi"/>
@@ -2045,7 +6050,7 @@
           <w:lang w:val="en-US" w:eastAsia="en-US"/>
           <w14:ligatures w14:val="standardContextual"/>
         </w:rPr>
-        <w:t>Bayesian models are computationally more demanding. In return, they provide stabilized estimates, interpretable uncertainty, improved generalization, and greater transparency. With complex, hierarchical data, this is not an unnecessary complication</w:t>
+        <w:t xml:space="preserve">, </w:t>
       </w:r>
       <w:r>
         <w:rPr>
@@ -2055,9 +6060,12 @@
           <w:lang w:val="en-US" w:eastAsia="en-US"/>
           <w14:ligatures w14:val="standardContextual"/>
         </w:rPr>
-        <w:t xml:space="preserve">, </w:t>
-      </w:r>
-      <w:r>
+        <w:t>something that is not addressed in the frequentist framework used in the paper. Finally, priors and prior predictive checks force explicit modeling assumptions and allow us to assess whether our understanding of the problem is coherent even before observing the data.</w:t>
+      </w:r>
+    </w:p>
+    <w:p>
+      <w:pPr>
+        <w:pStyle w:val="StandardWeb"/>
         <w:rPr>
           <w:rFonts w:ascii="Arial" w:eastAsiaTheme="minorHAnsi" w:hAnsi="Arial" w:cstheme="minorBidi"/>
           <w:kern w:val="2"/>
@@ -2065,6 +6073,35 @@
           <w:lang w:val="en-US" w:eastAsia="en-US"/>
           <w14:ligatures w14:val="standardContextual"/>
         </w:rPr>
+      </w:pPr>
+      <w:r>
+        <w:rPr>
+          <w:rFonts w:ascii="Arial" w:eastAsiaTheme="minorHAnsi" w:hAnsi="Arial" w:cstheme="minorBidi"/>
+          <w:kern w:val="2"/>
+          <w:sz w:val="22"/>
+          <w:lang w:val="en-US" w:eastAsia="en-US"/>
+          <w14:ligatures w14:val="standardContextual"/>
+        </w:rPr>
+        <w:t>Bayesian models are computationally more demanding. In return, they provide stabilized estimates, interpretable uncertainty, improved generalization, and greater transparency. With complex, hierarchical data, this is not an unnecessary complication</w:t>
+      </w:r>
+      <w:r>
+        <w:rPr>
+          <w:rFonts w:ascii="Arial" w:eastAsiaTheme="minorHAnsi" w:hAnsi="Arial" w:cstheme="minorBidi"/>
+          <w:kern w:val="2"/>
+          <w:sz w:val="22"/>
+          <w:lang w:val="en-US" w:eastAsia="en-US"/>
+          <w14:ligatures w14:val="standardContextual"/>
+        </w:rPr>
+        <w:t xml:space="preserve">, </w:t>
+      </w:r>
+      <w:r>
+        <w:rPr>
+          <w:rFonts w:ascii="Arial" w:eastAsiaTheme="minorHAnsi" w:hAnsi="Arial" w:cstheme="minorBidi"/>
+          <w:kern w:val="2"/>
+          <w:sz w:val="22"/>
+          <w:lang w:val="en-US" w:eastAsia="en-US"/>
+          <w14:ligatures w14:val="standardContextual"/>
+        </w:rPr>
         <w:t>it is the approach that matches the structure of the problem.</w:t>
       </w:r>
     </w:p>
@@ -2151,21 +6188,19 @@
         <w:rPr>
           <w:lang w:val="en-US"/>
         </w:rPr>
-        <w:t xml:space="preserve"> instead of </w:t>
-      </w:r>
-      <w:proofErr w:type="spellStart"/>
-      <w:r>
-        <w:rPr>
-          <w:lang w:val="en-US"/>
-        </w:rPr>
-        <w:t>ficed</w:t>
-      </w:r>
-      <w:proofErr w:type="spellEnd"/>
-      <w:r>
-        <w:rPr>
-          <w:lang w:val="en-US"/>
-        </w:rPr>
-        <w:t xml:space="preserve"> effects.)</w:t>
+        <w:t xml:space="preserve"> instead of fi</w:t>
+      </w:r>
+      <w:r>
+        <w:rPr>
+          <w:lang w:val="en-US"/>
+        </w:rPr>
+        <w:t>x</w:t>
+      </w:r>
+      <w:r>
+        <w:rPr>
+          <w:lang w:val="en-US"/>
+        </w:rPr>
+        <w:t>ed effects.)</w:t>
       </w:r>
     </w:p>
     <w:p>
@@ -2208,14 +6243,28 @@
         <w:rPr>
           <w:lang w:val="en-US"/>
         </w:rPr>
-        <w:t>Mcmc_areas</w:t>
-      </w:r>
-      <w:proofErr w:type="spellEnd"/>
-      <w:r>
-        <w:rPr>
-          <w:lang w:val="en-US"/>
-        </w:rPr>
-        <w:t>() plot</w:t>
+        <w:t>Mcmc_</w:t>
+      </w:r>
+      <w:proofErr w:type="gramStart"/>
+      <w:r>
+        <w:rPr>
+          <w:lang w:val="en-US"/>
+        </w:rPr>
+        <w:t>areas</w:t>
+      </w:r>
+      <w:proofErr w:type="spellEnd"/>
+      <w:r>
+        <w:rPr>
+          <w:lang w:val="en-US"/>
+        </w:rPr>
+        <w:t>(</w:t>
+      </w:r>
+      <w:proofErr w:type="gramEnd"/>
+      <w:r>
+        <w:rPr>
+          <w:lang w:val="en-US"/>
+        </w:rPr>
+        <w:t>) plot</w:t>
       </w:r>
     </w:p>
     <w:p>
@@ -2233,8 +6282,30 @@
         <w:rPr>
           <w:lang w:val="en-US"/>
         </w:rPr>
-        <w:t>Loo comparison of a tables models</w:t>
-      </w:r>
+        <w:t xml:space="preserve">Loo comparison of a </w:t>
+      </w:r>
+      <w:proofErr w:type="gramStart"/>
+      <w:r>
+        <w:rPr>
+          <w:lang w:val="en-US"/>
+        </w:rPr>
+        <w:t>tables</w:t>
+      </w:r>
+      <w:proofErr w:type="gramEnd"/>
+      <w:r>
+        <w:rPr>
+          <w:lang w:val="en-US"/>
+        </w:rPr>
+        <w:t xml:space="preserve"> models</w:t>
+      </w:r>
+    </w:p>
+    <w:p>
+      <w:pPr>
+        <w:pStyle w:val="berschrift1"/>
+        <w:rPr>
+          <w:lang w:val="en-US"/>
+        </w:rPr>
+      </w:pPr>
     </w:p>
     <w:p>
       <w:pPr>
@@ -2298,7 +6369,7 @@
                 <wp:cNvGraphicFramePr/>
                 <a:graphic xmlns:a="http://schemas.openxmlformats.org/drawingml/2006/main">
                   <a:graphicData uri="http://schemas.microsoft.com/office/word/2010/wordprocessingInk">
-                    <w14:contentPart bwMode="auto" r:id="rId6">
+                    <w14:contentPart bwMode="auto" r:id="rId13">
                       <w14:nvContentPartPr>
                         <w14:cNvContentPartPr/>
                       </w14:nvContentPartPr>
@@ -2334,13 +6405,13 @@
                 <o:lock v:ext="edit" aspectratio="t"/>
               </v:shapetype>
               <v:shape id="Freihand 4" o:spid="_x0000_s1026" type="#_x0000_t75" style="position:absolute;margin-left:295.6pt;margin-top:378.15pt;width:23.45pt;height:22.75pt;z-index:251659264;visibility:visible;mso-wrap-style:square;mso-wrap-distance-left:9pt;mso-wrap-distance-top:0;mso-wrap-distance-right:9pt;mso-wrap-distance-bottom:0;mso-position-horizontal:absolute;mso-position-horizontal-relative:text;mso-position-vertical:absolute;mso-position-vertical-relative:text" o:gfxdata="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">
-                <v:imagedata r:id="rId7" o:title=""/>
+                <v:imagedata r:id="rId14" o:title=""/>
               </v:shape>
             </w:pict>
           </mc:Fallback>
         </mc:AlternateContent>
       </w:r>
-      <w:hyperlink r:id="rId8" w:anchor="Regular_season_table" w:history="1">
+      <w:hyperlink r:id="rId15" w:anchor="Regular_season_table" w:history="1">
         <w:r>
           <w:rPr>
             <w:rStyle w:val="Hyperlink"/>
@@ -2453,7 +6524,7 @@
                     </pic:cNvPicPr>
                   </pic:nvPicPr>
                   <pic:blipFill>
-                    <a:blip r:embed="rId9">
+                    <a:blip r:embed="rId16">
                       <a:extLst>
                         <a:ext uri="{28A0092B-C50C-407E-A947-70E740481C1C}">
                           <a14:useLocalDpi xmlns:a14="http://schemas.microsoft.com/office/drawing/2010/main" val="0"/>
@@ -2507,7 +6578,7 @@
                     </pic:cNvPicPr>
                   </pic:nvPicPr>
                   <pic:blipFill>
-                    <a:blip r:embed="rId10">
+                    <a:blip r:embed="rId17">
                       <a:extLst>
                         <a:ext uri="{28A0092B-C50C-407E-A947-70E740481C1C}">
                           <a14:useLocalDpi xmlns:a14="http://schemas.microsoft.com/office/drawing/2010/main" val="0"/>

</xml_diff>

<commit_message>
priors table 2 ready
</commit_message>
<xml_diff>
--- a/Report Word Version.docx
+++ b/Report Word Version.docx
@@ -5,22 +5,31 @@
     <w:p>
       <w:pPr>
         <w:pStyle w:val="berschrift1"/>
-      </w:pPr>
-      <w:r>
-        <w:t xml:space="preserve">Prior </w:t>
-      </w:r>
-      <w:proofErr w:type="spellStart"/>
-      <w:r>
-        <w:t>reasoning</w:t>
-      </w:r>
-      <w:proofErr w:type="spellEnd"/>
+        <w:rPr>
+          <w:lang w:val="en-US"/>
+        </w:rPr>
+      </w:pPr>
+      <w:r>
+        <w:rPr>
+          <w:lang w:val="en-US"/>
+        </w:rPr>
+        <w:t>Prior reasoning</w:t>
+      </w:r>
     </w:p>
     <w:p>
       <w:pPr>
         <w:rPr>
           <w:u w:val="single"/>
-        </w:rPr>
-      </w:pPr>
+          <w:lang w:val="en-US"/>
+        </w:rPr>
+      </w:pPr>
+      <w:r>
+        <w:rPr>
+          <w:u w:val="single"/>
+          <w:lang w:val="en-US"/>
+        </w:rPr>
+        <w:t>Table 2</w:t>
+      </w:r>
     </w:p>
     <w:p>
       <w:pPr>
@@ -514,14 +523,7 @@
           <w:u w:val="single"/>
           <w:lang w:val="en-US"/>
         </w:rPr>
-        <w:t xml:space="preserve">Column </w:t>
-      </w:r>
-      <w:r>
-        <w:rPr>
-          <w:u w:val="single"/>
-          <w:lang w:val="en-US"/>
-        </w:rPr>
-        <w:t>2</w:t>
+        <w:t>Column 2</w:t>
       </w:r>
     </w:p>
     <w:p>
@@ -1569,24 +1571,25 @@
       </w:r>
     </w:p>
     <w:p>
-      <w:proofErr w:type="spellStart"/>
-      <w:r>
-        <w:t>Too</w:t>
-      </w:r>
-      <w:proofErr w:type="spellEnd"/>
-      <w:r>
-        <w:t xml:space="preserve"> </w:t>
-      </w:r>
-      <w:proofErr w:type="spellStart"/>
-      <w:r>
-        <w:t>wide</w:t>
-      </w:r>
-      <w:proofErr w:type="spellEnd"/>
-      <w:r>
-        <w:t>.</w:t>
-      </w:r>
-    </w:p>
-    <w:p/>
+      <w:pPr>
+        <w:rPr>
+          <w:lang w:val="en-US"/>
+        </w:rPr>
+      </w:pPr>
+      <w:r>
+        <w:rPr>
+          <w:lang w:val="en-US"/>
+        </w:rPr>
+        <w:t>Too wide.</w:t>
+      </w:r>
+    </w:p>
+    <w:p>
+      <w:pPr>
+        <w:rPr>
+          <w:lang w:val="en-US"/>
+        </w:rPr>
+      </w:pPr>
+    </w:p>
     <w:p>
       <w:pPr>
         <w:rPr>
@@ -2183,13 +2186,7 @@
         <w:rPr>
           <w:lang w:val="en-US"/>
         </w:rPr>
-        <w:t>dteamred_pre</w:t>
-      </w:r>
-      <w:r>
-        <w:rPr>
-          <w:lang w:val="en-US"/>
-        </w:rPr>
-        <w:t xml:space="preserve"> </w:t>
+        <w:t xml:space="preserve">dteamred_pre </w:t>
       </w:r>
       <w:r>
         <w:rPr>
@@ -2690,9 +2687,9 @@
         </w:rPr>
         <w:lastRenderedPageBreak/>
         <w:drawing>
-          <wp:inline distT="0" distB="0" distL="0" distR="0" wp14:anchorId="0FC0983B" wp14:editId="29026E30">
-            <wp:extent cx="5765385" cy="3562184"/>
-            <wp:effectExtent l="0" t="0" r="6985" b="635"/>
+          <wp:inline distT="0" distB="0" distL="0" distR="0" wp14:anchorId="0FC0983B" wp14:editId="2DB388F2">
+            <wp:extent cx="4794637" cy="2962400"/>
+            <wp:effectExtent l="0" t="0" r="6350" b="0"/>
             <wp:docPr id="940898574" name="Grafik 9"/>
             <wp:cNvGraphicFramePr>
               <a:graphicFrameLocks xmlns:a="http://schemas.openxmlformats.org/drawingml/2006/main" noChangeAspect="1"/>
@@ -2722,7 +2719,7 @@
                   <pic:spPr bwMode="auto">
                     <a:xfrm>
                       <a:off x="0" y="0"/>
-                      <a:ext cx="5803682" cy="3585846"/>
+                      <a:ext cx="4834666" cy="2987132"/>
                     </a:xfrm>
                     <a:prstGeom prst="rect">
                       <a:avLst/>
@@ -2849,14 +2846,51 @@
       </w:r>
     </w:p>
     <w:p>
-      <w:r>
-        <w:t>Wieder zu oft 1 geschätzt.</w:t>
+      <w:pPr>
+        <w:rPr>
+          <w:lang w:val="en-US"/>
+        </w:rPr>
+      </w:pPr>
+      <w:r>
+        <w:rPr>
+          <w:lang w:val="en-US"/>
+        </w:rPr>
+        <w:t xml:space="preserve">Wieder </w:t>
+      </w:r>
+      <w:proofErr w:type="spellStart"/>
+      <w:r>
+        <w:rPr>
+          <w:lang w:val="en-US"/>
+        </w:rPr>
+        <w:t>zu</w:t>
+      </w:r>
+      <w:proofErr w:type="spellEnd"/>
+      <w:r>
+        <w:rPr>
+          <w:lang w:val="en-US"/>
+        </w:rPr>
+        <w:t xml:space="preserve"> oft 1 </w:t>
+      </w:r>
+      <w:proofErr w:type="spellStart"/>
+      <w:r>
+        <w:rPr>
+          <w:lang w:val="en-US"/>
+        </w:rPr>
+        <w:t>geschätzt</w:t>
+      </w:r>
+      <w:proofErr w:type="spellEnd"/>
+      <w:r>
+        <w:rPr>
+          <w:lang w:val="en-US"/>
+        </w:rPr>
+        <w:t>.</w:t>
       </w:r>
     </w:p>
     <w:p>
       <w:pPr>
         <w:rPr>
           <w:u w:val="single"/>
+          <w:lang w:val="en-US"/>
         </w:rPr>
       </w:pPr>
     </w:p>
@@ -2929,7 +2963,242 @@
           <w:iCs/>
           <w:lang w:val="en-US"/>
         </w:rPr>
+        <w:t>set_</w:t>
+      </w:r>
+      <w:proofErr w:type="gramStart"/>
+      <w:r>
+        <w:rPr>
+          <w:i/>
+          <w:iCs/>
+          <w:lang w:val="en-US"/>
+        </w:rPr>
+        <w:t>prior</w:t>
+      </w:r>
+      <w:proofErr w:type="spellEnd"/>
+      <w:r>
+        <w:rPr>
+          <w:i/>
+          <w:iCs/>
+          <w:lang w:val="en-US"/>
+        </w:rPr>
+        <w:t>(</w:t>
+      </w:r>
+      <w:proofErr w:type="gramEnd"/>
+      <w:r>
+        <w:rPr>
+          <w:i/>
+          <w:iCs/>
+          <w:lang w:val="en-US"/>
+        </w:rPr>
+        <w:t>"</w:t>
+      </w:r>
+      <w:proofErr w:type="gramStart"/>
+      <w:r>
+        <w:rPr>
+          <w:i/>
+          <w:iCs/>
+          <w:lang w:val="en-US"/>
+        </w:rPr>
+        <w:t>normal(</w:t>
+      </w:r>
+      <w:proofErr w:type="gramEnd"/>
+      <w:r>
+        <w:rPr>
+          <w:i/>
+          <w:iCs/>
+          <w:lang w:val="en-US"/>
+        </w:rPr>
+        <w:t xml:space="preserve">0, 4.8e-05)", class = "b", </w:t>
+      </w:r>
+      <w:proofErr w:type="spellStart"/>
+      <w:r>
+        <w:rPr>
+          <w:i/>
+          <w:iCs/>
+          <w:lang w:val="en-US"/>
+        </w:rPr>
+        <w:t>coef</w:t>
+      </w:r>
+      <w:proofErr w:type="spellEnd"/>
+      <w:r>
+        <w:rPr>
+          <w:i/>
+          <w:iCs/>
+          <w:lang w:val="en-US"/>
+        </w:rPr>
+        <w:t xml:space="preserve"> = "</w:t>
+      </w:r>
+      <w:proofErr w:type="spellStart"/>
+      <w:r>
+        <w:rPr>
+          <w:i/>
+          <w:iCs/>
+          <w:lang w:val="en-US"/>
+        </w:rPr>
+        <w:t>team_crowd_c</w:t>
+      </w:r>
+      <w:proofErr w:type="spellEnd"/>
+      <w:r>
+        <w:rPr>
+          <w:i/>
+          <w:iCs/>
+          <w:lang w:val="en-US"/>
+        </w:rPr>
+        <w:t>")</w:t>
+      </w:r>
+    </w:p>
+    <w:p>
+      <w:pPr>
+        <w:rPr>
+          <w:lang w:val="en-US"/>
+        </w:rPr>
+      </w:pPr>
+      <w:r>
+        <w:rPr>
+          <w:lang w:val="en-US"/>
+        </w:rPr>
         <w:lastRenderedPageBreak/>
+        <w:t xml:space="preserve">We are saying that a team </w:t>
+      </w:r>
+      <w:proofErr w:type="gramStart"/>
+      <w:r>
+        <w:rPr>
+          <w:lang w:val="en-US"/>
+        </w:rPr>
+        <w:t>having  25180</w:t>
+      </w:r>
+      <w:proofErr w:type="gramEnd"/>
+      <w:r>
+        <w:rPr>
+          <w:lang w:val="en-US"/>
+        </w:rPr>
+        <w:t xml:space="preserve"> home crowd members changes the probability of scoring a goal compared to having 6 </w:t>
+      </w:r>
+      <w:proofErr w:type="spellStart"/>
+      <w:proofErr w:type="gramStart"/>
+      <w:r>
+        <w:rPr>
+          <w:lang w:val="en-US"/>
+        </w:rPr>
+        <w:t>homecrowd</w:t>
+      </w:r>
+      <w:proofErr w:type="spellEnd"/>
+      <w:proofErr w:type="gramEnd"/>
+      <w:r>
+        <w:rPr>
+          <w:lang w:val="en-US"/>
+        </w:rPr>
+        <w:t xml:space="preserve"> members by (</w:t>
+      </w:r>
+      <w:proofErr w:type="gramStart"/>
+      <w:r>
+        <w:rPr>
+          <w:lang w:val="en-US"/>
+        </w:rPr>
+        <w:t>0.0008 ;</w:t>
+      </w:r>
+      <w:proofErr w:type="gramEnd"/>
+      <w:r>
+        <w:rPr>
+          <w:lang w:val="en-US"/>
+        </w:rPr>
+        <w:t xml:space="preserve"> 0.10) so 0.01% to 10%.</w:t>
+      </w:r>
+    </w:p>
+    <w:p>
+      <w:pPr>
+        <w:rPr>
+          <w:lang w:val="en-US"/>
+        </w:rPr>
+      </w:pPr>
+    </w:p>
+    <w:p>
+      <w:pPr>
+        <w:rPr>
+          <w:lang w:val="en-US"/>
+        </w:rPr>
+      </w:pPr>
+      <w:r>
+        <w:rPr>
+          <w:lang w:val="en-US"/>
+        </w:rPr>
+        <w:t xml:space="preserve"># </w:t>
+      </w:r>
+      <w:proofErr w:type="spellStart"/>
+      <w:r>
+        <w:rPr>
+          <w:lang w:val="en-US"/>
+        </w:rPr>
+        <w:t>opp</w:t>
+      </w:r>
+      <w:r>
+        <w:rPr>
+          <w:lang w:val="en-US"/>
+        </w:rPr>
+        <w:t>_crowd</w:t>
+      </w:r>
+      <w:proofErr w:type="spellEnd"/>
+      <w:r>
+        <w:rPr>
+          <w:lang w:val="en-US"/>
+        </w:rPr>
+        <w:t xml:space="preserve"> goes from</w:t>
+      </w:r>
+      <w:r>
+        <w:rPr>
+          <w:lang w:val="en-US"/>
+        </w:rPr>
+        <w:t xml:space="preserve"> </w:t>
+      </w:r>
+      <w:r>
+        <w:rPr>
+          <w:lang w:val="en-US"/>
+        </w:rPr>
+        <w:t>6 t</w:t>
+      </w:r>
+      <w:r>
+        <w:rPr>
+          <w:lang w:val="en-US"/>
+        </w:rPr>
+        <w:t xml:space="preserve">o 25180 </w:t>
+      </w:r>
+      <w:r>
+        <w:rPr>
+          <w:color w:val="C00000"/>
+          <w:lang w:val="en-US"/>
+        </w:rPr>
+        <w:t xml:space="preserve">(reduced effect to adjust for it having </w:t>
+      </w:r>
+      <w:r>
+        <w:rPr>
+          <w:color w:val="C00000"/>
+          <w:lang w:val="en-US"/>
+        </w:rPr>
+        <w:t>25174</w:t>
+      </w:r>
+      <w:r>
+        <w:rPr>
+          <w:color w:val="C00000"/>
+          <w:lang w:val="en-US"/>
+        </w:rPr>
+        <w:t xml:space="preserve"> units)</w:t>
+      </w:r>
+    </w:p>
+    <w:p>
+      <w:pPr>
+        <w:rPr>
+          <w:i/>
+          <w:iCs/>
+          <w:lang w:val="en-US"/>
+        </w:rPr>
+      </w:pPr>
+      <w:proofErr w:type="spellStart"/>
+      <w:r>
+        <w:rPr>
+          <w:i/>
+          <w:iCs/>
+          <w:lang w:val="en-US"/>
+        </w:rPr>
         <w:t>set_</w:t>
       </w:r>
       <w:proofErr w:type="gramStart"/>
@@ -3002,7 +3271,7 @@
           <w:iCs/>
           <w:lang w:val="en-US"/>
         </w:rPr>
-        <w:t>team_crowd_c</w:t>
+        <w:t>opp_crowd_c</w:t>
       </w:r>
       <w:proofErr w:type="spellEnd"/>
       <w:r>
@@ -3038,18 +3307,30 @@
         <w:rPr>
           <w:lang w:val="en-US"/>
         </w:rPr>
-        <w:t xml:space="preserve"> home crowd members changes the probability of scoring a goal compared to having 6 </w:t>
-      </w:r>
-      <w:proofErr w:type="spellStart"/>
-      <w:proofErr w:type="gramStart"/>
-      <w:r>
-        <w:rPr>
-          <w:lang w:val="en-US"/>
-        </w:rPr>
-        <w:t>homecrowd</w:t>
-      </w:r>
-      <w:proofErr w:type="spellEnd"/>
-      <w:proofErr w:type="gramEnd"/>
+        <w:t xml:space="preserve"> </w:t>
+      </w:r>
+      <w:proofErr w:type="spellStart"/>
+      <w:r>
+        <w:rPr>
+          <w:lang w:val="en-US"/>
+        </w:rPr>
+        <w:t>opp</w:t>
+      </w:r>
+      <w:proofErr w:type="spellEnd"/>
+      <w:r>
+        <w:rPr>
+          <w:lang w:val="en-US"/>
+        </w:rPr>
+        <w:t xml:space="preserve"> crowd members changes the probability of scoring a goal compared to having 6 </w:t>
+      </w:r>
+      <w:proofErr w:type="spellStart"/>
+      <w:r>
+        <w:rPr>
+          <w:lang w:val="en-US"/>
+        </w:rPr>
+        <w:t>oppcrowd</w:t>
+      </w:r>
+      <w:proofErr w:type="spellEnd"/>
       <w:r>
         <w:rPr>
           <w:lang w:val="en-US"/>
@@ -3095,20 +3376,14 @@
         <w:rPr>
           <w:lang w:val="en-US"/>
         </w:rPr>
-        <w:t>opp</w:t>
-      </w:r>
-      <w:r>
-        <w:rPr>
-          <w:lang w:val="en-US"/>
-        </w:rPr>
-        <w:t>_crowd</w:t>
-      </w:r>
-      <w:proofErr w:type="spellEnd"/>
-      <w:r>
-        <w:rPr>
-          <w:lang w:val="en-US"/>
-        </w:rPr>
-        <w:t xml:space="preserve"> goes from</w:t>
+        <w:t>p_odds_team</w:t>
+      </w:r>
+      <w:proofErr w:type="spellEnd"/>
+      <w:r>
+        <w:rPr>
+          <w:lang w:val="en-US"/>
+        </w:rPr>
+        <w:t xml:space="preserve"> goes from 0.05 to 0.8, so 0.75 units</w:t>
       </w:r>
       <w:r>
         <w:rPr>
@@ -3118,42 +3393,31 @@
       </w:r>
       <w:r>
         <w:rPr>
-          <w:lang w:val="en-US"/>
-        </w:rPr>
-        <w:t>6 t</w:t>
-      </w:r>
-      <w:r>
-        <w:rPr>
-          <w:lang w:val="en-US"/>
-        </w:rPr>
-        <w:t>o 25180</w:t>
-      </w:r>
-      <w:r>
-        <w:rPr>
-          <w:lang w:val="en-US"/>
-        </w:rPr>
-        <w:t xml:space="preserve"> </w:t>
-      </w:r>
-      <w:r>
-        <w:rPr>
           <w:color w:val="C00000"/>
           <w:lang w:val="en-US"/>
         </w:rPr>
-        <w:t xml:space="preserve">(reduced effect to adjust for it having </w:t>
+        <w:t>(</w:t>
       </w:r>
       <w:r>
         <w:rPr>
           <w:color w:val="C00000"/>
           <w:lang w:val="en-US"/>
         </w:rPr>
-        <w:t>25174</w:t>
+        <w:t>increased</w:t>
       </w:r>
       <w:r>
         <w:rPr>
           <w:color w:val="C00000"/>
           <w:lang w:val="en-US"/>
         </w:rPr>
-        <w:t xml:space="preserve"> units)</w:t>
+        <w:t xml:space="preserve"> effect to adjust for </w:t>
+      </w:r>
+      <w:r>
+        <w:rPr>
+          <w:color w:val="C00000"/>
+          <w:lang w:val="en-US"/>
+        </w:rPr>
+        <w:t>having only 0.75 unit)</w:t>
       </w:r>
     </w:p>
     <w:p>
@@ -3216,7 +3480,7 @@
           <w:iCs/>
           <w:lang w:val="en-US"/>
         </w:rPr>
-        <w:t xml:space="preserve">0, 4.8e-05)", class = "b", </w:t>
+        <w:t xml:space="preserve">0, 1.5)", class = "b", </w:t>
       </w:r>
       <w:proofErr w:type="spellStart"/>
       <w:r>
@@ -3243,7 +3507,7 @@
           <w:iCs/>
           <w:lang w:val="en-US"/>
         </w:rPr>
-        <w:t>opp_crowd_c</w:t>
+        <w:t>p_odds_team_c</w:t>
       </w:r>
       <w:proofErr w:type="spellEnd"/>
       <w:r>
@@ -3265,68 +3529,70 @@
         <w:rPr>
           <w:lang w:val="en-US"/>
         </w:rPr>
-        <w:t xml:space="preserve">We are saying that a team </w:t>
-      </w:r>
-      <w:proofErr w:type="gramStart"/>
-      <w:r>
-        <w:rPr>
-          <w:lang w:val="en-US"/>
-        </w:rPr>
-        <w:t>having  25180</w:t>
-      </w:r>
-      <w:proofErr w:type="gramEnd"/>
-      <w:r>
-        <w:rPr>
-          <w:lang w:val="en-US"/>
-        </w:rPr>
-        <w:t xml:space="preserve"> </w:t>
-      </w:r>
-      <w:proofErr w:type="spellStart"/>
-      <w:r>
-        <w:rPr>
-          <w:lang w:val="en-US"/>
-        </w:rPr>
-        <w:t>opp</w:t>
-      </w:r>
-      <w:proofErr w:type="spellEnd"/>
-      <w:r>
-        <w:rPr>
-          <w:lang w:val="en-US"/>
-        </w:rPr>
-        <w:t xml:space="preserve"> crowd members changes the probability of scoring a goal compared to having 6 </w:t>
-      </w:r>
-      <w:proofErr w:type="spellStart"/>
-      <w:r>
-        <w:rPr>
-          <w:lang w:val="en-US"/>
-        </w:rPr>
-        <w:t>oppcrowd</w:t>
-      </w:r>
-      <w:proofErr w:type="spellEnd"/>
-      <w:r>
-        <w:rPr>
-          <w:lang w:val="en-US"/>
-        </w:rPr>
-        <w:t xml:space="preserve"> members by (</w:t>
-      </w:r>
-      <w:proofErr w:type="gramStart"/>
-      <w:r>
-        <w:rPr>
-          <w:lang w:val="en-US"/>
-        </w:rPr>
-        <w:t>0.0008 ;</w:t>
-      </w:r>
-      <w:proofErr w:type="gramEnd"/>
-      <w:r>
-        <w:rPr>
-          <w:lang w:val="en-US"/>
-        </w:rPr>
-        <w:t xml:space="preserve"> 0.10) so 0.01% to 10%.</w:t>
-      </w:r>
-    </w:p>
-    <w:p>
-      <w:pPr>
-        <w:rPr>
+        <w:t xml:space="preserve">We are saying that a team having </w:t>
+      </w:r>
+      <w:proofErr w:type="gramStart"/>
+      <w:r>
+        <w:rPr>
+          <w:lang w:val="en-US"/>
+        </w:rPr>
+        <w:t>as</w:t>
+      </w:r>
+      <w:proofErr w:type="gramEnd"/>
+      <w:r>
+        <w:rPr>
+          <w:lang w:val="en-US"/>
+        </w:rPr>
+        <w:t xml:space="preserve"> 0.75 chance of </w:t>
+      </w:r>
+      <w:proofErr w:type="spellStart"/>
+      <w:proofErr w:type="gramStart"/>
+      <w:r>
+        <w:rPr>
+          <w:lang w:val="en-US"/>
+        </w:rPr>
+        <w:t>wining</w:t>
+      </w:r>
+      <w:proofErr w:type="spellEnd"/>
+      <w:proofErr w:type="gramEnd"/>
+      <w:r>
+        <w:rPr>
+          <w:lang w:val="en-US"/>
+        </w:rPr>
+        <w:t xml:space="preserve"> compared to 0.05 changes the probability of a goal to be </w:t>
+      </w:r>
+      <w:proofErr w:type="gramStart"/>
+      <w:r>
+        <w:rPr>
+          <w:lang w:val="en-US"/>
+        </w:rPr>
+        <w:t>between  (0.00q ;</w:t>
+      </w:r>
+      <w:proofErr w:type="gramEnd"/>
+      <w:r>
+        <w:rPr>
+          <w:lang w:val="en-US"/>
+        </w:rPr>
+        <w:t xml:space="preserve"> 0.08) so 0.0</w:t>
+      </w:r>
+      <w:r>
+        <w:rPr>
+          <w:lang w:val="en-US"/>
+        </w:rPr>
+        <w:t>1</w:t>
+      </w:r>
+      <w:r>
+        <w:rPr>
+          <w:lang w:val="en-US"/>
+        </w:rPr>
+        <w:t>% to 8.6%.</w:t>
+      </w:r>
+    </w:p>
+    <w:p>
+      <w:pPr>
+        <w:rPr>
+          <w:i/>
+          <w:iCs/>
           <w:lang w:val="en-US"/>
         </w:rPr>
       </w:pPr>
@@ -3348,314 +3614,14 @@
         <w:rPr>
           <w:lang w:val="en-US"/>
         </w:rPr>
-        <w:t>p_odds_team</w:t>
-      </w:r>
-      <w:proofErr w:type="spellEnd"/>
-      <w:r>
-        <w:rPr>
-          <w:lang w:val="en-US"/>
-        </w:rPr>
-        <w:t xml:space="preserve"> goes from 0.05 to 0.8, so 0.75 units</w:t>
-      </w:r>
-      <w:r>
-        <w:rPr>
-          <w:lang w:val="en-US"/>
-        </w:rPr>
-        <w:t xml:space="preserve"> </w:t>
-      </w:r>
-      <w:r>
-        <w:rPr>
-          <w:color w:val="C00000"/>
-          <w:lang w:val="en-US"/>
-        </w:rPr>
-        <w:t>(</w:t>
-      </w:r>
-      <w:r>
-        <w:rPr>
-          <w:color w:val="C00000"/>
-          <w:lang w:val="en-US"/>
-        </w:rPr>
-        <w:t>increased</w:t>
-      </w:r>
-      <w:r>
-        <w:rPr>
-          <w:color w:val="C00000"/>
-          <w:lang w:val="en-US"/>
-        </w:rPr>
-        <w:t xml:space="preserve"> effect to adjust for </w:t>
-      </w:r>
-      <w:r>
-        <w:rPr>
-          <w:color w:val="C00000"/>
-          <w:lang w:val="en-US"/>
-        </w:rPr>
-        <w:t>having only 0.</w:t>
-      </w:r>
-      <w:r>
-        <w:rPr>
-          <w:color w:val="C00000"/>
-          <w:lang w:val="en-US"/>
-        </w:rPr>
-        <w:t>75</w:t>
-      </w:r>
-      <w:r>
-        <w:rPr>
-          <w:color w:val="C00000"/>
-          <w:lang w:val="en-US"/>
-        </w:rPr>
-        <w:t xml:space="preserve"> unit)</w:t>
-      </w:r>
-    </w:p>
-    <w:p>
-      <w:pPr>
-        <w:rPr>
-          <w:i/>
-          <w:iCs/>
-          <w:lang w:val="en-US"/>
-        </w:rPr>
-      </w:pPr>
-      <w:proofErr w:type="spellStart"/>
-      <w:r>
-        <w:rPr>
-          <w:i/>
-          <w:iCs/>
-          <w:lang w:val="en-US"/>
-        </w:rPr>
-        <w:t>set_</w:t>
-      </w:r>
-      <w:proofErr w:type="gramStart"/>
-      <w:r>
-        <w:rPr>
-          <w:i/>
-          <w:iCs/>
-          <w:lang w:val="en-US"/>
-        </w:rPr>
-        <w:t>prior</w:t>
-      </w:r>
-      <w:proofErr w:type="spellEnd"/>
-      <w:r>
-        <w:rPr>
-          <w:i/>
-          <w:iCs/>
-          <w:lang w:val="en-US"/>
-        </w:rPr>
-        <w:t>(</w:t>
-      </w:r>
-      <w:proofErr w:type="gramEnd"/>
-      <w:r>
-        <w:rPr>
-          <w:i/>
-          <w:iCs/>
-          <w:lang w:val="en-US"/>
-        </w:rPr>
-        <w:t>"</w:t>
-      </w:r>
-      <w:proofErr w:type="gramStart"/>
-      <w:r>
-        <w:rPr>
-          <w:i/>
-          <w:iCs/>
-          <w:lang w:val="en-US"/>
-        </w:rPr>
-        <w:t>normal(</w:t>
-      </w:r>
-      <w:proofErr w:type="gramEnd"/>
-      <w:r>
-        <w:rPr>
-          <w:i/>
-          <w:iCs/>
-          <w:lang w:val="en-US"/>
-        </w:rPr>
-        <w:t xml:space="preserve">0, 1.5)", class = "b", </w:t>
-      </w:r>
-      <w:proofErr w:type="spellStart"/>
-      <w:r>
-        <w:rPr>
-          <w:i/>
-          <w:iCs/>
-          <w:lang w:val="en-US"/>
-        </w:rPr>
-        <w:t>coef</w:t>
-      </w:r>
-      <w:proofErr w:type="spellEnd"/>
-      <w:r>
-        <w:rPr>
-          <w:i/>
-          <w:iCs/>
-          <w:lang w:val="en-US"/>
-        </w:rPr>
-        <w:t xml:space="preserve"> = "</w:t>
-      </w:r>
-      <w:proofErr w:type="spellStart"/>
-      <w:r>
-        <w:rPr>
-          <w:i/>
-          <w:iCs/>
-          <w:lang w:val="en-US"/>
-        </w:rPr>
-        <w:t>p_odds_team_c</w:t>
-      </w:r>
-      <w:proofErr w:type="spellEnd"/>
-      <w:r>
-        <w:rPr>
-          <w:i/>
-          <w:iCs/>
-          <w:lang w:val="en-US"/>
-        </w:rPr>
-        <w:t>")</w:t>
-      </w:r>
-    </w:p>
-    <w:p>
-      <w:pPr>
-        <w:rPr>
-          <w:lang w:val="en-US"/>
-        </w:rPr>
-      </w:pPr>
-      <w:r>
-        <w:rPr>
-          <w:lang w:val="en-US"/>
-        </w:rPr>
-        <w:t xml:space="preserve">We are saying that a team having </w:t>
-      </w:r>
-      <w:proofErr w:type="gramStart"/>
-      <w:r>
-        <w:rPr>
-          <w:lang w:val="en-US"/>
-        </w:rPr>
-        <w:t>as</w:t>
-      </w:r>
-      <w:proofErr w:type="gramEnd"/>
-      <w:r>
-        <w:rPr>
-          <w:lang w:val="en-US"/>
-        </w:rPr>
-        <w:t xml:space="preserve"> 0.75 chance of </w:t>
-      </w:r>
-      <w:proofErr w:type="spellStart"/>
-      <w:proofErr w:type="gramStart"/>
-      <w:r>
-        <w:rPr>
-          <w:lang w:val="en-US"/>
-        </w:rPr>
-        <w:t>wining</w:t>
-      </w:r>
-      <w:proofErr w:type="spellEnd"/>
-      <w:proofErr w:type="gramEnd"/>
-      <w:r>
-        <w:rPr>
-          <w:lang w:val="en-US"/>
-        </w:rPr>
-        <w:t xml:space="preserve"> compared to 0.05 changes the probability of a goal to be </w:t>
-      </w:r>
-      <w:proofErr w:type="gramStart"/>
-      <w:r>
-        <w:rPr>
-          <w:lang w:val="en-US"/>
-        </w:rPr>
-        <w:t>between  (0.00q ;</w:t>
-      </w:r>
-      <w:proofErr w:type="gramEnd"/>
-      <w:r>
-        <w:rPr>
-          <w:lang w:val="en-US"/>
-        </w:rPr>
-        <w:t xml:space="preserve"> 0.08) so 0.0</w:t>
-      </w:r>
-      <w:r>
-        <w:rPr>
-          <w:lang w:val="en-US"/>
-        </w:rPr>
-        <w:t>1</w:t>
-      </w:r>
-      <w:r>
-        <w:rPr>
-          <w:lang w:val="en-US"/>
-        </w:rPr>
-        <w:t>% to 8.6%.</w:t>
-      </w:r>
-    </w:p>
-    <w:p>
-      <w:pPr>
-        <w:rPr>
-          <w:i/>
-          <w:iCs/>
-          <w:lang w:val="en-US"/>
-        </w:rPr>
-      </w:pPr>
-    </w:p>
-    <w:p>
-      <w:pPr>
-        <w:rPr>
-          <w:lang w:val="en-US"/>
-        </w:rPr>
-      </w:pPr>
-      <w:r>
-        <w:rPr>
-          <w:lang w:val="en-US"/>
-        </w:rPr>
-        <w:t xml:space="preserve"># </w:t>
-      </w:r>
-      <w:proofErr w:type="spellStart"/>
-      <w:r>
-        <w:rPr>
-          <w:lang w:val="en-US"/>
-        </w:rPr>
-        <w:t>p_odds_</w:t>
-      </w:r>
-      <w:r>
-        <w:rPr>
-          <w:lang w:val="en-US"/>
-        </w:rPr>
-        <w:t>draw</w:t>
-      </w:r>
-      <w:proofErr w:type="spellEnd"/>
-      <w:r>
-        <w:rPr>
-          <w:lang w:val="en-US"/>
-        </w:rPr>
-        <w:t xml:space="preserve"> </w:t>
-      </w:r>
-      <w:r>
-        <w:rPr>
-          <w:lang w:val="en-US"/>
-        </w:rPr>
-        <w:t>goes from 0.</w:t>
-      </w:r>
-      <w:r>
-        <w:rPr>
-          <w:lang w:val="en-US"/>
-        </w:rPr>
-        <w:t>14</w:t>
-      </w:r>
-      <w:r>
-        <w:rPr>
-          <w:lang w:val="en-US"/>
-        </w:rPr>
-        <w:t xml:space="preserve"> to 0.</w:t>
-      </w:r>
-      <w:r>
-        <w:rPr>
-          <w:lang w:val="en-US"/>
-        </w:rPr>
-        <w:t xml:space="preserve">33, </w:t>
-      </w:r>
-      <w:r>
-        <w:rPr>
-          <w:lang w:val="en-US"/>
-        </w:rPr>
-        <w:t>o 0.</w:t>
-      </w:r>
-      <w:r>
-        <w:rPr>
-          <w:lang w:val="en-US"/>
-        </w:rPr>
-        <w:t>19</w:t>
-      </w:r>
-      <w:r>
-        <w:rPr>
-          <w:lang w:val="en-US"/>
-        </w:rPr>
-        <w:t xml:space="preserve"> unit</w:t>
+        <w:t>p_odds_draw</w:t>
+      </w:r>
+      <w:proofErr w:type="spellEnd"/>
+      <w:r>
+        <w:rPr>
+          <w:lang w:val="en-US"/>
+        </w:rPr>
+        <w:t xml:space="preserve"> goes from 0.14 to 0.33, o 0.19 unit</w:t>
       </w:r>
       <w:r>
         <w:rPr>
@@ -3943,16 +3909,2380 @@
       </w:r>
     </w:p>
     <w:p>
+      <w:r>
+        <w:t>Alt:</w:t>
+      </w:r>
+    </w:p>
+    <w:p>
+      <w:r>
+        <w:rPr>
+          <w:noProof/>
+        </w:rPr>
+        <w:drawing>
+          <wp:inline distT="0" distB="0" distL="0" distR="0" wp14:anchorId="6EBD4CFF" wp14:editId="7E2EA0EB">
+            <wp:extent cx="3684760" cy="2276655"/>
+            <wp:effectExtent l="0" t="0" r="0" b="0"/>
+            <wp:docPr id="1642565949" name="Grafik 2"/>
+            <wp:cNvGraphicFramePr>
+              <a:graphicFrameLocks xmlns:a="http://schemas.openxmlformats.org/drawingml/2006/main" noChangeAspect="1"/>
+            </wp:cNvGraphicFramePr>
+            <a:graphic xmlns:a="http://schemas.openxmlformats.org/drawingml/2006/main">
+              <a:graphicData uri="http://schemas.openxmlformats.org/drawingml/2006/picture">
+                <pic:pic xmlns:pic="http://schemas.openxmlformats.org/drawingml/2006/picture">
+                  <pic:nvPicPr>
+                    <pic:cNvPr id="0" name="Picture 2"/>
+                    <pic:cNvPicPr>
+                      <a:picLocks noChangeAspect="1" noChangeArrowheads="1"/>
+                    </pic:cNvPicPr>
+                  </pic:nvPicPr>
+                  <pic:blipFill>
+                    <a:blip r:embed="rId12" cstate="print">
+                      <a:extLst>
+                        <a:ext uri="{28A0092B-C50C-407E-A947-70E740481C1C}">
+                          <a14:useLocalDpi xmlns:a14="http://schemas.microsoft.com/office/drawing/2010/main" val="0"/>
+                        </a:ext>
+                      </a:extLst>
+                    </a:blip>
+                    <a:srcRect/>
+                    <a:stretch>
+                      <a:fillRect/>
+                    </a:stretch>
+                  </pic:blipFill>
+                  <pic:spPr bwMode="auto">
+                    <a:xfrm>
+                      <a:off x="0" y="0"/>
+                      <a:ext cx="3699850" cy="2285978"/>
+                    </a:xfrm>
+                    <a:prstGeom prst="rect">
+                      <a:avLst/>
+                    </a:prstGeom>
+                    <a:noFill/>
+                  </pic:spPr>
+                </pic:pic>
+              </a:graphicData>
+            </a:graphic>
+          </wp:inline>
+        </w:drawing>
+      </w:r>
+    </w:p>
+    <w:p>
+      <w:pPr>
+        <w:rPr>
+          <w:color w:val="C00000"/>
+          <w:lang w:val="en-US"/>
+        </w:rPr>
+      </w:pPr>
+      <w:r>
+        <w:rPr>
+          <w:lang w:val="en-US"/>
+        </w:rPr>
+        <w:t xml:space="preserve"># </w:t>
+      </w:r>
+      <w:proofErr w:type="spellStart"/>
+      <w:r>
+        <w:rPr>
+          <w:lang w:val="en-US"/>
+        </w:rPr>
+        <w:t>playersprints</w:t>
+      </w:r>
+      <w:proofErr w:type="spellEnd"/>
+      <w:r>
+        <w:rPr>
+          <w:lang w:val="en-US"/>
+        </w:rPr>
+        <w:t xml:space="preserve"> goes from 0 to 12</w:t>
+      </w:r>
+      <w:r>
+        <w:rPr>
+          <w:lang w:val="en-US"/>
+        </w:rPr>
+        <w:t xml:space="preserve"> </w:t>
+      </w:r>
+      <w:r>
+        <w:rPr>
+          <w:color w:val="C00000"/>
+          <w:lang w:val="en-US"/>
+        </w:rPr>
+        <w:t xml:space="preserve">(reduced effect to adjust for it having </w:t>
+      </w:r>
+      <w:r>
+        <w:rPr>
+          <w:color w:val="C00000"/>
+          <w:lang w:val="en-US"/>
+        </w:rPr>
+        <w:t>12</w:t>
+      </w:r>
+      <w:r>
+        <w:rPr>
+          <w:color w:val="C00000"/>
+          <w:lang w:val="en-US"/>
+        </w:rPr>
+        <w:t xml:space="preserve"> units</w:t>
+      </w:r>
+      <w:r>
+        <w:rPr>
+          <w:color w:val="C00000"/>
+          <w:lang w:val="en-US"/>
+        </w:rPr>
+        <w:t>)</w:t>
+      </w:r>
+    </w:p>
+    <w:p>
+      <w:pPr>
+        <w:rPr>
+          <w:i/>
+          <w:iCs/>
+          <w:lang w:val="en-US"/>
+        </w:rPr>
+      </w:pPr>
+      <w:proofErr w:type="spellStart"/>
+      <w:r>
+        <w:rPr>
+          <w:i/>
+          <w:iCs/>
+          <w:lang w:val="en-US"/>
+        </w:rPr>
+        <w:t>set_</w:t>
+      </w:r>
+      <w:proofErr w:type="gramStart"/>
+      <w:r>
+        <w:rPr>
+          <w:i/>
+          <w:iCs/>
+          <w:lang w:val="en-US"/>
+        </w:rPr>
+        <w:t>prior</w:t>
+      </w:r>
+      <w:proofErr w:type="spellEnd"/>
+      <w:r>
+        <w:rPr>
+          <w:i/>
+          <w:iCs/>
+          <w:lang w:val="en-US"/>
+        </w:rPr>
+        <w:t>(</w:t>
+      </w:r>
+      <w:proofErr w:type="gramEnd"/>
+      <w:r>
+        <w:rPr>
+          <w:i/>
+          <w:iCs/>
+          <w:lang w:val="en-US"/>
+        </w:rPr>
+        <w:t>"</w:t>
+      </w:r>
+      <w:proofErr w:type="gramStart"/>
+      <w:r>
+        <w:rPr>
+          <w:i/>
+          <w:iCs/>
+          <w:lang w:val="en-US"/>
+        </w:rPr>
+        <w:t>normal(</w:t>
+      </w:r>
+      <w:proofErr w:type="gramEnd"/>
+      <w:r>
+        <w:rPr>
+          <w:i/>
+          <w:iCs/>
+          <w:lang w:val="en-US"/>
+        </w:rPr>
+        <w:t xml:space="preserve">0, 0.1)", class = "b", </w:t>
+      </w:r>
+      <w:proofErr w:type="spellStart"/>
+      <w:r>
+        <w:rPr>
+          <w:i/>
+          <w:iCs/>
+          <w:lang w:val="en-US"/>
+        </w:rPr>
+        <w:t>coef</w:t>
+      </w:r>
+      <w:proofErr w:type="spellEnd"/>
+      <w:r>
+        <w:rPr>
+          <w:i/>
+          <w:iCs/>
+          <w:lang w:val="en-US"/>
+        </w:rPr>
+        <w:t xml:space="preserve"> = "</w:t>
+      </w:r>
+      <w:proofErr w:type="spellStart"/>
+      <w:proofErr w:type="gramStart"/>
+      <w:r>
+        <w:rPr>
+          <w:i/>
+          <w:iCs/>
+          <w:lang w:val="en-US"/>
+        </w:rPr>
+        <w:t>playersprints_c</w:t>
+      </w:r>
+      <w:proofErr w:type="spellEnd"/>
+      <w:proofErr w:type="gramEnd"/>
+      <w:r>
+        <w:rPr>
+          <w:i/>
+          <w:iCs/>
+          <w:lang w:val="en-US"/>
+        </w:rPr>
+        <w:t>")</w:t>
+      </w:r>
+    </w:p>
+    <w:p>
+      <w:pPr>
+        <w:rPr>
+          <w:lang w:val="en-US"/>
+        </w:rPr>
+      </w:pPr>
+      <w:r>
+        <w:rPr>
+          <w:lang w:val="en-US"/>
+        </w:rPr>
+        <w:t>W</w:t>
+      </w:r>
+      <w:r>
+        <w:rPr>
+          <w:lang w:val="en-US"/>
+        </w:rPr>
+        <w:t xml:space="preserve">e are saying that a player having </w:t>
+      </w:r>
+      <w:proofErr w:type="gramStart"/>
+      <w:r>
+        <w:rPr>
+          <w:lang w:val="en-US"/>
+        </w:rPr>
+        <w:t>ran</w:t>
+      </w:r>
+      <w:proofErr w:type="gramEnd"/>
+      <w:r>
+        <w:rPr>
+          <w:lang w:val="en-US"/>
+        </w:rPr>
+        <w:t xml:space="preserve"> 12 times in this section compared to zero changes the probability of scoring between (</w:t>
+      </w:r>
+      <w:proofErr w:type="gramStart"/>
+      <w:r>
+        <w:rPr>
+          <w:lang w:val="en-US"/>
+        </w:rPr>
+        <w:t>0.0009 ;</w:t>
+      </w:r>
+      <w:proofErr w:type="gramEnd"/>
+      <w:r>
+        <w:rPr>
+          <w:lang w:val="en-US"/>
+        </w:rPr>
+        <w:t xml:space="preserve"> 0.9975) </w:t>
+      </w:r>
+      <w:proofErr w:type="gramStart"/>
+      <w:r>
+        <w:rPr>
+          <w:lang w:val="en-US"/>
+        </w:rPr>
+        <w:t>so</w:t>
+      </w:r>
+      <w:proofErr w:type="gramEnd"/>
+      <w:r>
+        <w:rPr>
+          <w:lang w:val="en-US"/>
+        </w:rPr>
+        <w:t xml:space="preserve"> 0.1% to 10%.</w:t>
+      </w:r>
+    </w:p>
+    <w:p>
+      <w:pPr>
+        <w:rPr>
+          <w:lang w:val="en-US"/>
+        </w:rPr>
+      </w:pPr>
+    </w:p>
+    <w:p>
+      <w:pPr>
+        <w:rPr>
+          <w:lang w:val="en-US"/>
+        </w:rPr>
+      </w:pPr>
+      <w:r>
+        <w:rPr>
+          <w:lang w:val="en-US"/>
+        </w:rPr>
+        <w:t>Ne</w:t>
+      </w:r>
+      <w:r>
+        <w:rPr>
+          <w:lang w:val="en-US"/>
+        </w:rPr>
+        <w:t>u</w:t>
+      </w:r>
+      <w:r>
+        <w:rPr>
+          <w:lang w:val="en-US"/>
+        </w:rPr>
+        <w:t xml:space="preserve"> </w:t>
+      </w:r>
+      <w:proofErr w:type="spellStart"/>
+      <w:r>
+        <w:rPr>
+          <w:lang w:val="en-US"/>
+        </w:rPr>
+        <w:t>pp_check</w:t>
+      </w:r>
+      <w:proofErr w:type="spellEnd"/>
+    </w:p>
+    <w:p>
+      <w:pPr>
+        <w:rPr>
+          <w:lang w:val="en-US"/>
+        </w:rPr>
+      </w:pPr>
+      <w:r>
+        <w:rPr>
+          <w:noProof/>
+          <w:lang w:val="en-US"/>
+        </w:rPr>
+        <w:lastRenderedPageBreak/>
+        <w:drawing>
+          <wp:inline distT="0" distB="0" distL="0" distR="0" wp14:anchorId="45C5B64B" wp14:editId="5F8AE2CA">
+            <wp:extent cx="4484536" cy="2770803"/>
+            <wp:effectExtent l="0" t="0" r="0" b="0"/>
+            <wp:docPr id="338633569" name="Grafik 3"/>
+            <wp:cNvGraphicFramePr>
+              <a:graphicFrameLocks xmlns:a="http://schemas.openxmlformats.org/drawingml/2006/main" noChangeAspect="1"/>
+            </wp:cNvGraphicFramePr>
+            <a:graphic xmlns:a="http://schemas.openxmlformats.org/drawingml/2006/main">
+              <a:graphicData uri="http://schemas.openxmlformats.org/drawingml/2006/picture">
+                <pic:pic xmlns:pic="http://schemas.openxmlformats.org/drawingml/2006/picture">
+                  <pic:nvPicPr>
+                    <pic:cNvPr id="0" name="Picture 3"/>
+                    <pic:cNvPicPr>
+                      <a:picLocks noChangeAspect="1" noChangeArrowheads="1"/>
+                    </pic:cNvPicPr>
+                  </pic:nvPicPr>
+                  <pic:blipFill>
+                    <a:blip r:embed="rId13" cstate="print">
+                      <a:extLst>
+                        <a:ext uri="{28A0092B-C50C-407E-A947-70E740481C1C}">
+                          <a14:useLocalDpi xmlns:a14="http://schemas.microsoft.com/office/drawing/2010/main" val="0"/>
+                        </a:ext>
+                      </a:extLst>
+                    </a:blip>
+                    <a:srcRect/>
+                    <a:stretch>
+                      <a:fillRect/>
+                    </a:stretch>
+                  </pic:blipFill>
+                  <pic:spPr bwMode="auto">
+                    <a:xfrm>
+                      <a:off x="0" y="0"/>
+                      <a:ext cx="4514224" cy="2789146"/>
+                    </a:xfrm>
+                    <a:prstGeom prst="rect">
+                      <a:avLst/>
+                    </a:prstGeom>
+                    <a:noFill/>
+                  </pic:spPr>
+                </pic:pic>
+              </a:graphicData>
+            </a:graphic>
+          </wp:inline>
+        </w:drawing>
+      </w:r>
+    </w:p>
+    <w:p>
       <w:pPr>
         <w:rPr>
           <w:u w:val="single"/>
-        </w:rPr>
-      </w:pPr>
-    </w:p>
-    <w:p>
-      <w:pPr>
+          <w:lang w:val="en-US"/>
+        </w:rPr>
+      </w:pPr>
+      <w:r>
         <w:rPr>
           <w:u w:val="single"/>
+          <w:lang w:val="en-US"/>
+        </w:rPr>
+        <w:t>Colum</w:t>
+      </w:r>
+      <w:r>
+        <w:rPr>
+          <w:u w:val="single"/>
+          <w:lang w:val="en-US"/>
+        </w:rPr>
+        <w:t>n</w:t>
+      </w:r>
+      <w:r>
+        <w:rPr>
+          <w:u w:val="single"/>
+          <w:lang w:val="en-US"/>
+        </w:rPr>
+        <w:t xml:space="preserve"> 6</w:t>
+      </w:r>
+    </w:p>
+    <w:p>
+      <w:pPr>
+        <w:rPr>
+          <w:lang w:val="en-US"/>
+        </w:rPr>
+      </w:pPr>
+      <w:r>
+        <w:rPr>
+          <w:lang w:val="en-US"/>
+        </w:rPr>
+        <w:t>Alt</w:t>
+      </w:r>
+    </w:p>
+    <w:p>
+      <w:pPr>
+        <w:rPr>
+          <w:lang w:val="en-US"/>
+        </w:rPr>
+      </w:pPr>
+      <w:r>
+        <w:rPr>
+          <w:noProof/>
+          <w:lang w:val="en-US"/>
+        </w:rPr>
+        <w:drawing>
+          <wp:inline distT="0" distB="0" distL="0" distR="0" wp14:anchorId="7130ABD9" wp14:editId="7B700A70">
+            <wp:extent cx="3959510" cy="2446412"/>
+            <wp:effectExtent l="0" t="0" r="3175" b="0"/>
+            <wp:docPr id="480939332" name="Grafik 4"/>
+            <wp:cNvGraphicFramePr>
+              <a:graphicFrameLocks xmlns:a="http://schemas.openxmlformats.org/drawingml/2006/main" noChangeAspect="1"/>
+            </wp:cNvGraphicFramePr>
+            <a:graphic xmlns:a="http://schemas.openxmlformats.org/drawingml/2006/main">
+              <a:graphicData uri="http://schemas.openxmlformats.org/drawingml/2006/picture">
+                <pic:pic xmlns:pic="http://schemas.openxmlformats.org/drawingml/2006/picture">
+                  <pic:nvPicPr>
+                    <pic:cNvPr id="0" name="Picture 4"/>
+                    <pic:cNvPicPr>
+                      <a:picLocks noChangeAspect="1" noChangeArrowheads="1"/>
+                    </pic:cNvPicPr>
+                  </pic:nvPicPr>
+                  <pic:blipFill>
+                    <a:blip r:embed="rId14" cstate="print">
+                      <a:extLst>
+                        <a:ext uri="{28A0092B-C50C-407E-A947-70E740481C1C}">
+                          <a14:useLocalDpi xmlns:a14="http://schemas.microsoft.com/office/drawing/2010/main" val="0"/>
+                        </a:ext>
+                      </a:extLst>
+                    </a:blip>
+                    <a:srcRect/>
+                    <a:stretch>
+                      <a:fillRect/>
+                    </a:stretch>
+                  </pic:blipFill>
+                  <pic:spPr bwMode="auto">
+                    <a:xfrm>
+                      <a:off x="0" y="0"/>
+                      <a:ext cx="3980120" cy="2459146"/>
+                    </a:xfrm>
+                    <a:prstGeom prst="rect">
+                      <a:avLst/>
+                    </a:prstGeom>
+                    <a:noFill/>
+                  </pic:spPr>
+                </pic:pic>
+              </a:graphicData>
+            </a:graphic>
+          </wp:inline>
+        </w:drawing>
+      </w:r>
+    </w:p>
+    <w:p>
+      <w:pPr>
+        <w:rPr>
+          <w:lang w:val="en-US"/>
+        </w:rPr>
+      </w:pPr>
+      <w:r>
+        <w:rPr>
+          <w:lang w:val="en-US"/>
+        </w:rPr>
+        <w:t>Neu</w:t>
+      </w:r>
+    </w:p>
+    <w:p>
+      <w:pPr>
+        <w:rPr>
+          <w:lang w:val="en-US"/>
+        </w:rPr>
+      </w:pPr>
+      <w:r>
+        <w:rPr>
+          <w:noProof/>
+          <w:lang w:val="en-US"/>
+        </w:rPr>
+        <w:lastRenderedPageBreak/>
+        <w:drawing>
+          <wp:inline distT="0" distB="0" distL="0" distR="0" wp14:anchorId="13B7FCEC" wp14:editId="0B53069B">
+            <wp:extent cx="4761590" cy="2941983"/>
+            <wp:effectExtent l="0" t="0" r="1270" b="0"/>
+            <wp:docPr id="228986671" name="Grafik 5"/>
+            <wp:cNvGraphicFramePr>
+              <a:graphicFrameLocks xmlns:a="http://schemas.openxmlformats.org/drawingml/2006/main" noChangeAspect="1"/>
+            </wp:cNvGraphicFramePr>
+            <a:graphic xmlns:a="http://schemas.openxmlformats.org/drawingml/2006/main">
+              <a:graphicData uri="http://schemas.openxmlformats.org/drawingml/2006/picture">
+                <pic:pic xmlns:pic="http://schemas.openxmlformats.org/drawingml/2006/picture">
+                  <pic:nvPicPr>
+                    <pic:cNvPr id="0" name="Picture 5"/>
+                    <pic:cNvPicPr>
+                      <a:picLocks noChangeAspect="1" noChangeArrowheads="1"/>
+                    </pic:cNvPicPr>
+                  </pic:nvPicPr>
+                  <pic:blipFill>
+                    <a:blip r:embed="rId15" cstate="print">
+                      <a:extLst>
+                        <a:ext uri="{28A0092B-C50C-407E-A947-70E740481C1C}">
+                          <a14:useLocalDpi xmlns:a14="http://schemas.microsoft.com/office/drawing/2010/main" val="0"/>
+                        </a:ext>
+                      </a:extLst>
+                    </a:blip>
+                    <a:srcRect/>
+                    <a:stretch>
+                      <a:fillRect/>
+                    </a:stretch>
+                  </pic:blipFill>
+                  <pic:spPr bwMode="auto">
+                    <a:xfrm>
+                      <a:off x="0" y="0"/>
+                      <a:ext cx="4786378" cy="2957298"/>
+                    </a:xfrm>
+                    <a:prstGeom prst="rect">
+                      <a:avLst/>
+                    </a:prstGeom>
+                    <a:noFill/>
+                  </pic:spPr>
+                </pic:pic>
+              </a:graphicData>
+            </a:graphic>
+          </wp:inline>
+        </w:drawing>
+      </w:r>
+    </w:p>
+    <w:p>
+      <w:pPr>
+        <w:rPr>
+          <w:lang w:val="en-US"/>
+        </w:rPr>
+      </w:pPr>
+    </w:p>
+    <w:p>
+      <w:pPr>
+        <w:rPr>
+          <w:u w:val="single"/>
+          <w:lang w:val="en-US"/>
+        </w:rPr>
+      </w:pPr>
+      <w:r>
+        <w:rPr>
+          <w:u w:val="single"/>
+          <w:lang w:val="en-US"/>
+        </w:rPr>
+        <w:t>Colum</w:t>
+      </w:r>
+      <w:r>
+        <w:rPr>
+          <w:u w:val="single"/>
+          <w:lang w:val="en-US"/>
+        </w:rPr>
+        <w:t>n</w:t>
+      </w:r>
+      <w:r>
+        <w:rPr>
+          <w:u w:val="single"/>
+          <w:lang w:val="en-US"/>
+        </w:rPr>
+        <w:t xml:space="preserve"> </w:t>
+      </w:r>
+      <w:r>
+        <w:rPr>
+          <w:u w:val="single"/>
+          <w:lang w:val="en-US"/>
+        </w:rPr>
+        <w:t>7</w:t>
+      </w:r>
+    </w:p>
+    <w:p>
+      <w:pPr>
+        <w:rPr>
+          <w:lang w:val="en-US"/>
+        </w:rPr>
+      </w:pPr>
+      <w:r>
+        <w:rPr>
+          <w:lang w:val="en-US"/>
+        </w:rPr>
+        <w:t>Alt</w:t>
+      </w:r>
+      <w:r>
+        <w:rPr>
+          <w:lang w:val="en-US"/>
+        </w:rPr>
+        <w:t xml:space="preserve">: looks alright but maybe the zeros are </w:t>
+      </w:r>
+      <w:r>
+        <w:rPr>
+          <w:lang w:val="en-US"/>
+        </w:rPr>
+        <w:t>too</w:t>
+      </w:r>
+      <w:r>
+        <w:rPr>
+          <w:lang w:val="en-US"/>
+        </w:rPr>
+        <w:t xml:space="preserve"> common? </w:t>
+      </w:r>
+    </w:p>
+    <w:p>
+      <w:pPr>
+        <w:rPr>
+          <w:lang w:val="en-US"/>
+        </w:rPr>
+      </w:pPr>
+      <w:r>
+        <w:rPr>
+          <w:noProof/>
+          <w:lang w:val="en-US"/>
+        </w:rPr>
+        <w:drawing>
+          <wp:inline distT="0" distB="0" distL="0" distR="0" wp14:anchorId="63419CD2" wp14:editId="665CC8D0">
+            <wp:extent cx="3545255" cy="2190461"/>
+            <wp:effectExtent l="0" t="0" r="0" b="635"/>
+            <wp:docPr id="1808174930" name="Grafik 6"/>
+            <wp:cNvGraphicFramePr>
+              <a:graphicFrameLocks xmlns:a="http://schemas.openxmlformats.org/drawingml/2006/main" noChangeAspect="1"/>
+            </wp:cNvGraphicFramePr>
+            <a:graphic xmlns:a="http://schemas.openxmlformats.org/drawingml/2006/main">
+              <a:graphicData uri="http://schemas.openxmlformats.org/drawingml/2006/picture">
+                <pic:pic xmlns:pic="http://schemas.openxmlformats.org/drawingml/2006/picture">
+                  <pic:nvPicPr>
+                    <pic:cNvPr id="0" name="Picture 6"/>
+                    <pic:cNvPicPr>
+                      <a:picLocks noChangeAspect="1" noChangeArrowheads="1"/>
+                    </pic:cNvPicPr>
+                  </pic:nvPicPr>
+                  <pic:blipFill>
+                    <a:blip r:embed="rId16" cstate="print">
+                      <a:extLst>
+                        <a:ext uri="{28A0092B-C50C-407E-A947-70E740481C1C}">
+                          <a14:useLocalDpi xmlns:a14="http://schemas.microsoft.com/office/drawing/2010/main" val="0"/>
+                        </a:ext>
+                      </a:extLst>
+                    </a:blip>
+                    <a:srcRect/>
+                    <a:stretch>
+                      <a:fillRect/>
+                    </a:stretch>
+                  </pic:blipFill>
+                  <pic:spPr bwMode="auto">
+                    <a:xfrm>
+                      <a:off x="0" y="0"/>
+                      <a:ext cx="3572678" cy="2207405"/>
+                    </a:xfrm>
+                    <a:prstGeom prst="rect">
+                      <a:avLst/>
+                    </a:prstGeom>
+                    <a:noFill/>
+                  </pic:spPr>
+                </pic:pic>
+              </a:graphicData>
+            </a:graphic>
+          </wp:inline>
+        </w:drawing>
+      </w:r>
+    </w:p>
+    <w:p>
+      <w:pPr>
+        <w:rPr>
+          <w:color w:val="EE0000"/>
+          <w:lang w:val="en-US"/>
+        </w:rPr>
+      </w:pPr>
+      <w:r>
+        <w:rPr>
+          <w:lang w:val="en-US"/>
+        </w:rPr>
+        <w:t xml:space="preserve"># </w:t>
+      </w:r>
+      <w:r>
+        <w:rPr>
+          <w:lang w:val="en-US"/>
+        </w:rPr>
+        <w:t>Intercept</w:t>
+      </w:r>
+      <w:r>
+        <w:rPr>
+          <w:color w:val="EE0000"/>
+          <w:lang w:val="en-US"/>
+        </w:rPr>
+        <w:t xml:space="preserve"> </w:t>
+      </w:r>
+      <w:r>
+        <w:rPr>
+          <w:color w:val="EE0000"/>
+          <w:lang w:val="en-US"/>
+        </w:rPr>
+        <w:t>(</w:t>
+      </w:r>
+      <w:r>
+        <w:rPr>
+          <w:color w:val="EE0000"/>
+          <w:lang w:val="en-US"/>
+        </w:rPr>
+        <w:t>higher because we are on the game level now instead of 5 min section</w:t>
+      </w:r>
+      <w:r>
+        <w:rPr>
+          <w:color w:val="EE0000"/>
+          <w:lang w:val="en-US"/>
+        </w:rPr>
+        <w:t>)</w:t>
+      </w:r>
+    </w:p>
+    <w:p>
+      <w:pPr>
+        <w:rPr>
+          <w:i/>
+          <w:iCs/>
+          <w:lang w:val="en-US"/>
+        </w:rPr>
+      </w:pPr>
+      <w:proofErr w:type="spellStart"/>
+      <w:r>
+        <w:rPr>
+          <w:i/>
+          <w:iCs/>
+          <w:lang w:val="en-US"/>
+        </w:rPr>
+        <w:t>set_</w:t>
+      </w:r>
+      <w:proofErr w:type="gramStart"/>
+      <w:r>
+        <w:rPr>
+          <w:i/>
+          <w:iCs/>
+          <w:lang w:val="en-US"/>
+        </w:rPr>
+        <w:t>prior</w:t>
+      </w:r>
+      <w:proofErr w:type="spellEnd"/>
+      <w:r>
+        <w:rPr>
+          <w:i/>
+          <w:iCs/>
+          <w:lang w:val="en-US"/>
+        </w:rPr>
+        <w:t>(</w:t>
+      </w:r>
+      <w:proofErr w:type="gramEnd"/>
+      <w:r>
+        <w:rPr>
+          <w:i/>
+          <w:iCs/>
+          <w:lang w:val="en-US"/>
+        </w:rPr>
+        <w:t>"</w:t>
+      </w:r>
+      <w:proofErr w:type="gramStart"/>
+      <w:r>
+        <w:rPr>
+          <w:i/>
+          <w:iCs/>
+          <w:lang w:val="en-US"/>
+        </w:rPr>
+        <w:t>normal(</w:t>
+      </w:r>
+      <w:proofErr w:type="gramEnd"/>
+      <w:r>
+        <w:rPr>
+          <w:i/>
+          <w:iCs/>
+          <w:lang w:val="en-US"/>
+        </w:rPr>
+        <w:t xml:space="preserve">-2.2, </w:t>
+      </w:r>
+      <w:r>
+        <w:rPr>
+          <w:i/>
+          <w:iCs/>
+          <w:lang w:val="en-US"/>
+        </w:rPr>
+        <w:t>0.3</w:t>
+      </w:r>
+      <w:r>
+        <w:rPr>
+          <w:i/>
+          <w:iCs/>
+          <w:lang w:val="en-US"/>
+        </w:rPr>
+        <w:t>)", class = "Intercept")</w:t>
+      </w:r>
+    </w:p>
+    <w:p>
+      <w:pPr>
+        <w:rPr>
+          <w:lang w:val="en-US"/>
+        </w:rPr>
+      </w:pPr>
+      <w:r>
+        <w:rPr>
+          <w:lang w:val="en-US"/>
+        </w:rPr>
+        <w:t xml:space="preserve">We are saying that the average probability for a goal in a game is around 10%. The mean was 11%. Every tenth game the avg. Forward or Midfielder scores, seems okay. I kept the variation the same. I would tend to say the probability is likely lower than in a 5 min section, because most sections have 0 </w:t>
+      </w:r>
+      <w:proofErr w:type="gramStart"/>
+      <w:r>
+        <w:rPr>
+          <w:lang w:val="en-US"/>
+        </w:rPr>
+        <w:t>goals</w:t>
+      </w:r>
+      <w:proofErr w:type="gramEnd"/>
+      <w:r>
+        <w:rPr>
+          <w:lang w:val="en-US"/>
+        </w:rPr>
+        <w:t xml:space="preserve"> but most games don’t.</w:t>
+      </w:r>
+    </w:p>
+    <w:p>
+      <w:pPr>
+        <w:rPr>
+          <w:lang w:val="en-US"/>
+        </w:rPr>
+      </w:pPr>
+    </w:p>
+    <w:p>
+      <w:pPr>
+        <w:tabs>
+          <w:tab w:val="left" w:pos="2993"/>
+        </w:tabs>
+        <w:rPr>
+          <w:lang w:val="en-US"/>
+        </w:rPr>
+      </w:pPr>
+      <w:r>
+        <w:rPr>
+          <w:lang w:val="en-US"/>
+        </w:rPr>
+        <w:t># general factors</w:t>
+      </w:r>
+      <w:r>
+        <w:rPr>
+          <w:lang w:val="en-US"/>
+        </w:rPr>
+        <w:tab/>
+      </w:r>
+    </w:p>
+    <w:p>
+      <w:pPr>
+        <w:tabs>
+          <w:tab w:val="left" w:pos="2993"/>
+        </w:tabs>
+        <w:rPr>
+          <w:i/>
+          <w:iCs/>
+          <w:lang w:val="en-US"/>
+        </w:rPr>
+      </w:pPr>
+      <w:proofErr w:type="spellStart"/>
+      <w:r>
+        <w:rPr>
+          <w:i/>
+          <w:iCs/>
+          <w:lang w:val="en-US"/>
+        </w:rPr>
+        <w:t>set_</w:t>
+      </w:r>
+      <w:proofErr w:type="gramStart"/>
+      <w:r>
+        <w:rPr>
+          <w:i/>
+          <w:iCs/>
+          <w:lang w:val="en-US"/>
+        </w:rPr>
+        <w:t>prior</w:t>
+      </w:r>
+      <w:proofErr w:type="spellEnd"/>
+      <w:r>
+        <w:rPr>
+          <w:i/>
+          <w:iCs/>
+          <w:lang w:val="en-US"/>
+        </w:rPr>
+        <w:t>(</w:t>
+      </w:r>
+      <w:proofErr w:type="gramEnd"/>
+      <w:r>
+        <w:rPr>
+          <w:i/>
+          <w:iCs/>
+          <w:lang w:val="en-US"/>
+        </w:rPr>
+        <w:t>"</w:t>
+      </w:r>
+      <w:proofErr w:type="gramStart"/>
+      <w:r>
+        <w:rPr>
+          <w:i/>
+          <w:iCs/>
+          <w:lang w:val="en-US"/>
+        </w:rPr>
+        <w:t>normal(</w:t>
+      </w:r>
+      <w:proofErr w:type="gramEnd"/>
+      <w:r>
+        <w:rPr>
+          <w:i/>
+          <w:iCs/>
+          <w:lang w:val="en-US"/>
+        </w:rPr>
+        <w:t>0, 0.5)", class = "b")</w:t>
+      </w:r>
+    </w:p>
+    <w:p>
+      <w:pPr>
+        <w:rPr>
+          <w:lang w:val="en-US"/>
+        </w:rPr>
+      </w:pPr>
+      <w:r>
+        <w:rPr>
+          <w:lang w:val="en-US"/>
+        </w:rPr>
+        <w:lastRenderedPageBreak/>
+        <w:t xml:space="preserve">all coefficients by default. We are saying the average factor </w:t>
+      </w:r>
+      <w:proofErr w:type="spellStart"/>
+      <w:r>
+        <w:rPr>
+          <w:lang w:val="en-US"/>
+        </w:rPr>
+        <w:t>tunring</w:t>
+      </w:r>
+      <w:proofErr w:type="spellEnd"/>
+      <w:r>
+        <w:rPr>
+          <w:lang w:val="en-US"/>
+        </w:rPr>
+        <w:t xml:space="preserve"> from 0 to 1 changes the probability from </w:t>
+      </w:r>
+      <w:proofErr w:type="gramStart"/>
+      <w:r>
+        <w:rPr>
+          <w:lang w:val="en-US"/>
+        </w:rPr>
+        <w:t>( 0.039</w:t>
+      </w:r>
+      <w:proofErr w:type="gramEnd"/>
+      <w:r>
+        <w:rPr>
+          <w:lang w:val="en-US"/>
+        </w:rPr>
+        <w:t xml:space="preserve"> ; 0.231</w:t>
+      </w:r>
+      <w:proofErr w:type="gramStart"/>
+      <w:r>
+        <w:rPr>
+          <w:lang w:val="en-US"/>
+        </w:rPr>
+        <w:t>) ,</w:t>
+      </w:r>
+      <w:proofErr w:type="gramEnd"/>
+      <w:r>
+        <w:rPr>
+          <w:lang w:val="en-US"/>
+        </w:rPr>
+        <w:t xml:space="preserve"> so 4% to 23%</w:t>
+      </w:r>
+    </w:p>
+    <w:p>
+      <w:pPr>
+        <w:rPr>
+          <w:lang w:val="en-US"/>
+        </w:rPr>
+      </w:pPr>
+    </w:p>
+    <w:p>
+      <w:pPr>
+        <w:rPr>
+          <w:lang w:val="en-US"/>
+        </w:rPr>
+      </w:pPr>
+      <w:r>
+        <w:rPr>
+          <w:lang w:val="en-US"/>
+        </w:rPr>
+        <w:t xml:space="preserve"># </w:t>
+      </w:r>
+      <w:proofErr w:type="spellStart"/>
+      <w:r>
+        <w:rPr>
+          <w:lang w:val="en-US"/>
+        </w:rPr>
+        <w:t>plaavspeed_game</w:t>
+      </w:r>
+      <w:proofErr w:type="spellEnd"/>
+      <w:r>
+        <w:rPr>
+          <w:lang w:val="en-US"/>
+        </w:rPr>
+        <w:t xml:space="preserve"> goes from 2.6 to 10.2, around 8 units </w:t>
+      </w:r>
+      <w:r>
+        <w:rPr>
+          <w:color w:val="EE0000"/>
+          <w:lang w:val="en-US"/>
+        </w:rPr>
+        <w:t>(change because of units)</w:t>
+      </w:r>
+    </w:p>
+    <w:p>
+      <w:pPr>
+        <w:rPr>
+          <w:i/>
+          <w:iCs/>
+          <w:lang w:val="en-US"/>
+        </w:rPr>
+      </w:pPr>
+      <w:proofErr w:type="spellStart"/>
+      <w:r>
+        <w:rPr>
+          <w:i/>
+          <w:iCs/>
+          <w:lang w:val="en-US"/>
+        </w:rPr>
+        <w:t>set_</w:t>
+      </w:r>
+      <w:proofErr w:type="gramStart"/>
+      <w:r>
+        <w:rPr>
+          <w:i/>
+          <w:iCs/>
+          <w:lang w:val="en-US"/>
+        </w:rPr>
+        <w:t>prior</w:t>
+      </w:r>
+      <w:proofErr w:type="spellEnd"/>
+      <w:r>
+        <w:rPr>
+          <w:i/>
+          <w:iCs/>
+          <w:lang w:val="en-US"/>
+        </w:rPr>
+        <w:t>(</w:t>
+      </w:r>
+      <w:proofErr w:type="gramEnd"/>
+      <w:r>
+        <w:rPr>
+          <w:i/>
+          <w:iCs/>
+          <w:lang w:val="en-US"/>
+        </w:rPr>
+        <w:t>"</w:t>
+      </w:r>
+      <w:proofErr w:type="gramStart"/>
+      <w:r>
+        <w:rPr>
+          <w:i/>
+          <w:iCs/>
+          <w:lang w:val="en-US"/>
+        </w:rPr>
+        <w:t>normal(</w:t>
+      </w:r>
+      <w:proofErr w:type="gramEnd"/>
+      <w:r>
+        <w:rPr>
+          <w:i/>
+          <w:iCs/>
+          <w:lang w:val="en-US"/>
+        </w:rPr>
+        <w:t xml:space="preserve">0, 0.05)", class = "b", </w:t>
+      </w:r>
+      <w:proofErr w:type="spellStart"/>
+      <w:r>
+        <w:rPr>
+          <w:i/>
+          <w:iCs/>
+          <w:lang w:val="en-US"/>
+        </w:rPr>
+        <w:t>coef</w:t>
+      </w:r>
+      <w:proofErr w:type="spellEnd"/>
+      <w:r>
+        <w:rPr>
+          <w:i/>
+          <w:iCs/>
+          <w:lang w:val="en-US"/>
+        </w:rPr>
+        <w:t xml:space="preserve"> = "</w:t>
+      </w:r>
+      <w:proofErr w:type="spellStart"/>
+      <w:r>
+        <w:rPr>
+          <w:i/>
+          <w:iCs/>
+          <w:lang w:val="en-US"/>
+        </w:rPr>
+        <w:t>plaavspeed_game_c</w:t>
+      </w:r>
+      <w:proofErr w:type="spellEnd"/>
+      <w:r>
+        <w:rPr>
+          <w:i/>
+          <w:iCs/>
+          <w:lang w:val="en-US"/>
+        </w:rPr>
+        <w:t>")</w:t>
+      </w:r>
+    </w:p>
+    <w:p>
+      <w:pPr>
+        <w:rPr>
+          <w:lang w:val="en-US"/>
+        </w:rPr>
+      </w:pPr>
+      <w:r>
+        <w:rPr>
+          <w:lang w:val="en-US"/>
+        </w:rPr>
+        <w:t>We are saying that increasing the average speed in the game from 2.6 km/h to 10.2km/h changes the scoring probability from (</w:t>
+      </w:r>
+      <w:proofErr w:type="gramStart"/>
+      <w:r>
+        <w:rPr>
+          <w:lang w:val="en-US"/>
+        </w:rPr>
+        <w:t>0.04742 ,</w:t>
+      </w:r>
+      <w:proofErr w:type="gramEnd"/>
+      <w:r>
+        <w:rPr>
+          <w:lang w:val="en-US"/>
+        </w:rPr>
+        <w:t xml:space="preserve"> 0.1978) so from 4.7% to 20%</w:t>
+      </w:r>
+      <w:r>
+        <w:rPr>
+          <w:lang w:val="en-US"/>
+        </w:rPr>
+        <w:t>.</w:t>
+      </w:r>
+    </w:p>
+    <w:p>
+      <w:pPr>
+        <w:rPr>
+          <w:lang w:val="en-US"/>
+        </w:rPr>
+      </w:pPr>
+    </w:p>
+    <w:p>
+      <w:pPr>
+        <w:rPr>
+          <w:lang w:val="en-US"/>
+        </w:rPr>
+      </w:pPr>
+      <w:r>
+        <w:rPr>
+          <w:lang w:val="en-US"/>
+        </w:rPr>
+        <w:t>#homegame</w:t>
+      </w:r>
+    </w:p>
+    <w:p>
+      <w:pPr>
+        <w:rPr>
+          <w:i/>
+          <w:iCs/>
+          <w:lang w:val="en-US"/>
+        </w:rPr>
+      </w:pPr>
+      <w:proofErr w:type="spellStart"/>
+      <w:r>
+        <w:rPr>
+          <w:i/>
+          <w:iCs/>
+          <w:lang w:val="en-US"/>
+        </w:rPr>
+        <w:t>set_</w:t>
+      </w:r>
+      <w:proofErr w:type="gramStart"/>
+      <w:r>
+        <w:rPr>
+          <w:i/>
+          <w:iCs/>
+          <w:lang w:val="en-US"/>
+        </w:rPr>
+        <w:t>prior</w:t>
+      </w:r>
+      <w:proofErr w:type="spellEnd"/>
+      <w:r>
+        <w:rPr>
+          <w:i/>
+          <w:iCs/>
+          <w:lang w:val="en-US"/>
+        </w:rPr>
+        <w:t>(</w:t>
+      </w:r>
+      <w:proofErr w:type="gramEnd"/>
+      <w:r>
+        <w:rPr>
+          <w:i/>
+          <w:iCs/>
+          <w:lang w:val="en-US"/>
+        </w:rPr>
+        <w:t>"</w:t>
+      </w:r>
+      <w:proofErr w:type="gramStart"/>
+      <w:r>
+        <w:rPr>
+          <w:i/>
+          <w:iCs/>
+          <w:lang w:val="en-US"/>
+        </w:rPr>
+        <w:t>normal(</w:t>
+      </w:r>
+      <w:proofErr w:type="gramEnd"/>
+      <w:r>
+        <w:rPr>
+          <w:i/>
+          <w:iCs/>
+          <w:lang w:val="en-US"/>
+        </w:rPr>
+        <w:t xml:space="preserve">0, 0.5)", class = "b", </w:t>
+      </w:r>
+      <w:proofErr w:type="spellStart"/>
+      <w:r>
+        <w:rPr>
+          <w:i/>
+          <w:iCs/>
+          <w:lang w:val="en-US"/>
+        </w:rPr>
+        <w:t>coef</w:t>
+      </w:r>
+      <w:proofErr w:type="spellEnd"/>
+      <w:r>
+        <w:rPr>
+          <w:i/>
+          <w:iCs/>
+          <w:lang w:val="en-US"/>
+        </w:rPr>
+        <w:t xml:space="preserve"> = "</w:t>
+      </w:r>
+      <w:proofErr w:type="spellStart"/>
+      <w:r>
+        <w:rPr>
+          <w:i/>
+          <w:iCs/>
+          <w:lang w:val="en-US"/>
+        </w:rPr>
+        <w:t>dhomegame</w:t>
+      </w:r>
+      <w:proofErr w:type="spellEnd"/>
+      <w:r>
+        <w:rPr>
+          <w:i/>
+          <w:iCs/>
+          <w:lang w:val="en-US"/>
+        </w:rPr>
+        <w:t>")</w:t>
+      </w:r>
+    </w:p>
+    <w:p>
+      <w:pPr>
+        <w:rPr>
+          <w:lang w:val="en-US"/>
+        </w:rPr>
+      </w:pPr>
+      <w:r>
+        <w:rPr>
+          <w:lang w:val="en-US"/>
+        </w:rPr>
+        <w:t xml:space="preserve">We are saying playing at home vs not playing </w:t>
+      </w:r>
+      <w:proofErr w:type="spellStart"/>
+      <w:r>
+        <w:rPr>
+          <w:lang w:val="en-US"/>
+        </w:rPr>
+        <w:t>playing</w:t>
+      </w:r>
+      <w:proofErr w:type="spellEnd"/>
+      <w:r>
+        <w:rPr>
+          <w:lang w:val="en-US"/>
+        </w:rPr>
+        <w:t xml:space="preserve"> at home changes the probability from </w:t>
+      </w:r>
+      <w:proofErr w:type="gramStart"/>
+      <w:r>
+        <w:rPr>
+          <w:lang w:val="en-US"/>
+        </w:rPr>
+        <w:t>( 0.039</w:t>
+      </w:r>
+      <w:proofErr w:type="gramEnd"/>
+      <w:r>
+        <w:rPr>
+          <w:lang w:val="en-US"/>
+        </w:rPr>
+        <w:t xml:space="preserve"> ; 0.231</w:t>
+      </w:r>
+      <w:proofErr w:type="gramStart"/>
+      <w:r>
+        <w:rPr>
+          <w:lang w:val="en-US"/>
+        </w:rPr>
+        <w:t>) ,</w:t>
+      </w:r>
+      <w:proofErr w:type="gramEnd"/>
+      <w:r>
+        <w:rPr>
+          <w:lang w:val="en-US"/>
+        </w:rPr>
+        <w:t xml:space="preserve"> so 4% to 23%</w:t>
+      </w:r>
+    </w:p>
+    <w:p>
+      <w:pPr>
+        <w:rPr>
+          <w:lang w:val="en-US"/>
+        </w:rPr>
+      </w:pPr>
+    </w:p>
+    <w:p>
+      <w:pPr>
+        <w:rPr>
+          <w:lang w:val="en-US"/>
+        </w:rPr>
+      </w:pPr>
+      <w:r>
+        <w:rPr>
+          <w:lang w:val="en-US"/>
+        </w:rPr>
+        <w:t xml:space="preserve">#rankgap goes from -13 to 13 so 26 units </w:t>
+      </w:r>
+      <w:r>
+        <w:rPr>
+          <w:color w:val="EE0000"/>
+          <w:lang w:val="en-US"/>
+        </w:rPr>
+        <w:t>(changed because of units)</w:t>
+      </w:r>
+    </w:p>
+    <w:p>
+      <w:pPr>
+        <w:rPr>
+          <w:i/>
+          <w:iCs/>
+          <w:lang w:val="en-US"/>
+        </w:rPr>
+      </w:pPr>
+      <w:proofErr w:type="spellStart"/>
+      <w:r>
+        <w:rPr>
+          <w:i/>
+          <w:iCs/>
+          <w:lang w:val="en-US"/>
+        </w:rPr>
+        <w:t>set_</w:t>
+      </w:r>
+      <w:proofErr w:type="gramStart"/>
+      <w:r>
+        <w:rPr>
+          <w:i/>
+          <w:iCs/>
+          <w:lang w:val="en-US"/>
+        </w:rPr>
+        <w:t>prior</w:t>
+      </w:r>
+      <w:proofErr w:type="spellEnd"/>
+      <w:r>
+        <w:rPr>
+          <w:i/>
+          <w:iCs/>
+          <w:lang w:val="en-US"/>
+        </w:rPr>
+        <w:t>(</w:t>
+      </w:r>
+      <w:proofErr w:type="gramEnd"/>
+      <w:r>
+        <w:rPr>
+          <w:i/>
+          <w:iCs/>
+          <w:lang w:val="en-US"/>
+        </w:rPr>
+        <w:t>"</w:t>
+      </w:r>
+      <w:proofErr w:type="gramStart"/>
+      <w:r>
+        <w:rPr>
+          <w:i/>
+          <w:iCs/>
+          <w:lang w:val="en-US"/>
+        </w:rPr>
+        <w:t>normal(</w:t>
+      </w:r>
+      <w:proofErr w:type="gramEnd"/>
+      <w:r>
+        <w:rPr>
+          <w:i/>
+          <w:iCs/>
+          <w:lang w:val="en-US"/>
+        </w:rPr>
+        <w:t xml:space="preserve">0, 0.015)", class = "b", </w:t>
+      </w:r>
+      <w:proofErr w:type="spellStart"/>
+      <w:r>
+        <w:rPr>
+          <w:i/>
+          <w:iCs/>
+          <w:lang w:val="en-US"/>
+        </w:rPr>
+        <w:t>coef</w:t>
+      </w:r>
+      <w:proofErr w:type="spellEnd"/>
+      <w:r>
+        <w:rPr>
+          <w:i/>
+          <w:iCs/>
+          <w:lang w:val="en-US"/>
+        </w:rPr>
+        <w:t xml:space="preserve"> = "</w:t>
+      </w:r>
+      <w:proofErr w:type="spellStart"/>
+      <w:r>
+        <w:rPr>
+          <w:i/>
+          <w:iCs/>
+          <w:lang w:val="en-US"/>
+        </w:rPr>
+        <w:t>rank_gap_c</w:t>
+      </w:r>
+      <w:proofErr w:type="spellEnd"/>
+      <w:r>
+        <w:rPr>
+          <w:i/>
+          <w:iCs/>
+          <w:lang w:val="en-US"/>
+        </w:rPr>
+        <w:t>")</w:t>
+      </w:r>
+    </w:p>
+    <w:p>
+      <w:pPr>
+        <w:rPr>
+          <w:lang w:val="en-US"/>
+        </w:rPr>
+      </w:pPr>
+      <w:r>
+        <w:rPr>
+          <w:lang w:val="en-US"/>
+        </w:rPr>
+        <w:t xml:space="preserve">We </w:t>
+      </w:r>
+      <w:proofErr w:type="gramStart"/>
+      <w:r>
+        <w:rPr>
+          <w:lang w:val="en-US"/>
+        </w:rPr>
+        <w:t>are saying</w:t>
+      </w:r>
+      <w:proofErr w:type="gramEnd"/>
+      <w:r>
+        <w:rPr>
+          <w:lang w:val="en-US"/>
+        </w:rPr>
+        <w:t xml:space="preserve"> playing with 13 ranks higher compared to playing with 13 ranks lower than the opponent changes the probability of winning from (</w:t>
+      </w:r>
+      <w:proofErr w:type="gramStart"/>
+      <w:r>
+        <w:rPr>
+          <w:lang w:val="en-US"/>
+        </w:rPr>
+        <w:t>0.0483 ,</w:t>
+      </w:r>
+      <w:proofErr w:type="gramEnd"/>
+      <w:r>
+        <w:rPr>
+          <w:lang w:val="en-US"/>
+        </w:rPr>
+        <w:t xml:space="preserve"> 0.1946) so from 4.8% to 19.4%.</w:t>
+      </w:r>
+    </w:p>
+    <w:p>
+      <w:pPr>
+        <w:rPr>
+          <w:lang w:val="en-US"/>
+        </w:rPr>
+      </w:pPr>
+    </w:p>
+    <w:p>
+      <w:pPr>
+        <w:rPr>
+          <w:lang w:val="en-US"/>
+        </w:rPr>
+      </w:pPr>
+      <w:r>
+        <w:rPr>
+          <w:lang w:val="en-US"/>
+        </w:rPr>
+        <w:t>Neu</w:t>
+      </w:r>
+      <w:r>
+        <w:rPr>
+          <w:lang w:val="en-US"/>
+        </w:rPr>
+        <w:t xml:space="preserve">: still looks plausible. </w:t>
+      </w:r>
+      <w:proofErr w:type="gramStart"/>
+      <w:r>
+        <w:rPr>
+          <w:lang w:val="en-US"/>
+        </w:rPr>
+        <w:t>A bit</w:t>
+      </w:r>
+      <w:proofErr w:type="gramEnd"/>
+      <w:r>
+        <w:rPr>
+          <w:lang w:val="en-US"/>
+        </w:rPr>
+        <w:t xml:space="preserve"> tighter but also more realistic with the intercept.</w:t>
+      </w:r>
+    </w:p>
+    <w:p>
+      <w:pPr>
+        <w:rPr>
+          <w:lang w:val="en-US"/>
+        </w:rPr>
+      </w:pPr>
+      <w:r>
+        <w:rPr>
+          <w:noProof/>
+          <w:lang w:val="en-US"/>
+        </w:rPr>
+        <w:drawing>
+          <wp:inline distT="0" distB="0" distL="0" distR="0" wp14:anchorId="281D5754" wp14:editId="7B068E8E">
+            <wp:extent cx="4585739" cy="2833331"/>
+            <wp:effectExtent l="0" t="0" r="5715" b="5715"/>
+            <wp:docPr id="1301279232" name="Grafik 7"/>
+            <wp:cNvGraphicFramePr>
+              <a:graphicFrameLocks xmlns:a="http://schemas.openxmlformats.org/drawingml/2006/main" noChangeAspect="1"/>
+            </wp:cNvGraphicFramePr>
+            <a:graphic xmlns:a="http://schemas.openxmlformats.org/drawingml/2006/main">
+              <a:graphicData uri="http://schemas.openxmlformats.org/drawingml/2006/picture">
+                <pic:pic xmlns:pic="http://schemas.openxmlformats.org/drawingml/2006/picture">
+                  <pic:nvPicPr>
+                    <pic:cNvPr id="0" name="Picture 7"/>
+                    <pic:cNvPicPr>
+                      <a:picLocks noChangeAspect="1" noChangeArrowheads="1"/>
+                    </pic:cNvPicPr>
+                  </pic:nvPicPr>
+                  <pic:blipFill>
+                    <a:blip r:embed="rId17" cstate="print">
+                      <a:extLst>
+                        <a:ext uri="{28A0092B-C50C-407E-A947-70E740481C1C}">
+                          <a14:useLocalDpi xmlns:a14="http://schemas.microsoft.com/office/drawing/2010/main" val="0"/>
+                        </a:ext>
+                      </a:extLst>
+                    </a:blip>
+                    <a:srcRect/>
+                    <a:stretch>
+                      <a:fillRect/>
+                    </a:stretch>
+                  </pic:blipFill>
+                  <pic:spPr bwMode="auto">
+                    <a:xfrm>
+                      <a:off x="0" y="0"/>
+                      <a:ext cx="4630812" cy="2861180"/>
+                    </a:xfrm>
+                    <a:prstGeom prst="rect">
+                      <a:avLst/>
+                    </a:prstGeom>
+                    <a:noFill/>
+                  </pic:spPr>
+                </pic:pic>
+              </a:graphicData>
+            </a:graphic>
+          </wp:inline>
+        </w:drawing>
+      </w:r>
+    </w:p>
+    <w:p>
+      <w:pPr>
+        <w:rPr>
+          <w:lang w:val="en-US"/>
+        </w:rPr>
+      </w:pPr>
+    </w:p>
+    <w:p>
+      <w:pPr>
+        <w:rPr>
+          <w:lang w:val="en-US"/>
+        </w:rPr>
+      </w:pPr>
+    </w:p>
+    <w:p>
+      <w:pPr>
+        <w:rPr>
+          <w:u w:val="single"/>
+          <w:lang w:val="en-US"/>
+        </w:rPr>
+      </w:pPr>
+      <w:r>
+        <w:rPr>
+          <w:u w:val="single"/>
+          <w:lang w:val="en-US"/>
+        </w:rPr>
+        <w:lastRenderedPageBreak/>
+        <w:t xml:space="preserve">Table </w:t>
+      </w:r>
+      <w:r>
+        <w:rPr>
+          <w:u w:val="single"/>
+          <w:lang w:val="en-US"/>
+        </w:rPr>
+        <w:t>3</w:t>
+      </w:r>
+    </w:p>
+    <w:p>
+      <w:pPr>
+        <w:rPr>
+          <w:u w:val="single"/>
+          <w:lang w:val="en-US"/>
+        </w:rPr>
+      </w:pPr>
+      <w:r>
+        <w:rPr>
+          <w:u w:val="single"/>
+          <w:lang w:val="en-US"/>
+        </w:rPr>
+        <w:t>Column 1</w:t>
+      </w:r>
+    </w:p>
+    <w:p>
+      <w:pPr>
+        <w:rPr>
+          <w:lang w:val="en-US"/>
+        </w:rPr>
+      </w:pPr>
+      <w:r>
+        <w:rPr>
+          <w:lang w:val="en-US"/>
+        </w:rPr>
+        <w:t>Alt: problematic, the blue lines don’t capture the data. The winning probability is consistently overestimated.</w:t>
+      </w:r>
+    </w:p>
+    <w:p>
+      <w:pPr>
+        <w:rPr>
+          <w:lang w:val="en-US"/>
+        </w:rPr>
+      </w:pPr>
+      <w:r>
+        <w:rPr>
+          <w:noProof/>
+          <w:lang w:val="en-US"/>
+        </w:rPr>
+        <w:drawing>
+          <wp:inline distT="0" distB="0" distL="0" distR="0" wp14:anchorId="2B44F4EB" wp14:editId="6AF88AA5">
+            <wp:extent cx="5350317" cy="3305732"/>
+            <wp:effectExtent l="0" t="0" r="3175" b="9525"/>
+            <wp:docPr id="1546877637" name="Grafik 9"/>
+            <wp:cNvGraphicFramePr>
+              <a:graphicFrameLocks xmlns:a="http://schemas.openxmlformats.org/drawingml/2006/main" noChangeAspect="1"/>
+            </wp:cNvGraphicFramePr>
+            <a:graphic xmlns:a="http://schemas.openxmlformats.org/drawingml/2006/main">
+              <a:graphicData uri="http://schemas.openxmlformats.org/drawingml/2006/picture">
+                <pic:pic xmlns:pic="http://schemas.openxmlformats.org/drawingml/2006/picture">
+                  <pic:nvPicPr>
+                    <pic:cNvPr id="0" name="Picture 8"/>
+                    <pic:cNvPicPr>
+                      <a:picLocks noChangeAspect="1" noChangeArrowheads="1"/>
+                    </pic:cNvPicPr>
+                  </pic:nvPicPr>
+                  <pic:blipFill>
+                    <a:blip r:embed="rId18" cstate="print">
+                      <a:extLst>
+                        <a:ext uri="{28A0092B-C50C-407E-A947-70E740481C1C}">
+                          <a14:useLocalDpi xmlns:a14="http://schemas.microsoft.com/office/drawing/2010/main" val="0"/>
+                        </a:ext>
+                      </a:extLst>
+                    </a:blip>
+                    <a:srcRect/>
+                    <a:stretch>
+                      <a:fillRect/>
+                    </a:stretch>
+                  </pic:blipFill>
+                  <pic:spPr bwMode="auto">
+                    <a:xfrm>
+                      <a:off x="0" y="0"/>
+                      <a:ext cx="5372327" cy="3319331"/>
+                    </a:xfrm>
+                    <a:prstGeom prst="rect">
+                      <a:avLst/>
+                    </a:prstGeom>
+                    <a:noFill/>
+                  </pic:spPr>
+                </pic:pic>
+              </a:graphicData>
+            </a:graphic>
+          </wp:inline>
+        </w:drawing>
+      </w:r>
+    </w:p>
+    <w:p>
+      <w:pPr>
+        <w:rPr>
+          <w:lang w:val="en-US"/>
+        </w:rPr>
+      </w:pPr>
+      <w:r>
+        <w:rPr>
+          <w:lang w:val="en-US"/>
+        </w:rPr>
+        <w:t xml:space="preserve"># intercept </w:t>
+      </w:r>
+      <w:r>
+        <w:rPr>
+          <w:color w:val="EE0000"/>
+          <w:lang w:val="en-US"/>
+        </w:rPr>
+        <w:t xml:space="preserve">(change to reflect the avg of 38% and still capture the 5% and 95%, which are higher than the BO. The BO </w:t>
+      </w:r>
+      <w:proofErr w:type="gramStart"/>
+      <w:r>
+        <w:rPr>
+          <w:color w:val="EE0000"/>
+          <w:lang w:val="en-US"/>
+        </w:rPr>
+        <w:t>go</w:t>
+      </w:r>
+      <w:proofErr w:type="gramEnd"/>
+      <w:r>
+        <w:rPr>
+          <w:color w:val="EE0000"/>
+          <w:lang w:val="en-US"/>
+        </w:rPr>
+        <w:t xml:space="preserve"> from 6% to 77%, we believe each value of those should be captured.)</w:t>
+      </w:r>
+    </w:p>
+    <w:p>
+      <w:pPr>
+        <w:rPr>
+          <w:i/>
+          <w:iCs/>
+          <w:lang w:val="en-US"/>
+        </w:rPr>
+      </w:pPr>
+      <w:proofErr w:type="spellStart"/>
+      <w:r>
+        <w:rPr>
+          <w:i/>
+          <w:iCs/>
+          <w:lang w:val="en-US"/>
+        </w:rPr>
+        <w:t>set_</w:t>
+      </w:r>
+      <w:proofErr w:type="gramStart"/>
+      <w:r>
+        <w:rPr>
+          <w:i/>
+          <w:iCs/>
+          <w:lang w:val="en-US"/>
+        </w:rPr>
+        <w:t>prior</w:t>
+      </w:r>
+      <w:proofErr w:type="spellEnd"/>
+      <w:r>
+        <w:rPr>
+          <w:i/>
+          <w:iCs/>
+          <w:lang w:val="en-US"/>
+        </w:rPr>
+        <w:t>(</w:t>
+      </w:r>
+      <w:proofErr w:type="gramEnd"/>
+      <w:r>
+        <w:rPr>
+          <w:i/>
+          <w:iCs/>
+          <w:lang w:val="en-US"/>
+        </w:rPr>
+        <w:t>"</w:t>
+      </w:r>
+      <w:proofErr w:type="gramStart"/>
+      <w:r>
+        <w:rPr>
+          <w:i/>
+          <w:iCs/>
+          <w:lang w:val="en-US"/>
+        </w:rPr>
+        <w:t>normal(</w:t>
+      </w:r>
+      <w:proofErr w:type="gramEnd"/>
+      <w:r>
+        <w:rPr>
+          <w:i/>
+          <w:iCs/>
+          <w:lang w:val="en-US"/>
+        </w:rPr>
+        <w:t>-0.48, 1.23)", class = "Intercept")</w:t>
+      </w:r>
+    </w:p>
+    <w:p>
+      <w:pPr>
+        <w:rPr>
+          <w:lang w:val="en-US"/>
+        </w:rPr>
+      </w:pPr>
+      <w:r>
+        <w:rPr>
+          <w:lang w:val="en-US"/>
+        </w:rPr>
+        <w:t>38% baseline chance, 95% of values will be between [0.05, 0.95], this is wider than the BO range of 6% to 77%</w:t>
+      </w:r>
+    </w:p>
+    <w:p>
+      <w:pPr>
+        <w:rPr>
+          <w:lang w:val="en-US"/>
+        </w:rPr>
+      </w:pPr>
+    </w:p>
+    <w:p>
+      <w:pPr>
+        <w:rPr>
+          <w:lang w:val="en-US"/>
+        </w:rPr>
+      </w:pPr>
+      <w:r>
+        <w:rPr>
+          <w:lang w:val="en-US"/>
+        </w:rPr>
+        <w:t xml:space="preserve"># </w:t>
+      </w:r>
+      <w:proofErr w:type="spellStart"/>
+      <w:r>
+        <w:rPr>
+          <w:lang w:val="en-US"/>
+        </w:rPr>
+        <w:t>teamdist_game</w:t>
+      </w:r>
+      <w:proofErr w:type="spellEnd"/>
+      <w:r>
+        <w:rPr>
+          <w:lang w:val="en-US"/>
+        </w:rPr>
+        <w:t xml:space="preserve"> goes from 19426 to 26649 so 7223 units </w:t>
+      </w:r>
+      <w:r>
+        <w:rPr>
+          <w:color w:val="EE0000"/>
+          <w:lang w:val="en-US"/>
+        </w:rPr>
+        <w:t>(changed because of 7223 units)</w:t>
+      </w:r>
+    </w:p>
+    <w:p>
+      <w:pPr>
+        <w:rPr>
+          <w:i/>
+          <w:iCs/>
+          <w:lang w:val="en-US"/>
+        </w:rPr>
+      </w:pPr>
+      <w:proofErr w:type="spellStart"/>
+      <w:r>
+        <w:rPr>
+          <w:i/>
+          <w:iCs/>
+          <w:lang w:val="en-US"/>
+        </w:rPr>
+        <w:t>set_</w:t>
+      </w:r>
+      <w:proofErr w:type="gramStart"/>
+      <w:r>
+        <w:rPr>
+          <w:i/>
+          <w:iCs/>
+          <w:lang w:val="en-US"/>
+        </w:rPr>
+        <w:t>prior</w:t>
+      </w:r>
+      <w:proofErr w:type="spellEnd"/>
+      <w:r>
+        <w:rPr>
+          <w:i/>
+          <w:iCs/>
+          <w:lang w:val="en-US"/>
+        </w:rPr>
+        <w:t>(</w:t>
+      </w:r>
+      <w:proofErr w:type="gramEnd"/>
+      <w:r>
+        <w:rPr>
+          <w:i/>
+          <w:iCs/>
+          <w:lang w:val="en-US"/>
+        </w:rPr>
+        <w:t>"</w:t>
+      </w:r>
+      <w:proofErr w:type="gramStart"/>
+      <w:r>
+        <w:rPr>
+          <w:i/>
+          <w:iCs/>
+          <w:lang w:val="en-US"/>
+        </w:rPr>
+        <w:t>normal(</w:t>
+      </w:r>
+      <w:proofErr w:type="gramEnd"/>
+      <w:r>
+        <w:rPr>
+          <w:i/>
+          <w:iCs/>
+          <w:lang w:val="en-US"/>
+        </w:rPr>
+        <w:t xml:space="preserve">0, 0.0001)", class = "b", </w:t>
+      </w:r>
+      <w:proofErr w:type="spellStart"/>
+      <w:r>
+        <w:rPr>
+          <w:i/>
+          <w:iCs/>
+          <w:lang w:val="en-US"/>
+        </w:rPr>
+        <w:t>coef</w:t>
+      </w:r>
+      <w:proofErr w:type="spellEnd"/>
+      <w:r>
+        <w:rPr>
+          <w:i/>
+          <w:iCs/>
+          <w:lang w:val="en-US"/>
+        </w:rPr>
+        <w:t xml:space="preserve"> = "</w:t>
+      </w:r>
+      <w:proofErr w:type="spellStart"/>
+      <w:r>
+        <w:rPr>
+          <w:i/>
+          <w:iCs/>
+          <w:lang w:val="en-US"/>
+        </w:rPr>
+        <w:t>teamdist_c</w:t>
+      </w:r>
+      <w:proofErr w:type="spellEnd"/>
+      <w:r>
+        <w:rPr>
+          <w:i/>
+          <w:iCs/>
+          <w:lang w:val="en-US"/>
+        </w:rPr>
+        <w:t>")</w:t>
+      </w:r>
+    </w:p>
+    <w:p>
+      <w:pPr>
+        <w:rPr>
+          <w:lang w:val="en-US"/>
+        </w:rPr>
+      </w:pPr>
+      <w:proofErr w:type="gramStart"/>
+      <w:r>
+        <w:rPr>
+          <w:lang w:val="en-US"/>
+        </w:rPr>
+        <w:t>we</w:t>
+      </w:r>
+      <w:proofErr w:type="gramEnd"/>
+      <w:r>
+        <w:rPr>
+          <w:lang w:val="en-US"/>
+        </w:rPr>
+        <w:t xml:space="preserve"> are saying that a team tha</w:t>
+      </w:r>
+      <w:r>
+        <w:rPr>
+          <w:lang w:val="en-US"/>
+        </w:rPr>
+        <w:t>t</w:t>
+      </w:r>
+      <w:r>
+        <w:rPr>
+          <w:lang w:val="en-US"/>
+        </w:rPr>
+        <w:t xml:space="preserve"> runs 26.649km compared to a team that runs 19.426 will change the probability of winning between (</w:t>
+      </w:r>
+      <w:proofErr w:type="gramStart"/>
+      <w:r>
+        <w:rPr>
+          <w:lang w:val="en-US"/>
+        </w:rPr>
+        <w:t>0.12 ,</w:t>
+      </w:r>
+      <w:proofErr w:type="gramEnd"/>
+      <w:r>
+        <w:rPr>
+          <w:lang w:val="en-US"/>
+        </w:rPr>
+        <w:t xml:space="preserve"> </w:t>
+      </w:r>
+      <w:proofErr w:type="gramStart"/>
+      <w:r>
+        <w:rPr>
+          <w:lang w:val="en-US"/>
+        </w:rPr>
+        <w:t>0.72 )</w:t>
+      </w:r>
+      <w:proofErr w:type="gramEnd"/>
+      <w:r>
+        <w:rPr>
+          <w:lang w:val="en-US"/>
+        </w:rPr>
+        <w:t xml:space="preserve"> so from 12% to 72%</w:t>
+      </w:r>
+    </w:p>
+    <w:p>
+      <w:pPr>
+        <w:rPr>
+          <w:lang w:val="en-US"/>
+        </w:rPr>
+      </w:pPr>
+    </w:p>
+    <w:p>
+      <w:pPr>
+        <w:rPr>
+          <w:lang w:val="en-US"/>
+        </w:rPr>
+      </w:pPr>
+      <w:r>
+        <w:rPr>
+          <w:lang w:val="en-US"/>
+        </w:rPr>
+        <w:t>#oppdist goes from</w:t>
+      </w:r>
+      <w:r>
+        <w:rPr>
+          <w:lang w:val="en-US"/>
+        </w:rPr>
+        <w:t xml:space="preserve"> </w:t>
+      </w:r>
+      <w:r>
+        <w:rPr>
+          <w:lang w:val="en-US"/>
+        </w:rPr>
+        <w:t xml:space="preserve">20514 </w:t>
+      </w:r>
+      <w:proofErr w:type="spellStart"/>
+      <w:r>
+        <w:rPr>
+          <w:lang w:val="en-US"/>
+        </w:rPr>
+        <w:t>ro</w:t>
+      </w:r>
+      <w:proofErr w:type="spellEnd"/>
+      <w:r>
+        <w:rPr>
+          <w:lang w:val="en-US"/>
+        </w:rPr>
+        <w:t xml:space="preserve"> 26515 s</w:t>
+      </w:r>
+      <w:r>
+        <w:rPr>
+          <w:lang w:val="en-US"/>
+        </w:rPr>
+        <w:t xml:space="preserve">o 6001 units </w:t>
+      </w:r>
+      <w:r>
+        <w:rPr>
+          <w:color w:val="EE0000"/>
+          <w:lang w:val="en-US"/>
+        </w:rPr>
+        <w:t>(changed because of units)</w:t>
+      </w:r>
+    </w:p>
+    <w:p>
+      <w:pPr>
+        <w:rPr>
+          <w:i/>
+          <w:iCs/>
+          <w:lang w:val="en-US"/>
+        </w:rPr>
+      </w:pPr>
+      <w:r>
+        <w:rPr>
+          <w:i/>
+          <w:iCs/>
+          <w:lang w:val="en-US"/>
+        </w:rPr>
+        <w:t xml:space="preserve"> </w:t>
+      </w:r>
+      <w:proofErr w:type="spellStart"/>
+      <w:r>
+        <w:rPr>
+          <w:i/>
+          <w:iCs/>
+          <w:lang w:val="en-US"/>
+        </w:rPr>
+        <w:t>set_</w:t>
+      </w:r>
+      <w:proofErr w:type="gramStart"/>
+      <w:r>
+        <w:rPr>
+          <w:i/>
+          <w:iCs/>
+          <w:lang w:val="en-US"/>
+        </w:rPr>
+        <w:t>prior</w:t>
+      </w:r>
+      <w:proofErr w:type="spellEnd"/>
+      <w:r>
+        <w:rPr>
+          <w:i/>
+          <w:iCs/>
+          <w:lang w:val="en-US"/>
+        </w:rPr>
+        <w:t>(</w:t>
+      </w:r>
+      <w:proofErr w:type="gramEnd"/>
+      <w:r>
+        <w:rPr>
+          <w:i/>
+          <w:iCs/>
+          <w:lang w:val="en-US"/>
+        </w:rPr>
+        <w:t>"</w:t>
+      </w:r>
+      <w:proofErr w:type="gramStart"/>
+      <w:r>
+        <w:rPr>
+          <w:i/>
+          <w:iCs/>
+          <w:lang w:val="en-US"/>
+        </w:rPr>
+        <w:t>normal(</w:t>
+      </w:r>
+      <w:proofErr w:type="gramEnd"/>
+      <w:r>
+        <w:rPr>
+          <w:i/>
+          <w:iCs/>
+          <w:lang w:val="en-US"/>
+        </w:rPr>
+        <w:t xml:space="preserve">0, 0.0001)", class = "b", </w:t>
+      </w:r>
+      <w:proofErr w:type="spellStart"/>
+      <w:r>
+        <w:rPr>
+          <w:i/>
+          <w:iCs/>
+          <w:lang w:val="en-US"/>
+        </w:rPr>
+        <w:t>coef</w:t>
+      </w:r>
+      <w:proofErr w:type="spellEnd"/>
+      <w:r>
+        <w:rPr>
+          <w:i/>
+          <w:iCs/>
+          <w:lang w:val="en-US"/>
+        </w:rPr>
+        <w:t xml:space="preserve"> = "</w:t>
+      </w:r>
+      <w:proofErr w:type="spellStart"/>
+      <w:r>
+        <w:rPr>
+          <w:i/>
+          <w:iCs/>
+          <w:lang w:val="en-US"/>
+        </w:rPr>
+        <w:t>oppdist_c</w:t>
+      </w:r>
+      <w:proofErr w:type="spellEnd"/>
+      <w:r>
+        <w:rPr>
+          <w:i/>
+          <w:iCs/>
+          <w:lang w:val="en-US"/>
+        </w:rPr>
+        <w:t>")</w:t>
+      </w:r>
+    </w:p>
+    <w:p>
+      <w:pPr>
+        <w:rPr>
+          <w:lang w:val="en-US"/>
+        </w:rPr>
+      </w:pPr>
+      <w:proofErr w:type="gramStart"/>
+      <w:r>
+        <w:rPr>
+          <w:lang w:val="en-US"/>
+        </w:rPr>
+        <w:t>w</w:t>
+      </w:r>
+      <w:r>
+        <w:rPr>
+          <w:lang w:val="en-US"/>
+        </w:rPr>
+        <w:t>e</w:t>
+      </w:r>
+      <w:proofErr w:type="gramEnd"/>
+      <w:r>
+        <w:rPr>
+          <w:lang w:val="en-US"/>
+        </w:rPr>
+        <w:t xml:space="preserve"> </w:t>
+      </w:r>
+      <w:proofErr w:type="gramStart"/>
+      <w:r>
+        <w:rPr>
+          <w:lang w:val="en-US"/>
+        </w:rPr>
+        <w:t>are saying</w:t>
+      </w:r>
+      <w:proofErr w:type="gramEnd"/>
+      <w:r>
+        <w:rPr>
+          <w:lang w:val="en-US"/>
+        </w:rPr>
+        <w:t xml:space="preserve"> that a team whose opponent runs 26.515 compared to a team that runs 20.514 will change the probability of winning between (</w:t>
+      </w:r>
+      <w:proofErr w:type="gramStart"/>
+      <w:r>
+        <w:rPr>
+          <w:lang w:val="en-US"/>
+        </w:rPr>
+        <w:t>0.15 ,</w:t>
+      </w:r>
+      <w:proofErr w:type="gramEnd"/>
+      <w:r>
+        <w:rPr>
+          <w:lang w:val="en-US"/>
+        </w:rPr>
+        <w:t xml:space="preserve"> </w:t>
+      </w:r>
+      <w:proofErr w:type="gramStart"/>
+      <w:r>
+        <w:rPr>
+          <w:lang w:val="en-US"/>
+        </w:rPr>
+        <w:t>0.67 )</w:t>
+      </w:r>
+      <w:proofErr w:type="gramEnd"/>
+      <w:r>
+        <w:rPr>
+          <w:lang w:val="en-US"/>
+        </w:rPr>
+        <w:t xml:space="preserve"> so from 15% to 67%</w:t>
+      </w:r>
+    </w:p>
+    <w:p>
+      <w:pPr>
+        <w:rPr>
+          <w:lang w:val="en-US"/>
+        </w:rPr>
+      </w:pPr>
+    </w:p>
+    <w:p>
+      <w:pPr>
+        <w:rPr>
+          <w:lang w:val="en-US"/>
+        </w:rPr>
+      </w:pPr>
+      <w:r>
+        <w:rPr>
+          <w:lang w:val="en-US"/>
+        </w:rPr>
+        <w:lastRenderedPageBreak/>
+        <w:t>Neu:</w:t>
+      </w:r>
+      <w:r>
+        <w:rPr>
+          <w:lang w:val="en-US"/>
+        </w:rPr>
+        <w:t xml:space="preserve"> There are some extreme values, but the data is fully captured by the priors. </w:t>
+      </w:r>
+    </w:p>
+    <w:p>
+      <w:pPr>
+        <w:rPr>
+          <w:lang w:val="en-US"/>
+        </w:rPr>
+      </w:pPr>
+      <w:r>
+        <w:rPr>
+          <w:noProof/>
+          <w:lang w:val="en-US"/>
+        </w:rPr>
+        <w:drawing>
+          <wp:inline distT="0" distB="0" distL="0" distR="0" wp14:anchorId="73831685" wp14:editId="3A8AE417">
+            <wp:extent cx="4984799" cy="3079893"/>
+            <wp:effectExtent l="0" t="0" r="6350" b="6350"/>
+            <wp:docPr id="1167028884" name="Grafik 10"/>
+            <wp:cNvGraphicFramePr>
+              <a:graphicFrameLocks xmlns:a="http://schemas.openxmlformats.org/drawingml/2006/main" noChangeAspect="1"/>
+            </wp:cNvGraphicFramePr>
+            <a:graphic xmlns:a="http://schemas.openxmlformats.org/drawingml/2006/main">
+              <a:graphicData uri="http://schemas.openxmlformats.org/drawingml/2006/picture">
+                <pic:pic xmlns:pic="http://schemas.openxmlformats.org/drawingml/2006/picture">
+                  <pic:nvPicPr>
+                    <pic:cNvPr id="0" name="Picture 9"/>
+                    <pic:cNvPicPr>
+                      <a:picLocks noChangeAspect="1" noChangeArrowheads="1"/>
+                    </pic:cNvPicPr>
+                  </pic:nvPicPr>
+                  <pic:blipFill>
+                    <a:blip r:embed="rId19" cstate="print">
+                      <a:extLst>
+                        <a:ext uri="{28A0092B-C50C-407E-A947-70E740481C1C}">
+                          <a14:useLocalDpi xmlns:a14="http://schemas.microsoft.com/office/drawing/2010/main" val="0"/>
+                        </a:ext>
+                      </a:extLst>
+                    </a:blip>
+                    <a:srcRect/>
+                    <a:stretch>
+                      <a:fillRect/>
+                    </a:stretch>
+                  </pic:blipFill>
+                  <pic:spPr bwMode="auto">
+                    <a:xfrm>
+                      <a:off x="0" y="0"/>
+                      <a:ext cx="5001862" cy="3090435"/>
+                    </a:xfrm>
+                    <a:prstGeom prst="rect">
+                      <a:avLst/>
+                    </a:prstGeom>
+                    <a:noFill/>
+                  </pic:spPr>
+                </pic:pic>
+              </a:graphicData>
+            </a:graphic>
+          </wp:inline>
+        </w:drawing>
+      </w:r>
+    </w:p>
+    <w:p>
+      <w:pPr>
+        <w:rPr>
+          <w:lang w:val="en-US"/>
+        </w:rPr>
+      </w:pPr>
+    </w:p>
+    <w:p>
+      <w:pPr>
+        <w:rPr>
+          <w:lang w:val="en-US"/>
+        </w:rPr>
+      </w:pPr>
+    </w:p>
+    <w:p>
+      <w:pPr>
+        <w:rPr>
+          <w:lang w:val="en-US"/>
         </w:rPr>
       </w:pPr>
     </w:p>
@@ -4127,7 +6457,7 @@
                     </pic:cNvPicPr>
                   </pic:nvPicPr>
                   <pic:blipFill>
-                    <a:blip r:embed="rId12">
+                    <a:blip r:embed="rId20">
                       <a:extLst>
                         <a:ext uri="{28A0092B-C50C-407E-A947-70E740481C1C}">
                           <a14:useLocalDpi xmlns:a14="http://schemas.microsoft.com/office/drawing/2010/main" val="0"/>
@@ -6369,7 +8699,7 @@
                 <wp:cNvGraphicFramePr/>
                 <a:graphic xmlns:a="http://schemas.openxmlformats.org/drawingml/2006/main">
                   <a:graphicData uri="http://schemas.microsoft.com/office/word/2010/wordprocessingInk">
-                    <w14:contentPart bwMode="auto" r:id="rId13">
+                    <w14:contentPart bwMode="auto" r:id="rId21">
                       <w14:nvContentPartPr>
                         <w14:cNvContentPartPr/>
                       </w14:nvContentPartPr>
@@ -6405,13 +8735,13 @@
                 <o:lock v:ext="edit" aspectratio="t"/>
               </v:shapetype>
               <v:shape id="Freihand 4" o:spid="_x0000_s1026" type="#_x0000_t75" style="position:absolute;margin-left:295.6pt;margin-top:378.15pt;width:23.45pt;height:22.75pt;z-index:251659264;visibility:visible;mso-wrap-style:square;mso-wrap-distance-left:9pt;mso-wrap-distance-top:0;mso-wrap-distance-right:9pt;mso-wrap-distance-bottom:0;mso-position-horizontal:absolute;mso-position-horizontal-relative:text;mso-position-vertical:absolute;mso-position-vertical-relative:text" o:gfxdata="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">
-                <v:imagedata r:id="rId14" o:title=""/>
+                <v:imagedata r:id="rId22" o:title=""/>
               </v:shape>
             </w:pict>
           </mc:Fallback>
         </mc:AlternateContent>
       </w:r>
-      <w:hyperlink r:id="rId15" w:anchor="Regular_season_table" w:history="1">
+      <w:hyperlink r:id="rId23" w:anchor="Regular_season_table" w:history="1">
         <w:r>
           <w:rPr>
             <w:rStyle w:val="Hyperlink"/>
@@ -6524,7 +8854,7 @@
                     </pic:cNvPicPr>
                   </pic:nvPicPr>
                   <pic:blipFill>
-                    <a:blip r:embed="rId16">
+                    <a:blip r:embed="rId24">
                       <a:extLst>
                         <a:ext uri="{28A0092B-C50C-407E-A947-70E740481C1C}">
                           <a14:useLocalDpi xmlns:a14="http://schemas.microsoft.com/office/drawing/2010/main" val="0"/>
@@ -6578,7 +8908,7 @@
                     </pic:cNvPicPr>
                   </pic:nvPicPr>
                   <pic:blipFill>
-                    <a:blip r:embed="rId17">
+                    <a:blip r:embed="rId25">
                       <a:extLst>
                         <a:ext uri="{28A0092B-C50C-407E-A947-70E740481C1C}">
                           <a14:useLocalDpi xmlns:a14="http://schemas.microsoft.com/office/drawing/2010/main" val="0"/>

</xml_diff>